<commit_message>
Correction coquille Cls_Bac Ieff
</commit_message>
<xml_diff>
--- a/Manuel Validation/ABCPMX - Manuel Validation.docx
+++ b/Manuel Validation/ABCPMX - Manuel Validation.docx
@@ -7403,6 +7403,12 @@
                 <w:lang w:val="en-US"/>
               </w:rPr>
             </w:pPr>
+            <w:r>
+              <w:rPr>
+                <w:lang w:val="en-US"/>
+              </w:rPr>
+              <w:t>98.8</w:t>
+            </w:r>
           </w:p>
         </w:tc>
         <w:tc>
@@ -7531,6 +7537,12 @@
                 <w:lang w:val="en-US"/>
               </w:rPr>
             </w:pPr>
+            <w:r>
+              <w:rPr>
+                <w:lang w:val="en-US"/>
+              </w:rPr>
+              <w:t>50.9</w:t>
+            </w:r>
           </w:p>
         </w:tc>
         <w:tc>
@@ -7561,9 +7573,31 @@
           <w:p>
             <w:pPr>
               <w:jc w:val="center"/>
-            </w:pPr>
-            <w:r>
-              <w:t>0.00%</w:t>
+              <w:rPr>
+                <w:i/>
+                <w:color w:val="C00000"/>
+              </w:rPr>
+            </w:pPr>
+            <w:r>
+              <w:rPr>
+                <w:i/>
+                <w:color w:val="C00000"/>
+              </w:rPr>
+              <w:t>0.</w:t>
+            </w:r>
+            <w:r>
+              <w:rPr>
+                <w:i/>
+                <w:color w:val="C00000"/>
+              </w:rPr>
+              <w:t>20</w:t>
+            </w:r>
+            <w:r>
+              <w:rPr>
+                <w:i/>
+                <w:color w:val="C00000"/>
+              </w:rPr>
+              <w:t>%</w:t>
             </w:r>
           </w:p>
         </w:tc>
@@ -7659,6 +7693,12 @@
                 <w:lang w:val="en-US"/>
               </w:rPr>
             </w:pPr>
+            <w:r>
+              <w:rPr>
+                <w:lang w:val="en-US"/>
+              </w:rPr>
+              <w:t>33 740</w:t>
+            </w:r>
           </w:p>
         </w:tc>
         <w:tc>
@@ -7689,9 +7729,31 @@
           <w:p>
             <w:pPr>
               <w:jc w:val="center"/>
-            </w:pPr>
-            <w:r>
-              <w:t>0.00%</w:t>
+              <w:rPr>
+                <w:i/>
+                <w:color w:val="C00000"/>
+              </w:rPr>
+            </w:pPr>
+            <w:r>
+              <w:rPr>
+                <w:i/>
+                <w:color w:val="C00000"/>
+              </w:rPr>
+              <w:t>0.0</w:t>
+            </w:r>
+            <w:r>
+              <w:rPr>
+                <w:i/>
+                <w:color w:val="C00000"/>
+              </w:rPr>
+              <w:t>1</w:t>
+            </w:r>
+            <w:r>
+              <w:rPr>
+                <w:i/>
+                <w:color w:val="C00000"/>
+              </w:rPr>
+              <w:t>%</w:t>
             </w:r>
           </w:p>
         </w:tc>
@@ -7787,6 +7849,12 @@
                 <w:lang w:val="en-US"/>
               </w:rPr>
             </w:pPr>
+            <w:r>
+              <w:rPr>
+                <w:lang w:val="en-US"/>
+              </w:rPr>
+              <w:t>1 676</w:t>
+            </w:r>
           </w:p>
         </w:tc>
         <w:tc>
@@ -7819,7 +7887,25 @@
               <w:jc w:val="center"/>
             </w:pPr>
             <w:r>
-              <w:t>0.00%</w:t>
+              <w:rPr>
+                <w:i/>
+                <w:color w:val="C00000"/>
+              </w:rPr>
+              <w:t>0.</w:t>
+            </w:r>
+            <w:r>
+              <w:rPr>
+                <w:i/>
+                <w:color w:val="C00000"/>
+              </w:rPr>
+              <w:t>24</w:t>
+            </w:r>
+            <w:r>
+              <w:rPr>
+                <w:i/>
+                <w:color w:val="C00000"/>
+              </w:rPr>
+              <w:t>%</w:t>
             </w:r>
           </w:p>
         </w:tc>
@@ -7908,6 +7994,9 @@
             <w:pPr>
               <w:jc w:val="center"/>
             </w:pPr>
+            <w:r>
+              <w:t>1 500</w:t>
+            </w:r>
           </w:p>
         </w:tc>
         <w:tc>
@@ -8036,6 +8125,12 @@
                 <w:lang w:val="en-US"/>
               </w:rPr>
             </w:pPr>
+            <w:r>
+              <w:rPr>
+                <w:lang w:val="en-US"/>
+              </w:rPr>
+              <w:t>176</w:t>
+            </w:r>
           </w:p>
         </w:tc>
         <w:tc>
@@ -8124,7 +8219,16 @@
                     <w:rPr>
                       <w:rFonts w:ascii="Cambria Math" w:hAnsi="Cambria Math"/>
                     </w:rPr>
-                    <m:t>el,y</m:t>
+                    <m:t>p</m:t>
+                  </m:r>
+                  <m:r>
+                    <m:rPr>
+                      <m:sty m:val="p"/>
+                    </m:rPr>
+                    <w:rPr>
+                      <w:rFonts w:ascii="Cambria Math" w:hAnsi="Cambria Math"/>
+                    </w:rPr>
+                    <m:t>l,y</m:t>
                   </m:r>
                 </m:sub>
               </m:sSub>
@@ -8155,6 +8259,9 @@
             <w:pPr>
               <w:jc w:val="center"/>
             </w:pPr>
+            <w:r>
+              <w:t>1 702</w:t>
+            </w:r>
           </w:p>
         </w:tc>
         <w:tc>
@@ -8240,7 +8347,16 @@
                     <w:rPr>
                       <w:rFonts w:ascii="Cambria Math" w:hAnsi="Cambria Math"/>
                     </w:rPr>
-                    <m:t>el,z</m:t>
+                    <m:t>p</m:t>
+                  </m:r>
+                  <m:r>
+                    <m:rPr>
+                      <m:sty m:val="p"/>
+                    </m:rPr>
+                    <w:rPr>
+                      <w:rFonts w:ascii="Cambria Math" w:hAnsi="Cambria Math"/>
+                    </w:rPr>
+                    <m:t>l,z</m:t>
                   </m:r>
                 </m:sub>
               </m:sSub>
@@ -8271,6 +8387,9 @@
             <w:pPr>
               <w:jc w:val="center"/>
             </w:pPr>
+            <w:r>
+              <w:t>276</w:t>
+            </w:r>
           </w:p>
         </w:tc>
         <w:tc>
@@ -8303,7 +8422,18 @@
               <w:jc w:val="center"/>
             </w:pPr>
             <w:r>
-              <w:t>0.00%</w:t>
+              <w:rPr>
+                <w:i/>
+                <w:color w:val="C00000"/>
+              </w:rPr>
+              <w:t>1.17</w:t>
+            </w:r>
+            <w:r>
+              <w:rPr>
+                <w:i/>
+                <w:color w:val="C00000"/>
+              </w:rPr>
+              <w:t>%</w:t>
             </w:r>
           </w:p>
         </w:tc>
@@ -8384,6 +8514,9 @@
             <w:pPr>
               <w:jc w:val="center"/>
             </w:pPr>
+            <w:r>
+              <w:t>66.66</w:t>
+            </w:r>
           </w:p>
         </w:tc>
         <w:tc>
@@ -8414,9 +8547,24 @@
           <w:p>
             <w:pPr>
               <w:jc w:val="center"/>
-            </w:pPr>
-            <w:r>
-              <w:t>0.00%</w:t>
+              <w:rPr>
+                <w:i/>
+                <w:color w:val="C00000"/>
+              </w:rPr>
+            </w:pPr>
+            <w:r>
+              <w:rPr>
+                <w:i/>
+                <w:color w:val="C00000"/>
+              </w:rPr>
+              <w:t>0.13</w:t>
+            </w:r>
+            <w:r>
+              <w:rPr>
+                <w:i/>
+                <w:color w:val="C00000"/>
+              </w:rPr>
+              <w:t>%</w:t>
             </w:r>
           </w:p>
         </w:tc>
@@ -8468,7 +8616,7 @@
                       <w:rFonts w:ascii="Cambria Math" w:hAnsi="Cambria Math"/>
                       <w:lang w:val="en-US"/>
                     </w:rPr>
-                    <m:t>t</m:t>
+                    <m:t>w</m:t>
                   </m:r>
                 </m:sub>
               </m:sSub>
@@ -8512,6 +8660,12 @@
                 <w:lang w:val="en-US"/>
               </w:rPr>
             </w:pPr>
+            <w:r>
+              <w:rPr>
+                <w:lang w:val="en-US"/>
+              </w:rPr>
+              <w:t>780 739</w:t>
+            </w:r>
           </w:p>
         </w:tc>
         <w:tc>
@@ -8544,7 +8698,18 @@
               <w:jc w:val="center"/>
             </w:pPr>
             <w:r>
-              <w:t>0.00%</w:t>
+              <w:rPr>
+                <w:i/>
+                <w:color w:val="C00000"/>
+              </w:rPr>
+              <w:t>1.30</w:t>
+            </w:r>
+            <w:r>
+              <w:rPr>
+                <w:i/>
+                <w:color w:val="C00000"/>
+              </w:rPr>
+              <w:t>%</w:t>
             </w:r>
           </w:p>
         </w:tc>
@@ -8627,6 +8792,12 @@
                 <w:lang w:val="en-US"/>
               </w:rPr>
             </w:pPr>
+            <w:r>
+              <w:rPr>
+                <w:lang w:val="en-US"/>
+              </w:rPr>
+              <w:t>77.6</w:t>
+            </w:r>
           </w:p>
         </w:tc>
         <w:tc>
@@ -8703,6 +8874,9 @@
             <w:pPr>
               <w:jc w:val="center"/>
             </w:pPr>
+            <w:r>
+              <w:t>1086</w:t>
+            </w:r>
           </w:p>
         </w:tc>
         <w:tc>
@@ -8796,6 +8970,9 @@
             <w:pPr>
               <w:jc w:val="center"/>
             </w:pPr>
+            <w:r>
+              <w:t>224 700</w:t>
+            </w:r>
           </w:p>
         </w:tc>
         <w:tc>
@@ -8828,7 +9005,18 @@
               <w:jc w:val="center"/>
             </w:pPr>
             <w:r>
-              <w:t>0.00%</w:t>
+              <w:rPr>
+                <w:i/>
+                <w:color w:val="C00000"/>
+              </w:rPr>
+              <w:t>0.01</w:t>
+            </w:r>
+            <w:r>
+              <w:rPr>
+                <w:i/>
+                <w:color w:val="C00000"/>
+              </w:rPr>
+              <w:t>%</w:t>
             </w:r>
           </w:p>
         </w:tc>
@@ -8900,6 +9088,12 @@
                 <w:lang w:val="en-US"/>
               </w:rPr>
             </w:pPr>
+            <w:r>
+              <w:rPr>
+                <w:lang w:val="en-US"/>
+              </w:rPr>
+              <w:t>198 100</w:t>
+            </w:r>
           </w:p>
         </w:tc>
         <w:tc>
@@ -8932,7 +9126,18 @@
               <w:jc w:val="center"/>
             </w:pPr>
             <w:r>
-              <w:t>0.00%</w:t>
+              <w:rPr>
+                <w:i/>
+                <w:color w:val="C00000"/>
+              </w:rPr>
+              <w:t>0.01</w:t>
+            </w:r>
+            <w:r>
+              <w:rPr>
+                <w:i/>
+                <w:color w:val="C00000"/>
+              </w:rPr>
+              <w:t>%</w:t>
             </w:r>
           </w:p>
         </w:tc>
@@ -8990,6 +9195,9 @@
             <w:pPr>
               <w:jc w:val="center"/>
             </w:pPr>
+            <w:r>
+              <w:t>162</w:t>
+            </w:r>
           </w:p>
         </w:tc>
         <w:tc>
@@ -9022,7 +9230,25 @@
               <w:jc w:val="center"/>
             </w:pPr>
             <w:r>
-              <w:t>0.00%</w:t>
+              <w:rPr>
+                <w:i/>
+                <w:color w:val="C00000"/>
+              </w:rPr>
+              <w:t>0.</w:t>
+            </w:r>
+            <w:r>
+              <w:rPr>
+                <w:i/>
+                <w:color w:val="C00000"/>
+              </w:rPr>
+              <w:t>25</w:t>
+            </w:r>
+            <w:r>
+              <w:rPr>
+                <w:i/>
+                <w:color w:val="C00000"/>
+              </w:rPr>
+              <w:t>%</w:t>
             </w:r>
           </w:p>
         </w:tc>
@@ -9094,6 +9320,12 @@
                 <w:lang w:val="en-US"/>
               </w:rPr>
             </w:pPr>
+            <w:r>
+              <w:rPr>
+                <w:lang w:val="en-US"/>
+              </w:rPr>
+              <w:t>143</w:t>
+            </w:r>
           </w:p>
         </w:tc>
         <w:tc>
@@ -9126,7 +9358,18 @@
               <w:jc w:val="center"/>
             </w:pPr>
             <w:r>
-              <w:t>0.00%</w:t>
+              <w:rPr>
+                <w:i/>
+                <w:color w:val="C00000"/>
+              </w:rPr>
+              <w:t>0.14</w:t>
+            </w:r>
+            <w:r>
+              <w:rPr>
+                <w:i/>
+                <w:color w:val="C00000"/>
+              </w:rPr>
+              <w:t>%</w:t>
             </w:r>
           </w:p>
         </w:tc>
@@ -9229,6 +9472,12 @@
                 <w:lang w:val="en-US"/>
               </w:rPr>
             </w:pPr>
+            <w:r>
+              <w:rPr>
+                <w:lang w:val="en-US"/>
+              </w:rPr>
+              <w:t>275</w:t>
+            </w:r>
           </w:p>
         </w:tc>
         <w:tc>
@@ -9321,6 +9570,9 @@
             <w:pPr>
               <w:jc w:val="center"/>
             </w:pPr>
+            <w:r>
+              <w:t>210 000</w:t>
+            </w:r>
           </w:p>
         </w:tc>
         <w:tc>
@@ -9414,6 +9666,9 @@
             <w:pPr>
               <w:jc w:val="center"/>
             </w:pPr>
+            <w:r>
+              <w:t>7 850</w:t>
+            </w:r>
           </w:p>
         </w:tc>
         <w:tc>
@@ -9529,6 +9784,9 @@
             <w:pPr>
               <w:jc w:val="center"/>
             </w:pPr>
+            <w:r>
+              <w:t>2 717</w:t>
+            </w:r>
           </w:p>
         </w:tc>
         <w:tc>
@@ -9561,7 +9819,25 @@
               <w:jc w:val="center"/>
             </w:pPr>
             <w:r>
-              <w:t>0.00%</w:t>
+              <w:rPr>
+                <w:i/>
+                <w:color w:val="C00000"/>
+              </w:rPr>
+              <w:t>0.</w:t>
+            </w:r>
+            <w:r>
+              <w:rPr>
+                <w:i/>
+                <w:color w:val="C00000"/>
+              </w:rPr>
+              <w:t>04</w:t>
+            </w:r>
+            <w:r>
+              <w:rPr>
+                <w:i/>
+                <w:color w:val="C00000"/>
+              </w:rPr>
+              <w:t>%</w:t>
             </w:r>
           </w:p>
         </w:tc>
@@ -9651,6 +9927,12 @@
                 <w:lang w:val="en-US"/>
               </w:rPr>
             </w:pPr>
+            <w:r>
+              <w:rPr>
+                <w:lang w:val="en-US"/>
+              </w:rPr>
+              <w:t>807</w:t>
+            </w:r>
           </w:p>
         </w:tc>
         <w:tc>
@@ -9772,6 +10054,12 @@
                 <w:lang w:val="en-US"/>
               </w:rPr>
             </w:pPr>
+            <w:r>
+              <w:rPr>
+                <w:lang w:val="en-US"/>
+              </w:rPr>
+              <w:t>468</w:t>
+            </w:r>
           </w:p>
         </w:tc>
         <w:tc>
@@ -9893,6 +10181,12 @@
                 <w:lang w:val="en-US"/>
               </w:rPr>
             </w:pPr>
+            <w:r>
+              <w:rPr>
+                <w:lang w:val="en-US"/>
+              </w:rPr>
+              <w:t>412.5</w:t>
+            </w:r>
           </w:p>
         </w:tc>
         <w:tc>
@@ -9923,9 +10217,31 @@
           <w:p>
             <w:pPr>
               <w:jc w:val="center"/>
-            </w:pPr>
-            <w:r>
-              <w:t>0.00%</w:t>
+              <w:rPr>
+                <w:i/>
+                <w:color w:val="C00000"/>
+              </w:rPr>
+            </w:pPr>
+            <w:r>
+              <w:rPr>
+                <w:i/>
+                <w:color w:val="C00000"/>
+              </w:rPr>
+              <w:t>0.</w:t>
+            </w:r>
+            <w:r>
+              <w:rPr>
+                <w:i/>
+                <w:color w:val="C00000"/>
+              </w:rPr>
+              <w:t>12</w:t>
+            </w:r>
+            <w:r>
+              <w:rPr>
+                <w:i/>
+                <w:color w:val="C00000"/>
+              </w:rPr>
+              <w:t>%</w:t>
             </w:r>
           </w:p>
         </w:tc>
@@ -9965,6 +10281,9 @@
             <w:pPr>
               <w:jc w:val="center"/>
             </w:pPr>
+            <w:r>
+              <w:t>1</w:t>
+            </w:r>
           </w:p>
         </w:tc>
         <w:tc>
@@ -10029,6 +10348,9 @@
             <w:pPr>
               <w:jc w:val="center"/>
             </w:pPr>
+            <w:r>
+              <w:t>4</w:t>
+            </w:r>
           </w:p>
         </w:tc>
         <w:tc>
@@ -10181,6 +10503,12 @@
                 <w:lang w:val="en-US"/>
               </w:rPr>
             </w:pPr>
+            <w:r>
+              <w:rPr>
+                <w:lang w:val="en-US"/>
+              </w:rPr>
+              <w:t>40.3</w:t>
+            </w:r>
           </w:p>
         </w:tc>
         <w:tc>
@@ -10201,6 +10529,13 @@
                 <w:color w:val="C00000"/>
               </w:rPr>
               <w:t>40</w:t>
+            </w:r>
+            <w:r>
+              <w:rPr>
+                <w:i/>
+                <w:color w:val="C00000"/>
+              </w:rPr>
+              <w:t>.3</w:t>
             </w:r>
           </w:p>
         </w:tc>
@@ -10291,6 +10626,12 @@
                 <w:lang w:val="en-US"/>
               </w:rPr>
             </w:pPr>
+            <w:r>
+              <w:rPr>
+                <w:lang w:val="en-US"/>
+              </w:rPr>
+              <w:t>55.5</w:t>
+            </w:r>
           </w:p>
         </w:tc>
         <w:tc>
@@ -10310,7 +10651,7 @@
                 <w:i/>
                 <w:color w:val="C00000"/>
               </w:rPr>
-              <w:t>55</w:t>
+              <w:t>55.5</w:t>
             </w:r>
           </w:p>
         </w:tc>
@@ -10369,6 +10710,12 @@
                 <w:lang w:val="en-US"/>
               </w:rPr>
             </w:pPr>
+            <w:r>
+              <w:rPr>
+                <w:lang w:val="en-US"/>
+              </w:rPr>
+              <w:t>No</w:t>
+            </w:r>
           </w:p>
         </w:tc>
         <w:tc>
@@ -10593,6 +10940,9 @@
             <w:pPr>
               <w:jc w:val="center"/>
             </w:pPr>
+            <w:r>
+              <w:t>124</w:t>
+            </w:r>
           </w:p>
         </w:tc>
         <w:tc>
@@ -10625,7 +10975,7 @@
               <w:jc w:val="center"/>
             </w:pPr>
             <w:r>
-              <w:t>Ok</w:t>
+              <w:t>0.00%</w:t>
             </w:r>
           </w:p>
         </w:tc>
@@ -10723,6 +11073,12 @@
                 <w:lang w:val="en-US"/>
               </w:rPr>
             </w:pPr>
+            <w:r>
+              <w:rPr>
+                <w:lang w:val="en-US"/>
+              </w:rPr>
+              <w:t>25</w:t>
+            </w:r>
           </w:p>
         </w:tc>
         <w:tc>
@@ -10754,6 +11110,9 @@
             <w:pPr>
               <w:jc w:val="center"/>
             </w:pPr>
+            <w:r>
+              <w:t>0.00%</w:t>
+            </w:r>
           </w:p>
         </w:tc>
       </w:tr>
@@ -10850,6 +11209,12 @@
                 <w:lang w:val="en-US"/>
               </w:rPr>
             </w:pPr>
+            <w:r>
+              <w:rPr>
+                <w:lang w:val="en-US"/>
+              </w:rPr>
+              <w:t>33</w:t>
+            </w:r>
           </w:p>
         </w:tc>
         <w:tc>
@@ -10881,6 +11246,9 @@
             <w:pPr>
               <w:jc w:val="center"/>
             </w:pPr>
+            <w:r>
+              <w:t>0.00%</w:t>
+            </w:r>
           </w:p>
         </w:tc>
       </w:tr>
@@ -10977,6 +11345,12 @@
                 <w:lang w:val="en-US"/>
               </w:rPr>
             </w:pPr>
+            <w:r>
+              <w:rPr>
+                <w:lang w:val="en-US"/>
+              </w:rPr>
+              <w:t>2.56</w:t>
+            </w:r>
           </w:p>
         </w:tc>
         <w:tc>
@@ -11008,6 +11382,9 @@
             <w:pPr>
               <w:jc w:val="center"/>
             </w:pPr>
+            <w:r>
+              <w:t>0.00%</w:t>
+            </w:r>
           </w:p>
         </w:tc>
       </w:tr>
@@ -11090,6 +11467,12 @@
                 <w:lang w:val="en-US"/>
               </w:rPr>
             </w:pPr>
+            <w:r>
+              <w:rPr>
+                <w:lang w:val="en-US"/>
+              </w:rPr>
+              <w:t>31 476</w:t>
+            </w:r>
           </w:p>
         </w:tc>
         <w:tc>
@@ -11121,245 +11504,9 @@
             <w:pPr>
               <w:jc w:val="center"/>
             </w:pPr>
-          </w:p>
-        </w:tc>
-      </w:tr>
-      <w:tr>
-        <w:tc>
-          <w:tcPr>
-            <w:tcW w:w="6637" w:type="dxa"/>
-            <w:vAlign w:val="center"/>
-          </w:tcPr>
-          <w:p>
-            <w:pPr>
-              <w:tabs>
-                <w:tab w:val="right" w:pos="4997"/>
-              </w:tabs>
-              <w:jc w:val="left"/>
-            </w:pPr>
-            <w:r>
-              <w:t>Surface mass</w:t>
-            </w:r>
-            <w:r>
-              <w:t xml:space="preserve"> : </w:t>
-            </w:r>
-            <m:oMath>
-              <m:sSub>
-                <m:sSubPr>
-                  <m:ctrlPr>
-                    <w:rPr>
-                      <w:rFonts w:ascii="Cambria Math" w:hAnsi="Cambria Math"/>
-                      <w:i/>
-                    </w:rPr>
-                  </m:ctrlPr>
-                </m:sSubPr>
-                <m:e>
-                  <m:r>
-                    <w:rPr>
-                      <w:rFonts w:ascii="Cambria Math" w:hAnsi="Cambria Math"/>
-                    </w:rPr>
-                    <m:t>μ</m:t>
-                  </m:r>
-                </m:e>
-                <m:sub>
-                  <m:r>
-                    <m:rPr>
-                      <m:nor/>
-                    </m:rPr>
-                    <w:rPr>
-                      <w:rFonts w:ascii="Cambria Math" w:hAnsi="Cambria Math"/>
-                    </w:rPr>
-                    <m:t>p</m:t>
-                  </m:r>
-                </m:sub>
-              </m:sSub>
-              <m:r>
-                <w:rPr>
-                  <w:rFonts w:ascii="Cambria Math" w:hAnsi="Cambria Math"/>
-                </w:rPr>
-                <m:t>=</m:t>
-              </m:r>
-            </m:oMath>
-            <w:r>
-              <w:tab/>
-              <w:t>(</w:t>
-            </w:r>
-            <w:r>
-              <w:t>kg/m²</w:t>
-            </w:r>
-            <w:r>
-              <w:t>)</w:t>
-            </w:r>
-          </w:p>
-        </w:tc>
-        <w:tc>
-          <w:tcPr>
-            <w:tcW w:w="1397" w:type="dxa"/>
-          </w:tcPr>
-          <w:p>
-            <w:pPr>
-              <w:jc w:val="center"/>
-            </w:pPr>
-          </w:p>
-        </w:tc>
-        <w:tc>
-          <w:tcPr>
-            <w:tcW w:w="1384" w:type="dxa"/>
-          </w:tcPr>
-          <w:p>
-            <w:pPr>
-              <w:jc w:val="center"/>
-              <w:rPr>
-                <w:i/>
-                <w:color w:val="C00000"/>
-              </w:rPr>
-            </w:pPr>
-            <w:r>
-              <w:rPr>
-                <w:i/>
-                <w:color w:val="C00000"/>
-              </w:rPr>
-              <w:t>9</w:t>
-            </w:r>
-          </w:p>
-        </w:tc>
-        <w:tc>
-          <w:tcPr>
-            <w:tcW w:w="776" w:type="dxa"/>
-          </w:tcPr>
-          <w:p>
-            <w:pPr>
-              <w:jc w:val="center"/>
-            </w:pPr>
-          </w:p>
-        </w:tc>
-      </w:tr>
-      <w:tr>
-        <w:tc>
-          <w:tcPr>
-            <w:tcW w:w="6637" w:type="dxa"/>
-            <w:vAlign w:val="center"/>
-          </w:tcPr>
-          <w:p>
-            <w:pPr>
-              <w:tabs>
-                <w:tab w:val="right" w:pos="4997"/>
-              </w:tabs>
-              <w:jc w:val="left"/>
-              <w:rPr>
-                <w:lang w:val="en-US"/>
-              </w:rPr>
-            </w:pPr>
-            <w:r>
-              <w:rPr>
-                <w:lang w:val="en-US"/>
-              </w:rPr>
-              <w:t xml:space="preserve">Yield </w:t>
-            </w:r>
-            <w:proofErr w:type="spellStart"/>
-            <w:r>
-              <w:rPr>
-                <w:lang w:val="en-US"/>
-              </w:rPr>
-              <w:t>strenght</w:t>
-            </w:r>
-            <w:proofErr w:type="spellEnd"/>
-            <w:r>
-              <w:rPr>
-                <w:lang w:val="en-US"/>
-              </w:rPr>
-              <w:t xml:space="preserve"> : </w:t>
-            </w:r>
-            <m:oMath>
-              <m:sSub>
-                <m:sSubPr>
-                  <m:ctrlPr>
-                    <w:rPr>
-                      <w:rFonts w:ascii="Cambria Math" w:hAnsi="Cambria Math"/>
-                      <w:i/>
-                    </w:rPr>
-                  </m:ctrlPr>
-                </m:sSubPr>
-                <m:e>
-                  <m:r>
-                    <w:rPr>
-                      <w:rFonts w:ascii="Cambria Math" w:hAnsi="Cambria Math"/>
-                    </w:rPr>
-                    <m:t>f</m:t>
-                  </m:r>
-                </m:e>
-                <m:sub>
-                  <m:r>
-                    <m:rPr>
-                      <m:nor/>
-                    </m:rPr>
-                    <w:rPr>
-                      <w:rFonts w:ascii="Cambria Math" w:hAnsi="Cambria Math"/>
-                      <w:lang w:val="en-US"/>
-                    </w:rPr>
-                    <m:t>p</m:t>
-                  </m:r>
-                </m:sub>
-              </m:sSub>
-              <m:r>
-                <w:rPr>
-                  <w:rFonts w:ascii="Cambria Math" w:hAnsi="Cambria Math"/>
-                  <w:lang w:val="en-US"/>
-                </w:rPr>
-                <m:t>=</m:t>
-              </m:r>
-            </m:oMath>
-            <w:r>
-              <w:rPr>
-                <w:lang w:val="en-US"/>
-              </w:rPr>
-              <w:tab/>
-              <w:t>(MPa)</w:t>
-            </w:r>
-          </w:p>
-        </w:tc>
-        <w:tc>
-          <w:tcPr>
-            <w:tcW w:w="1397" w:type="dxa"/>
-          </w:tcPr>
-          <w:p>
-            <w:pPr>
-              <w:jc w:val="center"/>
-              <w:rPr>
-                <w:lang w:val="en-US"/>
-              </w:rPr>
-            </w:pPr>
-          </w:p>
-        </w:tc>
-        <w:tc>
-          <w:tcPr>
-            <w:tcW w:w="1384" w:type="dxa"/>
-          </w:tcPr>
-          <w:p>
-            <w:pPr>
-              <w:jc w:val="center"/>
-              <w:rPr>
-                <w:i/>
-                <w:color w:val="C00000"/>
-              </w:rPr>
-            </w:pPr>
-            <w:r>
-              <w:rPr>
-                <w:i/>
-                <w:color w:val="C00000"/>
-              </w:rPr>
-              <w:t>350</w:t>
-            </w:r>
-          </w:p>
-        </w:tc>
-        <w:tc>
-          <w:tcPr>
-            <w:tcW w:w="776" w:type="dxa"/>
-          </w:tcPr>
-          <w:p>
-            <w:pPr>
-              <w:jc w:val="center"/>
-            </w:pPr>
+            <w:r>
+              <w:t>0.00%</w:t>
+            </w:r>
           </w:p>
         </w:tc>
       </w:tr>
@@ -11476,8 +11623,10 @@
                 <w:i/>
                 <w:color w:val="C00000"/>
               </w:rPr>
-              <w:t>60 080</w:t>
-            </w:r>
+              <w:t>44 370</w:t>
+            </w:r>
+            <w:bookmarkStart w:id="26" w:name="_GoBack"/>
+            <w:bookmarkEnd w:id="26"/>
           </w:p>
         </w:tc>
         <w:tc>
@@ -11511,13 +11660,7 @@
               <w:rPr>
                 <w:lang w:val="en-US"/>
               </w:rPr>
-              <w:t>Shear resistance</w:t>
-            </w:r>
-            <w:r>
-              <w:rPr>
-                <w:lang w:val="en-US"/>
-              </w:rPr>
-              <w:t xml:space="preserve"> : </w:t>
+              <w:t xml:space="preserve">Shear resistance : </w:t>
             </w:r>
             <m:oMath>
               <m:sSub>
@@ -13239,7 +13382,6 @@
               <w:rPr>
                 <w:lang w:val="en-US"/>
               </w:rPr>
-              <w:lastRenderedPageBreak/>
               <w:t xml:space="preserve">Elastic neutral axis </w:t>
             </w:r>
             <w:r>
@@ -13584,6 +13726,7 @@
               <w:rPr>
                 <w:lang w:val="en-US"/>
               </w:rPr>
+              <w:lastRenderedPageBreak/>
               <w:t xml:space="preserve">Elastic neutral axis </w:t>
             </w:r>
             <w:r>
@@ -17174,7 +17317,6 @@
               <w:rPr>
                 <w:smallCaps/>
               </w:rPr>
-              <w:lastRenderedPageBreak/>
               <w:t>Résultats</w:t>
             </w:r>
           </w:p>
@@ -17378,6 +17520,7 @@
               <w:rPr>
                 <w:lang w:val="en-US"/>
               </w:rPr>
+              <w:lastRenderedPageBreak/>
               <w:t>Resistance to shear force</w:t>
             </w:r>
             <w:r>
@@ -18603,8 +18746,6 @@
       <w:pPr>
         <w:pStyle w:val="Lgende"/>
       </w:pPr>
-      <w:bookmarkStart w:id="26" w:name="_GoBack"/>
-      <w:bookmarkEnd w:id="26"/>
       <w:r>
         <w:t xml:space="preserve">Table </w:t>
       </w:r>
@@ -21165,7 +21306,7 @@
               <w:szCs w:val="20"/>
               <w:lang w:val="en-GB"/>
             </w:rPr>
-            <w:t>13</w:t>
+            <w:t>14</w:t>
           </w:r>
           <w:r>
             <w:rPr>
@@ -32597,7 +32738,7 @@
 </file>
 
 <file path=customXml/itemProps4.xml><?xml version="1.0" encoding="utf-8"?>
-<ds:datastoreItem xmlns:ds="http://schemas.openxmlformats.org/officeDocument/2006/customXml" ds:itemID="{3FA7C11B-85C5-411A-AF28-1A75E10348EA}">
+<ds:datastoreItem xmlns:ds="http://schemas.openxmlformats.org/officeDocument/2006/customXml" ds:itemID="{30EA2C08-63DE-4A81-A701-7CB68DCC6A58}">
   <ds:schemaRefs>
     <ds:schemaRef ds:uri="http://schemas.openxmlformats.org/officeDocument/2006/bibliography"/>
   </ds:schemaRefs>

</xml_diff>

<commit_message>
Fin cas test 2018 + cas test 2023
</commit_message>
<xml_diff>
--- a/Manuel Validation/ABCPMX - Manuel Validation.docx
+++ b/Manuel Validation/ABCPMX - Manuel Validation.docx
@@ -4045,6 +4045,8 @@
         </w:rPr>
       </w:pPr>
       <w:bookmarkStart w:id="20" w:name="_Toc158042648"/>
+      <w:bookmarkStart w:id="21" w:name="_GoBack"/>
+      <w:bookmarkEnd w:id="21"/>
       <w:r>
         <w:rPr>
           <w:lang w:val="en-US"/>
@@ -4140,11 +4142,11 @@
       <w:pPr>
         <w:pStyle w:val="Titre3"/>
       </w:pPr>
-      <w:bookmarkStart w:id="21" w:name="_Toc158042649"/>
+      <w:bookmarkStart w:id="22" w:name="_Toc158042649"/>
       <w:r>
         <w:t>Input data</w:t>
       </w:r>
-      <w:bookmarkEnd w:id="21"/>
+      <w:bookmarkEnd w:id="22"/>
     </w:p>
     <w:p>
       <w:pPr>
@@ -4205,8 +4207,8 @@
           <w:szCs w:val="18"/>
         </w:rPr>
       </w:pPr>
-      <w:bookmarkStart w:id="22" w:name="_Ref128564380"/>
-      <w:bookmarkStart w:id="23" w:name="_Ref128564336"/>
+      <w:bookmarkStart w:id="23" w:name="_Ref128564380"/>
+      <w:bookmarkStart w:id="24" w:name="_Ref128564336"/>
       <w:r>
         <w:rPr>
           <w:i/>
@@ -4262,7 +4264,7 @@
         </w:rPr>
         <w:fldChar w:fldCharType="end"/>
       </w:r>
-      <w:bookmarkEnd w:id="22"/>
+      <w:bookmarkEnd w:id="23"/>
       <w:r>
         <w:rPr>
           <w:i/>
@@ -4272,7 +4274,7 @@
         </w:rPr>
         <w:t> </w:t>
       </w:r>
-      <w:bookmarkStart w:id="24" w:name="_Ref128564360"/>
+      <w:bookmarkStart w:id="25" w:name="_Ref128564360"/>
       <w:r>
         <w:rPr>
           <w:i/>
@@ -4282,8 +4284,8 @@
         </w:rPr>
         <w:t xml:space="preserve">: </w:t>
       </w:r>
-      <w:bookmarkEnd w:id="23"/>
       <w:bookmarkEnd w:id="24"/>
+      <w:bookmarkEnd w:id="25"/>
       <w:r>
         <w:rPr>
           <w:i/>
@@ -7258,12 +7260,12 @@
       <w:pPr>
         <w:pStyle w:val="Titre3"/>
       </w:pPr>
-      <w:bookmarkStart w:id="25" w:name="_Toc158042650"/>
+      <w:bookmarkStart w:id="26" w:name="_Toc158042650"/>
       <w:proofErr w:type="spellStart"/>
       <w:r>
         <w:t>Results</w:t>
       </w:r>
-      <w:bookmarkEnd w:id="25"/>
+      <w:bookmarkEnd w:id="26"/>
       <w:proofErr w:type="spellEnd"/>
     </w:p>
     <w:tbl>
@@ -8219,16 +8221,7 @@
                     <w:rPr>
                       <w:rFonts w:ascii="Cambria Math" w:hAnsi="Cambria Math"/>
                     </w:rPr>
-                    <m:t>p</m:t>
-                  </m:r>
-                  <m:r>
-                    <m:rPr>
-                      <m:sty m:val="p"/>
-                    </m:rPr>
-                    <w:rPr>
-                      <w:rFonts w:ascii="Cambria Math" w:hAnsi="Cambria Math"/>
-                    </w:rPr>
-                    <m:t>l,y</m:t>
+                    <m:t>pl,y</m:t>
                   </m:r>
                 </m:sub>
               </m:sSub>
@@ -8347,16 +8340,7 @@
                     <w:rPr>
                       <w:rFonts w:ascii="Cambria Math" w:hAnsi="Cambria Math"/>
                     </w:rPr>
-                    <m:t>p</m:t>
-                  </m:r>
-                  <m:r>
-                    <m:rPr>
-                      <m:sty m:val="p"/>
-                    </m:rPr>
-                    <w:rPr>
-                      <w:rFonts w:ascii="Cambria Math" w:hAnsi="Cambria Math"/>
-                    </w:rPr>
-                    <m:t>l,z</m:t>
+                    <m:t>pl,z</m:t>
                   </m:r>
                 </m:sub>
               </m:sSub>
@@ -9234,14 +9218,7 @@
                 <w:i/>
                 <w:color w:val="C00000"/>
               </w:rPr>
-              <w:t>0.</w:t>
-            </w:r>
-            <w:r>
-              <w:rPr>
-                <w:i/>
-                <w:color w:val="C00000"/>
-              </w:rPr>
-              <w:t>25</w:t>
+              <w:t>0.25</w:t>
             </w:r>
             <w:r>
               <w:rPr>
@@ -9555,7 +9532,15 @@
             </w:r>
             <w:r>
               <w:tab/>
-              <w:t xml:space="preserve">(MPa) </w:t>
+              <w:t>(</w:t>
+            </w:r>
+            <w:proofErr w:type="spellStart"/>
+            <w:r>
+              <w:t>MPa</w:t>
+            </w:r>
+            <w:proofErr w:type="spellEnd"/>
+            <w:r>
+              <w:t xml:space="preserve">) </w:t>
             </w:r>
             <w:r>
               <w:tab/>
@@ -9823,14 +9808,7 @@
                 <w:i/>
                 <w:color w:val="C00000"/>
               </w:rPr>
-              <w:t>0.</w:t>
-            </w:r>
-            <w:r>
-              <w:rPr>
-                <w:i/>
-                <w:color w:val="C00000"/>
-              </w:rPr>
-              <w:t>04</w:t>
+              <w:t>0.04</w:t>
             </w:r>
             <w:r>
               <w:rPr>
@@ -11576,7 +11554,13 @@
                 <w:lang w:val="en-US"/>
               </w:rPr>
               <w:tab/>
-              <w:t>(mm</w:t>
+              <w:t>(c</w:t>
+            </w:r>
+            <w:r>
+              <w:rPr>
+                <w:lang w:val="en-US"/>
+              </w:rPr>
+              <w:t>m</w:t>
             </w:r>
             <w:r>
               <w:rPr>
@@ -11604,6 +11588,12 @@
                 <w:lang w:val="en-US"/>
               </w:rPr>
             </w:pPr>
+            <w:r>
+              <w:rPr>
+                <w:lang w:val="en-US"/>
+              </w:rPr>
+              <w:t>44.37</w:t>
+            </w:r>
           </w:p>
         </w:tc>
         <w:tc>
@@ -11623,10 +11613,8 @@
                 <w:i/>
                 <w:color w:val="C00000"/>
               </w:rPr>
-              <w:t>44 370</w:t>
-            </w:r>
-            <w:bookmarkStart w:id="26" w:name="_GoBack"/>
-            <w:bookmarkEnd w:id="26"/>
+              <w:t>44.37</w:t>
+            </w:r>
           </w:p>
         </w:tc>
         <w:tc>
@@ -11637,6 +11625,9 @@
             <w:pPr>
               <w:jc w:val="center"/>
             </w:pPr>
+            <w:r>
+              <w:t>0.00%</w:t>
+            </w:r>
           </w:p>
         </w:tc>
       </w:tr>
@@ -11735,6 +11726,12 @@
                 <w:lang w:val="en-US"/>
               </w:rPr>
             </w:pPr>
+            <w:r>
+              <w:rPr>
+                <w:lang w:val="en-US"/>
+              </w:rPr>
+              <w:t>52.9</w:t>
+            </w:r>
           </w:p>
         </w:tc>
         <w:tc>
@@ -11754,7 +11751,7 @@
                 <w:i/>
                 <w:color w:val="C00000"/>
               </w:rPr>
-              <w:t>53</w:t>
+              <w:t>52.9</w:t>
             </w:r>
           </w:p>
         </w:tc>
@@ -11766,6 +11763,9 @@
             <w:pPr>
               <w:jc w:val="center"/>
             </w:pPr>
+            <w:r>
+              <w:t>0.00%</w:t>
+            </w:r>
           </w:p>
         </w:tc>
       </w:tr>
@@ -11834,6 +11834,9 @@
             <w:pPr>
               <w:jc w:val="center"/>
             </w:pPr>
+            <w:r>
+              <w:t>0.71</w:t>
+            </w:r>
           </w:p>
         </w:tc>
         <w:tc>
@@ -11865,6 +11868,9 @@
             <w:pPr>
               <w:jc w:val="center"/>
             </w:pPr>
+            <w:r>
+              <w:t>0.00%</w:t>
+            </w:r>
           </w:p>
         </w:tc>
       </w:tr>
@@ -11901,14 +11907,14 @@
     <w:tbl>
       <w:tblPr>
         <w:tblStyle w:val="Grilledutableau"/>
-        <w:tblW w:w="0" w:type="auto"/>
+        <w:tblW w:w="10155" w:type="dxa"/>
         <w:tblLook w:val="04A0" w:firstRow="1" w:lastRow="0" w:firstColumn="1" w:lastColumn="0" w:noHBand="0" w:noVBand="1"/>
       </w:tblPr>
       <w:tblGrid>
-        <w:gridCol w:w="6637"/>
-        <w:gridCol w:w="1397"/>
-        <w:gridCol w:w="1384"/>
-        <w:gridCol w:w="776"/>
+        <w:gridCol w:w="6605"/>
+        <w:gridCol w:w="1395"/>
+        <w:gridCol w:w="1381"/>
+        <w:gridCol w:w="774"/>
       </w:tblGrid>
       <w:tr>
         <w:tc>
@@ -11955,7 +11961,7 @@
         </w:tc>
         <w:tc>
           <w:tcPr>
-            <w:tcW w:w="776" w:type="dxa"/>
+            <w:tcW w:w="737" w:type="dxa"/>
             <w:shd w:val="clear" w:color="auto" w:fill="D9D9D9" w:themeFill="background1" w:themeFillShade="D9"/>
           </w:tcPr>
           <w:p>
@@ -12049,6 +12055,12 @@
                 <w:lang w:val="en-US"/>
               </w:rPr>
             </w:pPr>
+            <w:r>
+              <w:rPr>
+                <w:lang w:val="en-US"/>
+              </w:rPr>
+              <w:t>3,0</w:t>
+            </w:r>
           </w:p>
         </w:tc>
         <w:tc>
@@ -12059,28 +12071,28 @@
             <w:pPr>
               <w:jc w:val="center"/>
               <w:rPr>
-                <w:i/>
                 <w:color w:val="C00000"/>
               </w:rPr>
             </w:pPr>
             <w:r>
               <w:rPr>
-                <w:i/>
                 <w:color w:val="C00000"/>
               </w:rPr>
-              <w:t>3.0</w:t>
-            </w:r>
-          </w:p>
-        </w:tc>
-        <w:tc>
-          <w:tcPr>
-            <w:tcW w:w="776" w:type="dxa"/>
-            <w:vAlign w:val="center"/>
+              <w:t>3,0</w:t>
+            </w:r>
+          </w:p>
+        </w:tc>
+        <w:tc>
+          <w:tcPr>
+            <w:tcW w:w="737" w:type="dxa"/>
           </w:tcPr>
           <w:p>
             <w:pPr>
               <w:jc w:val="center"/>
             </w:pPr>
+            <w:r>
+              <w:t>0.00%</w:t>
+            </w:r>
           </w:p>
         </w:tc>
       </w:tr>
@@ -12164,6 +12176,16 @@
             <w:pPr>
               <w:jc w:val="center"/>
             </w:pPr>
+            <m:oMathPara>
+              <m:oMath>
+                <m:r>
+                  <w:rPr>
+                    <w:rFonts w:ascii="Cambria Math" w:hAnsi="Cambria Math"/>
+                  </w:rPr>
+                  <m:t>∞</m:t>
+                </m:r>
+              </m:oMath>
+            </m:oMathPara>
           </w:p>
         </w:tc>
         <w:tc>
@@ -12178,24 +12200,30 @@
                 <w:color w:val="C00000"/>
               </w:rPr>
             </w:pPr>
-            <w:r>
-              <w:rPr>
-                <w:i/>
-                <w:color w:val="C00000"/>
-              </w:rPr>
-              <w:t>0</w:t>
-            </w:r>
-          </w:p>
-        </w:tc>
-        <w:tc>
-          <w:tcPr>
-            <w:tcW w:w="776" w:type="dxa"/>
-            <w:vAlign w:val="center"/>
+            <m:oMathPara>
+              <m:oMath>
+                <m:r>
+                  <w:rPr>
+                    <w:rFonts w:ascii="Cambria Math" w:hAnsi="Cambria Math"/>
+                    <w:color w:val="C00000"/>
+                  </w:rPr>
+                  <m:t>∞</m:t>
+                </m:r>
+              </m:oMath>
+            </m:oMathPara>
+          </w:p>
+        </w:tc>
+        <w:tc>
+          <w:tcPr>
+            <w:tcW w:w="737" w:type="dxa"/>
           </w:tcPr>
           <w:p>
             <w:pPr>
               <w:jc w:val="center"/>
             </w:pPr>
+            <w:r>
+              <w:t>0.00%</w:t>
+            </w:r>
           </w:p>
         </w:tc>
       </w:tr>
@@ -12279,6 +12307,9 @@
             <w:pPr>
               <w:jc w:val="center"/>
             </w:pPr>
+            <w:r>
+              <w:t>27.5</w:t>
+            </w:r>
           </w:p>
         </w:tc>
         <w:tc>
@@ -12304,13 +12335,15 @@
         </w:tc>
         <w:tc>
           <w:tcPr>
-            <w:tcW w:w="776" w:type="dxa"/>
-            <w:vAlign w:val="center"/>
+            <w:tcW w:w="737" w:type="dxa"/>
           </w:tcPr>
           <w:p>
             <w:pPr>
               <w:jc w:val="center"/>
             </w:pPr>
+            <w:r>
+              <w:t>0.00%</w:t>
+            </w:r>
           </w:p>
         </w:tc>
       </w:tr>
@@ -12394,6 +12427,9 @@
             <w:pPr>
               <w:jc w:val="center"/>
             </w:pPr>
+            <w:r>
+              <w:t>6.67</w:t>
+            </w:r>
           </w:p>
         </w:tc>
         <w:tc>
@@ -12419,13 +12455,15 @@
         </w:tc>
         <w:tc>
           <w:tcPr>
-            <w:tcW w:w="776" w:type="dxa"/>
-            <w:vAlign w:val="center"/>
+            <w:tcW w:w="737" w:type="dxa"/>
           </w:tcPr>
           <w:p>
             <w:pPr>
               <w:jc w:val="center"/>
             </w:pPr>
+            <w:r>
+              <w:t>0.00%</w:t>
+            </w:r>
           </w:p>
         </w:tc>
       </w:tr>
@@ -12509,6 +12547,9 @@
             <w:pPr>
               <w:jc w:val="center"/>
             </w:pPr>
+            <w:r>
+              <w:t>6.67</w:t>
+            </w:r>
           </w:p>
         </w:tc>
         <w:tc>
@@ -12534,13 +12575,15 @@
         </w:tc>
         <w:tc>
           <w:tcPr>
-            <w:tcW w:w="776" w:type="dxa"/>
-            <w:vAlign w:val="center"/>
+            <w:tcW w:w="737" w:type="dxa"/>
           </w:tcPr>
           <w:p>
             <w:pPr>
               <w:jc w:val="center"/>
             </w:pPr>
+            <w:r>
+              <w:t>0.00%</w:t>
+            </w:r>
           </w:p>
         </w:tc>
       </w:tr>
@@ -12613,6 +12656,9 @@
             <w:pPr>
               <w:jc w:val="center"/>
             </w:pPr>
+            <w:r>
+              <w:t>26.1</w:t>
+            </w:r>
           </w:p>
         </w:tc>
         <w:tc>
@@ -12638,13 +12684,15 @@
         </w:tc>
         <w:tc>
           <w:tcPr>
-            <w:tcW w:w="776" w:type="dxa"/>
-            <w:vAlign w:val="center"/>
+            <w:tcW w:w="737" w:type="dxa"/>
           </w:tcPr>
           <w:p>
             <w:pPr>
               <w:jc w:val="center"/>
             </w:pPr>
+            <w:r>
+              <w:t>0.00%</w:t>
+            </w:r>
           </w:p>
         </w:tc>
       </w:tr>
@@ -12725,21 +12773,7 @@
                   <w:rFonts w:ascii="Cambria Math" w:hAnsi="Cambria Math"/>
                   <w:lang w:val="en-US"/>
                 </w:rPr>
-                <m:t>=</m:t>
-              </m:r>
-              <m:r>
-                <w:rPr>
-                  <w:rFonts w:ascii="Cambria Math" w:hAnsi="Cambria Math"/>
-                  <w:lang w:val="en-US"/>
-                </w:rPr>
-                <m:t>6.67</m:t>
-              </m:r>
-              <m:r>
-                <w:rPr>
-                  <w:rFonts w:ascii="Cambria Math" w:hAnsi="Cambria Math"/>
-                  <w:lang w:val="en-US"/>
-                </w:rPr>
-                <m:t>)</m:t>
+                <m:t>=6.67)</m:t>
               </m:r>
             </m:oMath>
             <w:r>
@@ -12792,6 +12826,24 @@
                 <w:lang w:val="en-US"/>
               </w:rPr>
             </w:pPr>
+            <w:r>
+              <w:rPr>
+                <w:lang w:val="en-US"/>
+              </w:rPr>
+              <w:t>106</w:t>
+            </w:r>
+            <w:r>
+              <w:rPr>
+                <w:lang w:val="en-US"/>
+              </w:rPr>
+              <w:t xml:space="preserve"> </w:t>
+            </w:r>
+            <w:r>
+              <w:rPr>
+                <w:lang w:val="en-US"/>
+              </w:rPr>
+              <w:t>570</w:t>
+            </w:r>
           </w:p>
         </w:tc>
         <w:tc>
@@ -12811,19 +12863,48 @@
                 <w:i/>
                 <w:color w:val="C00000"/>
               </w:rPr>
-              <w:t>106 571</w:t>
-            </w:r>
-          </w:p>
-        </w:tc>
-        <w:tc>
-          <w:tcPr>
-            <w:tcW w:w="776" w:type="dxa"/>
+              <w:t>106</w:t>
+            </w:r>
+            <w:r>
+              <w:rPr>
+                <w:i/>
+                <w:color w:val="C00000"/>
+              </w:rPr>
+              <w:t xml:space="preserve"> </w:t>
+            </w:r>
+            <w:r>
+              <w:rPr>
+                <w:i/>
+                <w:color w:val="C00000"/>
+              </w:rPr>
+              <w:t>571</w:t>
+            </w:r>
+          </w:p>
+        </w:tc>
+        <w:tc>
+          <w:tcPr>
+            <w:tcW w:w="737" w:type="dxa"/>
             <w:vAlign w:val="center"/>
           </w:tcPr>
           <w:p>
             <w:pPr>
               <w:jc w:val="center"/>
             </w:pPr>
+            <w:r>
+              <w:fldChar w:fldCharType="begin"/>
+            </w:r>
+            <w:r>
+              <w:instrText xml:space="preserve"> =ABS(LC(-1)) </w:instrText>
+            </w:r>
+            <w:r>
+              <w:fldChar w:fldCharType="separate"/>
+            </w:r>
+            <w:r>
+              <w:fldChar w:fldCharType="end"/>
+            </w:r>
+            <w:r>
+              <w:t>0.00%</w:t>
+            </w:r>
           </w:p>
         </w:tc>
       </w:tr>
@@ -12908,14 +12989,7 @@
                       <w:rFonts w:ascii="Cambria Math" w:hAnsi="Cambria Math"/>
                       <w:lang w:val="en-US"/>
                     </w:rPr>
-                    <m:t>=</m:t>
-                  </m:r>
-                  <m:r>
-                    <w:rPr>
-                      <w:rFonts w:ascii="Cambria Math" w:hAnsi="Cambria Math"/>
-                      <w:lang w:val="en-US"/>
-                    </w:rPr>
-                    <m:t>26.1</m:t>
+                    <m:t>=26.1</m:t>
                   </m:r>
                 </m:e>
               </m:d>
@@ -12970,6 +13044,12 @@
                 <w:lang w:val="en-US"/>
               </w:rPr>
             </w:pPr>
+            <w:r>
+              <w:rPr>
+                <w:lang w:val="en-US"/>
+              </w:rPr>
+              <w:t>74 820</w:t>
+            </w:r>
           </w:p>
         </w:tc>
         <w:tc>
@@ -12995,13 +13075,16 @@
         </w:tc>
         <w:tc>
           <w:tcPr>
-            <w:tcW w:w="776" w:type="dxa"/>
+            <w:tcW w:w="737" w:type="dxa"/>
             <w:vAlign w:val="center"/>
           </w:tcPr>
           <w:p>
             <w:pPr>
               <w:jc w:val="center"/>
             </w:pPr>
+            <w:r>
+              <w:t>0.00%</w:t>
+            </w:r>
           </w:p>
         </w:tc>
       </w:tr>
@@ -13086,14 +13169,7 @@
                       <w:rFonts w:ascii="Cambria Math" w:hAnsi="Cambria Math"/>
                       <w:lang w:val="en-US"/>
                     </w:rPr>
-                    <m:t>=</m:t>
-                  </m:r>
-                  <m:r>
-                    <w:rPr>
-                      <w:rFonts w:ascii="Cambria Math" w:hAnsi="Cambria Math"/>
-                      <w:lang w:val="en-US"/>
-                    </w:rPr>
-                    <m:t>27.5</m:t>
+                    <m:t>=27.5</m:t>
                   </m:r>
                 </m:e>
               </m:d>
@@ -13148,6 +13224,12 @@
                 <w:lang w:val="en-US"/>
               </w:rPr>
             </w:pPr>
+            <w:r>
+              <w:rPr>
+                <w:lang w:val="en-US"/>
+              </w:rPr>
+              <w:t>73 533</w:t>
+            </w:r>
           </w:p>
         </w:tc>
         <w:tc>
@@ -13173,13 +13255,16 @@
         </w:tc>
         <w:tc>
           <w:tcPr>
-            <w:tcW w:w="776" w:type="dxa"/>
+            <w:tcW w:w="737" w:type="dxa"/>
             <w:vAlign w:val="center"/>
           </w:tcPr>
           <w:p>
             <w:pPr>
               <w:jc w:val="center"/>
             </w:pPr>
+            <w:r>
+              <w:t>0.00%</w:t>
+            </w:r>
           </w:p>
         </w:tc>
       </w:tr>
@@ -13260,21 +13345,7 @@
                   <w:rFonts w:ascii="Cambria Math" w:hAnsi="Cambria Math"/>
                   <w:lang w:val="en-US"/>
                 </w:rPr>
-                <m:t>=</m:t>
-              </m:r>
-              <m:r>
-                <w:rPr>
-                  <w:rFonts w:ascii="Cambria Math" w:hAnsi="Cambria Math"/>
-                  <w:lang w:val="en-US"/>
-                </w:rPr>
-                <m:t>∞</m:t>
-              </m:r>
-              <m:r>
-                <w:rPr>
-                  <w:rFonts w:ascii="Cambria Math" w:hAnsi="Cambria Math"/>
-                  <w:lang w:val="en-US"/>
-                </w:rPr>
-                <m:t>)</m:t>
+                <m:t>=∞)</m:t>
               </m:r>
             </m:oMath>
             <w:r>
@@ -13327,6 +13398,12 @@
                 <w:lang w:val="en-US"/>
               </w:rPr>
             </w:pPr>
+            <w:r>
+              <w:rPr>
+                <w:lang w:val="en-US"/>
+              </w:rPr>
+              <w:t>33 742</w:t>
+            </w:r>
           </w:p>
         </w:tc>
         <w:tc>
@@ -13352,13 +13429,16 @@
         </w:tc>
         <w:tc>
           <w:tcPr>
-            <w:tcW w:w="776" w:type="dxa"/>
+            <w:tcW w:w="737" w:type="dxa"/>
             <w:vAlign w:val="center"/>
           </w:tcPr>
           <w:p>
             <w:pPr>
               <w:jc w:val="center"/>
             </w:pPr>
+            <w:r>
+              <w:t>0.00%</w:t>
+            </w:r>
           </w:p>
         </w:tc>
       </w:tr>
@@ -13445,21 +13525,7 @@
                   <w:rFonts w:ascii="Cambria Math" w:hAnsi="Cambria Math"/>
                   <w:lang w:val="en-US"/>
                 </w:rPr>
-                <m:t>=</m:t>
-              </m:r>
-              <m:r>
-                <w:rPr>
-                  <w:rFonts w:ascii="Cambria Math" w:hAnsi="Cambria Math"/>
-                  <w:lang w:val="en-US"/>
-                </w:rPr>
-                <m:t>6.67</m:t>
-              </m:r>
-              <m:r>
-                <w:rPr>
-                  <w:rFonts w:ascii="Cambria Math" w:hAnsi="Cambria Math"/>
-                  <w:lang w:val="en-US"/>
-                </w:rPr>
-                <m:t>)</m:t>
+                <m:t>=6.67)</m:t>
               </m:r>
             </m:oMath>
             <w:r>
@@ -13499,6 +13565,12 @@
                 <w:lang w:val="en-US"/>
               </w:rPr>
             </w:pPr>
+            <w:r>
+              <w:rPr>
+                <w:lang w:val="en-US"/>
+              </w:rPr>
+              <w:t>6.83</w:t>
+            </w:r>
           </w:p>
         </w:tc>
         <w:tc>
@@ -13524,13 +13596,24 @@
         </w:tc>
         <w:tc>
           <w:tcPr>
-            <w:tcW w:w="776" w:type="dxa"/>
+            <w:tcW w:w="737" w:type="dxa"/>
             <w:vAlign w:val="center"/>
           </w:tcPr>
           <w:p>
             <w:pPr>
               <w:jc w:val="center"/>
-            </w:pPr>
+              <w:rPr>
+                <w:i/>
+                <w:color w:val="C00000"/>
+              </w:rPr>
+            </w:pPr>
+            <w:r>
+              <w:rPr>
+                <w:i/>
+                <w:color w:val="C00000"/>
+              </w:rPr>
+              <w:t>0.15%</w:t>
+            </w:r>
           </w:p>
         </w:tc>
       </w:tr>
@@ -13617,21 +13700,7 @@
                   <w:rFonts w:ascii="Cambria Math" w:hAnsi="Cambria Math"/>
                   <w:lang w:val="en-US"/>
                 </w:rPr>
-                <m:t>=</m:t>
-              </m:r>
-              <m:r>
-                <w:rPr>
-                  <w:rFonts w:ascii="Cambria Math" w:hAnsi="Cambria Math"/>
-                  <w:lang w:val="en-US"/>
-                </w:rPr>
-                <m:t>26.1</m:t>
-              </m:r>
-              <m:r>
-                <w:rPr>
-                  <w:rFonts w:ascii="Cambria Math" w:hAnsi="Cambria Math"/>
-                  <w:lang w:val="en-US"/>
-                </w:rPr>
-                <m:t>)</m:t>
+                <m:t>=26.1)</m:t>
               </m:r>
             </m:oMath>
             <w:r>
@@ -13671,6 +13740,12 @@
                 <w:lang w:val="en-US"/>
               </w:rPr>
             </w:pPr>
+            <w:r>
+              <w:rPr>
+                <w:lang w:val="en-US"/>
+              </w:rPr>
+              <w:t>-93.4</w:t>
+            </w:r>
           </w:p>
         </w:tc>
         <w:tc>
@@ -13696,13 +13771,16 @@
         </w:tc>
         <w:tc>
           <w:tcPr>
-            <w:tcW w:w="776" w:type="dxa"/>
+            <w:tcW w:w="737" w:type="dxa"/>
             <w:vAlign w:val="center"/>
           </w:tcPr>
           <w:p>
             <w:pPr>
               <w:jc w:val="center"/>
             </w:pPr>
+            <w:r>
+              <w:t>0.00%</w:t>
+            </w:r>
           </w:p>
         </w:tc>
       </w:tr>
@@ -13790,21 +13868,7 @@
                   <w:rFonts w:ascii="Cambria Math" w:hAnsi="Cambria Math"/>
                   <w:lang w:val="en-US"/>
                 </w:rPr>
-                <m:t>=</m:t>
-              </m:r>
-              <m:r>
-                <w:rPr>
-                  <w:rFonts w:ascii="Cambria Math" w:hAnsi="Cambria Math"/>
-                  <w:lang w:val="en-US"/>
-                </w:rPr>
-                <m:t>27.5</m:t>
-              </m:r>
-              <m:r>
-                <w:rPr>
-                  <w:rFonts w:ascii="Cambria Math" w:hAnsi="Cambria Math"/>
-                  <w:lang w:val="en-US"/>
-                </w:rPr>
-                <m:t>)</m:t>
+                <m:t>=27.5)</m:t>
               </m:r>
             </m:oMath>
             <w:r>
@@ -13844,6 +13908,12 @@
                 <w:lang w:val="en-US"/>
               </w:rPr>
             </w:pPr>
+            <w:r>
+              <w:rPr>
+                <w:lang w:val="en-US"/>
+              </w:rPr>
+              <w:t>-97.5</w:t>
+            </w:r>
           </w:p>
         </w:tc>
         <w:tc>
@@ -13869,13 +13939,16 @@
         </w:tc>
         <w:tc>
           <w:tcPr>
-            <w:tcW w:w="776" w:type="dxa"/>
+            <w:tcW w:w="737" w:type="dxa"/>
             <w:vAlign w:val="center"/>
           </w:tcPr>
           <w:p>
             <w:pPr>
               <w:jc w:val="center"/>
             </w:pPr>
+            <w:r>
+              <w:t>0.00%</w:t>
+            </w:r>
           </w:p>
         </w:tc>
       </w:tr>
@@ -13962,21 +14035,7 @@
                   <w:rFonts w:ascii="Cambria Math" w:hAnsi="Cambria Math"/>
                   <w:lang w:val="en-US"/>
                 </w:rPr>
-                <m:t>=</m:t>
-              </m:r>
-              <m:r>
-                <w:rPr>
-                  <w:rFonts w:ascii="Cambria Math" w:hAnsi="Cambria Math"/>
-                  <w:lang w:val="en-US"/>
-                </w:rPr>
-                <m:t>∞</m:t>
-              </m:r>
-              <m:r>
-                <w:rPr>
-                  <w:rFonts w:ascii="Cambria Math" w:hAnsi="Cambria Math"/>
-                  <w:lang w:val="en-US"/>
-                </w:rPr>
-                <m:t>)</m:t>
+                <m:t>=∞)</m:t>
               </m:r>
             </m:oMath>
             <w:r>
@@ -14016,6 +14075,12 @@
                 <w:lang w:val="en-US"/>
               </w:rPr>
             </w:pPr>
+            <w:r>
+              <w:rPr>
+                <w:lang w:val="en-US"/>
+              </w:rPr>
+              <w:t>-225</w:t>
+            </w:r>
           </w:p>
         </w:tc>
         <w:tc>
@@ -14041,13 +14106,16 @@
         </w:tc>
         <w:tc>
           <w:tcPr>
-            <w:tcW w:w="776" w:type="dxa"/>
+            <w:tcW w:w="737" w:type="dxa"/>
             <w:vAlign w:val="center"/>
           </w:tcPr>
           <w:p>
             <w:pPr>
               <w:jc w:val="center"/>
             </w:pPr>
+            <w:r>
+              <w:t>0.00%</w:t>
+            </w:r>
           </w:p>
         </w:tc>
       </w:tr>
@@ -14156,6 +14224,12 @@
                 <w:lang w:val="en-US"/>
               </w:rPr>
             </w:pPr>
+            <w:r>
+              <w:rPr>
+                <w:lang w:val="en-US"/>
+              </w:rPr>
+              <w:t>846</w:t>
+            </w:r>
           </w:p>
         </w:tc>
         <w:tc>
@@ -14183,7 +14257,7 @@
         </w:tc>
         <w:tc>
           <w:tcPr>
-            <w:tcW w:w="776" w:type="dxa"/>
+            <w:tcW w:w="737" w:type="dxa"/>
             <w:vAlign w:val="center"/>
           </w:tcPr>
           <w:p>
@@ -14193,6 +14267,12 @@
                 <w:lang w:val="en-US"/>
               </w:rPr>
             </w:pPr>
+            <w:r>
+              <w:rPr>
+                <w:lang w:val="en-US"/>
+              </w:rPr>
+              <w:t>0.00%</w:t>
+            </w:r>
           </w:p>
         </w:tc>
       </w:tr>
@@ -14380,14 +14460,7 @@
                   <w:rFonts w:ascii="Cambria Math" w:hAnsi="Cambria Math"/>
                   <w:lang w:val="en-US"/>
                 </w:rPr>
-                <m:t>)</m:t>
-              </m:r>
-              <m:r>
-                <w:rPr>
-                  <w:rFonts w:ascii="Cambria Math" w:hAnsi="Cambria Math"/>
-                  <w:lang w:val="en-US"/>
-                </w:rPr>
-                <m:t>=</m:t>
+                <m:t>)=</m:t>
               </m:r>
             </m:oMath>
             <w:r>
@@ -14424,6 +14497,12 @@
                 <w:lang w:val="en-US"/>
               </w:rPr>
             </w:pPr>
+            <w:r>
+              <w:rPr>
+                <w:lang w:val="en-US"/>
+              </w:rPr>
+              <w:t>50.8</w:t>
+            </w:r>
           </w:p>
         </w:tc>
         <w:tc>
@@ -14450,12 +14529,17 @@
         <w:tc>
           <w:tcPr>
             <w:tcW w:w="776" w:type="dxa"/>
-            <w:vAlign w:val="center"/>
           </w:tcPr>
           <w:p>
             <w:pPr>
               <w:jc w:val="center"/>
             </w:pPr>
+            <w:r>
+              <w:rPr>
+                <w:lang w:val="en-US"/>
+              </w:rPr>
+              <w:t>0.00%</w:t>
+            </w:r>
           </w:p>
         </w:tc>
       </w:tr>
@@ -14533,14 +14617,7 @@
                   <w:rFonts w:ascii="Cambria Math" w:hAnsi="Cambria Math"/>
                   <w:lang w:val="en-US"/>
                 </w:rPr>
-                <m:t>)</m:t>
-              </m:r>
-              <m:r>
-                <w:rPr>
-                  <w:rFonts w:ascii="Cambria Math" w:hAnsi="Cambria Math"/>
-                  <w:lang w:val="en-US"/>
-                </w:rPr>
-                <m:t>=</m:t>
+                <m:t>)=</m:t>
               </m:r>
             </m:oMath>
             <w:r>
@@ -14577,6 +14654,12 @@
                 <w:lang w:val="en-US"/>
               </w:rPr>
             </w:pPr>
+            <w:r>
+              <w:rPr>
+                <w:lang w:val="en-US"/>
+              </w:rPr>
+              <w:t>178</w:t>
+            </w:r>
           </w:p>
         </w:tc>
         <w:tc>
@@ -14603,12 +14686,17 @@
         <w:tc>
           <w:tcPr>
             <w:tcW w:w="776" w:type="dxa"/>
-            <w:vAlign w:val="center"/>
           </w:tcPr>
           <w:p>
             <w:pPr>
               <w:jc w:val="center"/>
             </w:pPr>
+            <w:r>
+              <w:rPr>
+                <w:lang w:val="en-US"/>
+              </w:rPr>
+              <w:t>0.00%</w:t>
+            </w:r>
           </w:p>
         </w:tc>
       </w:tr>
@@ -14686,14 +14774,7 @@
                   <w:rFonts w:ascii="Cambria Math" w:hAnsi="Cambria Math"/>
                   <w:lang w:val="en-US"/>
                 </w:rPr>
-                <m:t>)</m:t>
-              </m:r>
-              <m:r>
-                <w:rPr>
-                  <w:rFonts w:ascii="Cambria Math" w:hAnsi="Cambria Math"/>
-                  <w:lang w:val="en-US"/>
-                </w:rPr>
-                <m:t>=</m:t>
+                <m:t>)=</m:t>
               </m:r>
             </m:oMath>
             <w:r>
@@ -14730,6 +14811,12 @@
                 <w:lang w:val="en-US"/>
               </w:rPr>
             </w:pPr>
+            <w:r>
+              <w:rPr>
+                <w:lang w:val="en-US"/>
+              </w:rPr>
+              <w:t>29.4</w:t>
+            </w:r>
           </w:p>
         </w:tc>
         <w:tc>
@@ -14756,12 +14843,17 @@
         <w:tc>
           <w:tcPr>
             <w:tcW w:w="776" w:type="dxa"/>
-            <w:vAlign w:val="center"/>
           </w:tcPr>
           <w:p>
             <w:pPr>
               <w:jc w:val="center"/>
             </w:pPr>
+            <w:r>
+              <w:rPr>
+                <w:lang w:val="en-US"/>
+              </w:rPr>
+              <w:t>0.00%</w:t>
+            </w:r>
           </w:p>
         </w:tc>
       </w:tr>
@@ -14839,14 +14931,7 @@
                   <w:rFonts w:ascii="Cambria Math" w:hAnsi="Cambria Math"/>
                   <w:lang w:val="en-US"/>
                 </w:rPr>
-                <m:t>)</m:t>
-              </m:r>
-              <m:r>
-                <w:rPr>
-                  <w:rFonts w:ascii="Cambria Math" w:hAnsi="Cambria Math"/>
-                  <w:lang w:val="en-US"/>
-                </w:rPr>
-                <m:t>=</m:t>
+                <m:t>)=</m:t>
               </m:r>
             </m:oMath>
             <w:r>
@@ -14883,6 +14968,12 @@
                 <w:lang w:val="en-US"/>
               </w:rPr>
             </w:pPr>
+            <w:r>
+              <w:rPr>
+                <w:lang w:val="en-US"/>
+              </w:rPr>
+              <w:t>103</w:t>
+            </w:r>
           </w:p>
         </w:tc>
         <w:tc>
@@ -14909,12 +15000,17 @@
         <w:tc>
           <w:tcPr>
             <w:tcW w:w="776" w:type="dxa"/>
-            <w:vAlign w:val="center"/>
           </w:tcPr>
           <w:p>
             <w:pPr>
               <w:jc w:val="center"/>
             </w:pPr>
+            <w:r>
+              <w:rPr>
+                <w:lang w:val="en-US"/>
+              </w:rPr>
+              <w:t>0.00%</w:t>
+            </w:r>
           </w:p>
         </w:tc>
       </w:tr>
@@ -14992,14 +15088,7 @@
                   <w:rFonts w:ascii="Cambria Math" w:hAnsi="Cambria Math"/>
                   <w:lang w:val="en-US"/>
                 </w:rPr>
-                <m:t>)</m:t>
-              </m:r>
-              <m:r>
-                <w:rPr>
-                  <w:rFonts w:ascii="Cambria Math" w:hAnsi="Cambria Math"/>
-                  <w:lang w:val="en-US"/>
-                </w:rPr>
-                <m:t>=</m:t>
+                <m:t>)=</m:t>
               </m:r>
             </m:oMath>
             <w:r>
@@ -15036,6 +15125,12 @@
                 <w:lang w:val="en-US"/>
               </w:rPr>
             </w:pPr>
+            <w:r>
+              <w:rPr>
+                <w:lang w:val="en-US"/>
+              </w:rPr>
+              <w:t>52.5</w:t>
+            </w:r>
           </w:p>
         </w:tc>
         <w:tc>
@@ -15062,12 +15157,17 @@
         <w:tc>
           <w:tcPr>
             <w:tcW w:w="776" w:type="dxa"/>
-            <w:vAlign w:val="center"/>
           </w:tcPr>
           <w:p>
             <w:pPr>
               <w:jc w:val="center"/>
             </w:pPr>
+            <w:r>
+              <w:rPr>
+                <w:lang w:val="en-US"/>
+              </w:rPr>
+              <w:t>0.00%</w:t>
+            </w:r>
           </w:p>
         </w:tc>
       </w:tr>
@@ -15145,14 +15245,7 @@
                   <w:rFonts w:ascii="Cambria Math" w:hAnsi="Cambria Math"/>
                   <w:lang w:val="en-US"/>
                 </w:rPr>
-                <m:t>)</m:t>
-              </m:r>
-              <m:r>
-                <w:rPr>
-                  <w:rFonts w:ascii="Cambria Math" w:hAnsi="Cambria Math"/>
-                  <w:lang w:val="en-US"/>
-                </w:rPr>
-                <m:t>=</m:t>
+                <m:t>)=</m:t>
               </m:r>
             </m:oMath>
             <w:r>
@@ -15189,6 +15282,12 @@
                 <w:lang w:val="en-US"/>
               </w:rPr>
             </w:pPr>
+            <w:r>
+              <w:rPr>
+                <w:lang w:val="en-US"/>
+              </w:rPr>
+              <w:t>184</w:t>
+            </w:r>
           </w:p>
         </w:tc>
         <w:tc>
@@ -15215,12 +15314,17 @@
         <w:tc>
           <w:tcPr>
             <w:tcW w:w="776" w:type="dxa"/>
-            <w:vAlign w:val="center"/>
           </w:tcPr>
           <w:p>
             <w:pPr>
               <w:jc w:val="center"/>
             </w:pPr>
+            <w:r>
+              <w:rPr>
+                <w:lang w:val="en-US"/>
+              </w:rPr>
+              <w:t>0.00%</w:t>
+            </w:r>
           </w:p>
         </w:tc>
       </w:tr>
@@ -15298,14 +15402,7 @@
                   <w:rFonts w:ascii="Cambria Math" w:hAnsi="Cambria Math"/>
                   <w:lang w:val="en-US"/>
                 </w:rPr>
-                <m:t>)</m:t>
-              </m:r>
-              <m:r>
-                <w:rPr>
-                  <w:rFonts w:ascii="Cambria Math" w:hAnsi="Cambria Math"/>
-                  <w:lang w:val="en-US"/>
-                </w:rPr>
-                <m:t>=</m:t>
+                <m:t>)=</m:t>
               </m:r>
             </m:oMath>
             <w:r>
@@ -15342,6 +15439,12 @@
                 <w:lang w:val="en-US"/>
               </w:rPr>
             </w:pPr>
+            <w:r>
+              <w:rPr>
+                <w:lang w:val="en-US"/>
+              </w:rPr>
+              <w:t>15</w:t>
+            </w:r>
           </w:p>
         </w:tc>
         <w:tc>
@@ -15368,12 +15471,17 @@
         <w:tc>
           <w:tcPr>
             <w:tcW w:w="776" w:type="dxa"/>
-            <w:vAlign w:val="center"/>
           </w:tcPr>
           <w:p>
             <w:pPr>
               <w:jc w:val="center"/>
             </w:pPr>
+            <w:r>
+              <w:rPr>
+                <w:lang w:val="en-US"/>
+              </w:rPr>
+              <w:t>0.00%</w:t>
+            </w:r>
           </w:p>
         </w:tc>
       </w:tr>
@@ -15451,14 +15559,7 @@
                   <w:rFonts w:ascii="Cambria Math" w:hAnsi="Cambria Math"/>
                   <w:lang w:val="en-US"/>
                 </w:rPr>
-                <m:t>)</m:t>
-              </m:r>
-              <m:r>
-                <w:rPr>
-                  <w:rFonts w:ascii="Cambria Math" w:hAnsi="Cambria Math"/>
-                  <w:lang w:val="en-US"/>
-                </w:rPr>
-                <m:t>=</m:t>
+                <m:t>)=</m:t>
               </m:r>
             </m:oMath>
             <w:r>
@@ -15495,6 +15596,12 @@
                 <w:lang w:val="en-US"/>
               </w:rPr>
             </w:pPr>
+            <w:r>
+              <w:rPr>
+                <w:lang w:val="en-US"/>
+              </w:rPr>
+              <w:t>64.9</w:t>
+            </w:r>
           </w:p>
         </w:tc>
         <w:tc>
@@ -15527,274 +15634,12 @@
             <w:pPr>
               <w:jc w:val="center"/>
             </w:pPr>
-          </w:p>
-        </w:tc>
-      </w:tr>
-      <w:tr>
-        <w:tc>
-          <w:tcPr>
-            <w:tcW w:w="6637" w:type="dxa"/>
-            <w:vAlign w:val="center"/>
-          </w:tcPr>
-          <w:p>
-            <w:pPr>
-              <w:tabs>
-                <w:tab w:val="right" w:pos="4997"/>
-              </w:tabs>
-              <w:jc w:val="left"/>
-              <w:rPr>
-                <w:lang w:val="en-US"/>
-              </w:rPr>
-            </w:pPr>
-            <w:r>
-              <w:rPr>
-                <w:lang w:val="en-US"/>
-              </w:rPr>
-              <w:t>Shear force</w:t>
-            </w:r>
-            <w:r>
-              <w:rPr>
-                <w:lang w:val="en-US"/>
-              </w:rPr>
-              <w:t xml:space="preserve"> : </w:t>
-            </w:r>
-            <m:oMath>
-              <m:r>
-                <w:rPr>
-                  <w:rFonts w:ascii="Cambria Math" w:hAnsi="Cambria Math"/>
-                </w:rPr>
-                <m:t>V</m:t>
-              </m:r>
-              <m:d>
-                <m:dPr>
-                  <m:ctrlPr>
-                    <w:rPr>
-                      <w:rFonts w:ascii="Cambria Math" w:hAnsi="Cambria Math"/>
-                      <w:i/>
-                      <w:lang w:val="en-US"/>
-                    </w:rPr>
-                  </m:ctrlPr>
-                </m:dPr>
-                <m:e>
-                  <m:r>
-                    <w:rPr>
-                      <w:rFonts w:ascii="Cambria Math" w:hAnsi="Cambria Math"/>
-                    </w:rPr>
-                    <m:t>SHC</m:t>
-                  </m:r>
-                  <m:ctrlPr>
-                    <w:rPr>
-                      <w:rFonts w:ascii="Cambria Math" w:hAnsi="Cambria Math"/>
-                      <w:i/>
-                    </w:rPr>
-                  </m:ctrlPr>
-                </m:e>
-              </m:d>
-              <m:r>
-                <w:rPr>
-                  <w:rFonts w:ascii="Cambria Math" w:hAnsi="Cambria Math"/>
-                  <w:lang w:val="en-US"/>
-                </w:rPr>
-                <m:t>=</m:t>
-              </m:r>
-            </m:oMath>
-            <w:r>
-              <w:rPr>
-                <w:lang w:val="en-US"/>
-              </w:rPr>
-              <w:tab/>
-              <w:t>(</w:t>
-            </w:r>
-            <w:proofErr w:type="spellStart"/>
-            <w:r>
-              <w:rPr>
-                <w:lang w:val="en-US"/>
-              </w:rPr>
-              <w:t>kN</w:t>
-            </w:r>
-            <w:proofErr w:type="spellEnd"/>
-            <w:r>
-              <w:rPr>
-                <w:lang w:val="en-US"/>
-              </w:rPr>
-              <w:t>)</w:t>
-            </w:r>
-          </w:p>
-        </w:tc>
-        <w:tc>
-          <w:tcPr>
-            <w:tcW w:w="1397" w:type="dxa"/>
-          </w:tcPr>
-          <w:p>
-            <w:pPr>
-              <w:jc w:val="center"/>
-              <w:rPr>
-                <w:lang w:val="en-US"/>
-              </w:rPr>
-            </w:pPr>
-          </w:p>
-        </w:tc>
-        <w:tc>
-          <w:tcPr>
-            <w:tcW w:w="1384" w:type="dxa"/>
-          </w:tcPr>
-          <w:p>
-            <w:pPr>
-              <w:jc w:val="center"/>
-              <w:rPr>
-                <w:i/>
-                <w:color w:val="C00000"/>
-              </w:rPr>
-            </w:pPr>
-            <w:r>
-              <w:rPr>
-                <w:i/>
-                <w:color w:val="C00000"/>
-              </w:rPr>
-              <w:t>0</w:t>
-            </w:r>
-          </w:p>
-        </w:tc>
-        <w:tc>
-          <w:tcPr>
-            <w:tcW w:w="776" w:type="dxa"/>
-            <w:vAlign w:val="center"/>
-          </w:tcPr>
-          <w:p>
-            <w:pPr>
-              <w:jc w:val="center"/>
-            </w:pPr>
-          </w:p>
-        </w:tc>
-      </w:tr>
-      <w:tr>
-        <w:tc>
-          <w:tcPr>
-            <w:tcW w:w="6637" w:type="dxa"/>
-            <w:vAlign w:val="center"/>
-          </w:tcPr>
-          <w:p>
-            <w:pPr>
-              <w:tabs>
-                <w:tab w:val="right" w:pos="4997"/>
-              </w:tabs>
-              <w:jc w:val="left"/>
-              <w:rPr>
-                <w:lang w:val="en-US"/>
-              </w:rPr>
-            </w:pPr>
-            <w:r>
-              <w:rPr>
-                <w:lang w:val="en-US"/>
-              </w:rPr>
-              <w:t>Bending moment</w:t>
-            </w:r>
-            <w:r>
-              <w:rPr>
-                <w:lang w:val="en-US"/>
-              </w:rPr>
-              <w:t xml:space="preserve"> : </w:t>
-            </w:r>
-            <m:oMath>
-              <m:r>
-                <w:rPr>
-                  <w:rFonts w:ascii="Cambria Math" w:hAnsi="Cambria Math"/>
-                </w:rPr>
-                <m:t>M</m:t>
-              </m:r>
-              <m:d>
-                <m:dPr>
-                  <m:ctrlPr>
-                    <w:rPr>
-                      <w:rFonts w:ascii="Cambria Math" w:hAnsi="Cambria Math"/>
-                      <w:i/>
-                      <w:lang w:val="en-US"/>
-                    </w:rPr>
-                  </m:ctrlPr>
-                </m:dPr>
-                <m:e>
-                  <m:r>
-                    <w:rPr>
-                      <w:rFonts w:ascii="Cambria Math" w:hAnsi="Cambria Math"/>
-                    </w:rPr>
-                    <m:t>SHC</m:t>
-                  </m:r>
-                </m:e>
-              </m:d>
-              <m:r>
-                <w:rPr>
-                  <w:rFonts w:ascii="Cambria Math" w:hAnsi="Cambria Math"/>
-                  <w:lang w:val="en-US"/>
-                </w:rPr>
-                <m:t>=</m:t>
-              </m:r>
-            </m:oMath>
-            <w:r>
-              <w:rPr>
-                <w:lang w:val="en-US"/>
-              </w:rPr>
-              <w:tab/>
-              <w:t>(</w:t>
-            </w:r>
-            <w:proofErr w:type="spellStart"/>
-            <w:r>
-              <w:rPr>
-                <w:lang w:val="en-US"/>
-              </w:rPr>
-              <w:t>kN.m</w:t>
-            </w:r>
-            <w:proofErr w:type="spellEnd"/>
-            <w:r>
-              <w:rPr>
-                <w:lang w:val="en-US"/>
-              </w:rPr>
-              <w:t>)</w:t>
-            </w:r>
-          </w:p>
-        </w:tc>
-        <w:tc>
-          <w:tcPr>
-            <w:tcW w:w="1397" w:type="dxa"/>
-          </w:tcPr>
-          <w:p>
-            <w:pPr>
-              <w:jc w:val="center"/>
-              <w:rPr>
-                <w:lang w:val="en-US"/>
-              </w:rPr>
-            </w:pPr>
-          </w:p>
-        </w:tc>
-        <w:tc>
-          <w:tcPr>
-            <w:tcW w:w="1384" w:type="dxa"/>
-          </w:tcPr>
-          <w:p>
-            <w:pPr>
-              <w:jc w:val="center"/>
-              <w:rPr>
-                <w:i/>
-                <w:color w:val="C00000"/>
-              </w:rPr>
-            </w:pPr>
-            <w:r>
-              <w:rPr>
-                <w:i/>
-                <w:color w:val="C00000"/>
-              </w:rPr>
-              <w:t>88.8</w:t>
-            </w:r>
-          </w:p>
-        </w:tc>
-        <w:tc>
-          <w:tcPr>
-            <w:tcW w:w="776" w:type="dxa"/>
-            <w:vAlign w:val="center"/>
-          </w:tcPr>
-          <w:p>
-            <w:pPr>
-              <w:jc w:val="center"/>
-            </w:pPr>
+            <w:r>
+              <w:rPr>
+                <w:lang w:val="en-US"/>
+              </w:rPr>
+              <w:t>0.00%</w:t>
+            </w:r>
           </w:p>
         </w:tc>
       </w:tr>
@@ -15999,6 +15844,12 @@
                 <w:lang w:val="en-US"/>
               </w:rPr>
             </w:pPr>
+            <w:r>
+              <w:rPr>
+                <w:lang w:val="en-US"/>
+              </w:rPr>
+              <w:t>0.84</w:t>
+            </w:r>
           </w:p>
         </w:tc>
         <w:tc>
@@ -16031,6 +15882,12 @@
             <w:pPr>
               <w:jc w:val="center"/>
             </w:pPr>
+            <w:r>
+              <w:rPr>
+                <w:lang w:val="en-US"/>
+              </w:rPr>
+              <w:t>0.00%</w:t>
+            </w:r>
           </w:p>
         </w:tc>
       </w:tr>
@@ -16128,6 +15985,12 @@
                 <w:lang w:val="en-US"/>
               </w:rPr>
             </w:pPr>
+            <w:r>
+              <w:rPr>
+                <w:lang w:val="en-US"/>
+              </w:rPr>
+              <w:t>0.23</w:t>
+            </w:r>
           </w:p>
         </w:tc>
         <w:tc>
@@ -16160,6 +16023,12 @@
             <w:pPr>
               <w:jc w:val="center"/>
             </w:pPr>
+            <w:r>
+              <w:rPr>
+                <w:lang w:val="en-US"/>
+              </w:rPr>
+              <w:t>0.00%</w:t>
+            </w:r>
           </w:p>
         </w:tc>
       </w:tr>
@@ -16226,17 +16095,7 @@
                       <w:rFonts w:ascii="Cambria Math" w:hAnsi="Cambria Math"/>
                       <w:lang w:val="en-US"/>
                     </w:rPr>
-                    <m:t>M</m:t>
-                  </m:r>
-                  <m:r>
-                    <m:rPr>
-                      <m:sty m:val="p"/>
-                    </m:rPr>
-                    <w:rPr>
-                      <w:rFonts w:ascii="Cambria Math" w:hAnsi="Cambria Math"/>
-                      <w:lang w:val="en-US"/>
-                    </w:rPr>
-                    <m:t>V</m:t>
+                    <m:t>MV</m:t>
                   </m:r>
                 </m:sub>
               </m:sSub>
@@ -16267,6 +16126,12 @@
                 <w:lang w:val="en-US"/>
               </w:rPr>
             </w:pPr>
+            <w:r>
+              <w:rPr>
+                <w:lang w:val="en-US"/>
+              </w:rPr>
+              <w:t>0.84</w:t>
+            </w:r>
           </w:p>
         </w:tc>
         <w:tc>
@@ -16299,145 +16164,12 @@
             <w:pPr>
               <w:jc w:val="center"/>
             </w:pPr>
-          </w:p>
-        </w:tc>
-      </w:tr>
-      <w:tr>
-        <w:tc>
-          <w:tcPr>
-            <w:tcW w:w="6637" w:type="dxa"/>
-            <w:vAlign w:val="center"/>
-          </w:tcPr>
-          <w:p>
-            <w:pPr>
-              <w:tabs>
-                <w:tab w:val="right" w:pos="4997"/>
-              </w:tabs>
-              <w:jc w:val="left"/>
-              <w:rPr>
-                <w:lang w:val="en-US"/>
-              </w:rPr>
-            </w:pPr>
-            <w:r>
-              <w:rPr>
-                <w:lang w:val="en-US"/>
-              </w:rPr>
-              <w:t>Resistance to MV interaction</w:t>
-            </w:r>
-            <w:r>
-              <w:rPr>
-                <w:lang w:val="en-US"/>
-              </w:rPr>
-              <w:t xml:space="preserve"> : </w:t>
-            </w:r>
-            <m:oMath>
-              <m:sSub>
-                <m:sSubPr>
-                  <m:ctrlPr>
-                    <w:rPr>
-                      <w:rFonts w:ascii="Cambria Math" w:hAnsi="Cambria Math"/>
-                      <w:i/>
-                    </w:rPr>
-                  </m:ctrlPr>
-                </m:sSubPr>
-                <m:e>
-                  <m:r>
-                    <m:rPr>
-                      <m:sty m:val="p"/>
-                    </m:rPr>
-                    <w:rPr>
-                      <w:rFonts w:ascii="Cambria Math" w:hAnsi="Cambria Math"/>
-                    </w:rPr>
-                    <m:t>Γ</m:t>
-                  </m:r>
-                  <m:ctrlPr>
-                    <w:rPr>
-                      <w:rFonts w:ascii="Cambria Math" w:hAnsi="Cambria Math"/>
-                    </w:rPr>
-                  </m:ctrlPr>
-                </m:e>
-                <m:sub>
-                  <m:r>
-                    <m:rPr>
-                      <m:sty m:val="p"/>
-                    </m:rPr>
-                    <w:rPr>
-                      <w:rFonts w:ascii="Cambria Math" w:hAnsi="Cambria Math"/>
-                      <w:lang w:val="en-US"/>
-                    </w:rPr>
-                    <m:t>M</m:t>
-                  </m:r>
-                  <m:r>
-                    <m:rPr>
-                      <m:sty m:val="p"/>
-                    </m:rPr>
-                    <w:rPr>
-                      <w:rFonts w:ascii="Cambria Math" w:hAnsi="Cambria Math"/>
-                      <w:lang w:val="en-US"/>
-                    </w:rPr>
-                    <m:t>V</m:t>
-                  </m:r>
-                </m:sub>
-              </m:sSub>
-              <m:r>
-                <w:rPr>
-                  <w:rFonts w:ascii="Cambria Math" w:hAnsi="Cambria Math"/>
-                  <w:lang w:val="en-US"/>
-                </w:rPr>
-                <m:t>=</m:t>
-              </m:r>
-            </m:oMath>
-            <w:r>
-              <w:rPr>
-                <w:lang w:val="en-US"/>
-              </w:rPr>
-              <w:tab/>
-            </w:r>
-          </w:p>
-        </w:tc>
-        <w:tc>
-          <w:tcPr>
-            <w:tcW w:w="1397" w:type="dxa"/>
-          </w:tcPr>
-          <w:p>
-            <w:pPr>
-              <w:jc w:val="center"/>
-              <w:rPr>
-                <w:lang w:val="en-US"/>
-              </w:rPr>
-            </w:pPr>
-          </w:p>
-        </w:tc>
-        <w:tc>
-          <w:tcPr>
-            <w:tcW w:w="1384" w:type="dxa"/>
-          </w:tcPr>
-          <w:p>
-            <w:pPr>
-              <w:jc w:val="center"/>
-              <w:rPr>
-                <w:i/>
-                <w:color w:val="C00000"/>
-              </w:rPr>
-            </w:pPr>
-            <w:r>
-              <w:rPr>
-                <w:i/>
-                <w:color w:val="C00000"/>
-              </w:rPr>
-              <w:t>0.84</w:t>
-            </w:r>
-          </w:p>
-        </w:tc>
-        <w:tc>
-          <w:tcPr>
-            <w:tcW w:w="776" w:type="dxa"/>
-            <w:vAlign w:val="center"/>
-          </w:tcPr>
-          <w:p>
-            <w:pPr>
-              <w:jc w:val="center"/>
-            </w:pPr>
+            <w:r>
+              <w:rPr>
+                <w:lang w:val="en-US"/>
+              </w:rPr>
+              <w:t>0.00%</w:t>
+            </w:r>
           </w:p>
         </w:tc>
       </w:tr>
@@ -16485,6 +16217,12 @@
                 <w:lang w:val="en-US"/>
               </w:rPr>
             </w:pPr>
+            <w:r>
+              <w:rPr>
+                <w:lang w:val="en-US"/>
+              </w:rPr>
+              <w:t>0.68</w:t>
+            </w:r>
           </w:p>
         </w:tc>
         <w:tc>
@@ -16522,6 +16260,12 @@
                 <w:lang w:val="en-US"/>
               </w:rPr>
             </w:pPr>
+            <w:r>
+              <w:rPr>
+                <w:lang w:val="en-US"/>
+              </w:rPr>
+              <w:t>0.00%</w:t>
+            </w:r>
           </w:p>
         </w:tc>
       </w:tr>
@@ -16601,6 +16345,12 @@
                 <w:lang w:val="en-US"/>
               </w:rPr>
             </w:pPr>
+            <w:r>
+              <w:rPr>
+                <w:lang w:val="en-US"/>
+              </w:rPr>
+              <w:t>0.57</w:t>
+            </w:r>
           </w:p>
         </w:tc>
         <w:tc>
@@ -16638,6 +16388,12 @@
                 <w:lang w:val="en-US"/>
               </w:rPr>
             </w:pPr>
+            <w:r>
+              <w:rPr>
+                <w:lang w:val="en-US"/>
+              </w:rPr>
+              <w:t>0.00%</w:t>
+            </w:r>
           </w:p>
         </w:tc>
       </w:tr>
@@ -16740,6 +16496,12 @@
                 <w:lang w:val="en-US"/>
               </w:rPr>
             </w:pPr>
+            <w:r>
+              <w:rPr>
+                <w:lang w:val="en-US"/>
+              </w:rPr>
+              <w:t>2.06</w:t>
+            </w:r>
           </w:p>
         </w:tc>
         <w:tc>
@@ -16772,6 +16534,12 @@
             <w:pPr>
               <w:jc w:val="center"/>
             </w:pPr>
+            <w:r>
+              <w:rPr>
+                <w:lang w:val="en-US"/>
+              </w:rPr>
+              <w:t>0.00%</w:t>
+            </w:r>
           </w:p>
         </w:tc>
       </w:tr>
@@ -16831,16 +16599,7 @@
                     <w:rPr>
                       <w:rFonts w:ascii="Cambria Math" w:hAnsi="Cambria Math"/>
                     </w:rPr>
-                    <m:t>f</m:t>
-                  </m:r>
-                  <m:r>
-                    <m:rPr>
-                      <m:sty m:val="p"/>
-                    </m:rPr>
-                    <w:rPr>
-                      <w:rFonts w:ascii="Cambria Math" w:hAnsi="Cambria Math"/>
-                    </w:rPr>
-                    <m:t>,min</m:t>
+                    <m:t>f,min</m:t>
                   </m:r>
                 </m:sub>
               </m:sSub>
@@ -16871,6 +16630,9 @@
             <w:pPr>
               <w:jc w:val="center"/>
             </w:pPr>
+            <w:r>
+              <w:t>27</w:t>
+            </w:r>
           </w:p>
         </w:tc>
         <w:tc>
@@ -16903,6 +16665,12 @@
             <w:pPr>
               <w:jc w:val="center"/>
             </w:pPr>
+            <w:r>
+              <w:rPr>
+                <w:lang w:val="en-US"/>
+              </w:rPr>
+              <w:t>0.00%</w:t>
+            </w:r>
           </w:p>
         </w:tc>
       </w:tr>
@@ -17007,6 +16775,12 @@
                 <w:lang w:val="en-US"/>
               </w:rPr>
             </w:pPr>
+            <w:r>
+              <w:rPr>
+                <w:lang w:val="en-US"/>
+              </w:rPr>
+              <w:t>0.57</w:t>
+            </w:r>
           </w:p>
         </w:tc>
         <w:tc>
@@ -17039,6 +16813,12 @@
             <w:pPr>
               <w:jc w:val="center"/>
             </w:pPr>
+            <w:r>
+              <w:rPr>
+                <w:lang w:val="en-US"/>
+              </w:rPr>
+              <w:t>0.00%</w:t>
+            </w:r>
           </w:p>
         </w:tc>
       </w:tr>
@@ -17076,13 +16856,7 @@
               <w:rPr>
                 <w:lang w:val="en-US"/>
               </w:rPr>
-              <w:t>.</w:t>
-            </w:r>
-            <w:r>
-              <w:rPr>
-                <w:lang w:val="en-US"/>
-              </w:rPr>
-              <w:t xml:space="preserve"> by length unit</w:t>
+              <w:t>. by length unit</w:t>
             </w:r>
             <w:r>
               <w:rPr>
@@ -17222,6 +16996,12 @@
                 <w:lang w:val="en-US"/>
               </w:rPr>
             </w:pPr>
+            <w:r>
+              <w:rPr>
+                <w:lang w:val="en-US"/>
+              </w:rPr>
+              <w:t>0</w:t>
+            </w:r>
           </w:p>
         </w:tc>
         <w:tc>
@@ -17254,6 +17034,12 @@
             <w:pPr>
               <w:jc w:val="center"/>
             </w:pPr>
+            <w:r>
+              <w:rPr>
+                <w:lang w:val="en-US"/>
+              </w:rPr>
+              <w:t>0.00%</w:t>
+            </w:r>
           </w:p>
         </w:tc>
       </w:tr>
@@ -17458,6 +17244,12 @@
                 <w:lang w:val="en-US"/>
               </w:rPr>
             </w:pPr>
+            <w:r>
+              <w:rPr>
+                <w:lang w:val="en-US"/>
+              </w:rPr>
+              <w:t>0.72</w:t>
+            </w:r>
           </w:p>
         </w:tc>
         <w:tc>
@@ -17520,7 +17312,6 @@
               <w:rPr>
                 <w:lang w:val="en-US"/>
               </w:rPr>
-              <w:lastRenderedPageBreak/>
               <w:t>Resistance to shear force</w:t>
             </w:r>
             <w:r>
@@ -17595,6 +17386,12 @@
                 <w:lang w:val="en-US"/>
               </w:rPr>
             </w:pPr>
+            <w:r>
+              <w:rPr>
+                <w:lang w:val="en-US"/>
+              </w:rPr>
+              <w:t>0.11</w:t>
+            </w:r>
           </w:p>
         </w:tc>
         <w:tc>
@@ -17664,13 +17461,7 @@
         <w:fldChar w:fldCharType="end"/>
       </w:r>
       <w:r>
-        <w:t xml:space="preserve">: ULS at </w:t>
-      </w:r>
-      <w:r>
-        <w:t>construction stage</w:t>
-      </w:r>
-      <w:r>
-        <w:t xml:space="preserve"> </w:t>
+        <w:t xml:space="preserve">: ULS at construction stage </w:t>
       </w:r>
     </w:p>
     <w:p>
@@ -17703,6 +17494,7 @@
               <w:rPr>
                 <w:smallCaps/>
               </w:rPr>
+              <w:lastRenderedPageBreak/>
               <w:t>Résultats</w:t>
             </w:r>
           </w:p>
@@ -17863,6 +17655,12 @@
                 <w:lang w:val="en-US"/>
               </w:rPr>
             </w:pPr>
+            <w:r>
+              <w:rPr>
+                <w:lang w:val="en-US"/>
+              </w:rPr>
+              <w:t>51.2</w:t>
+            </w:r>
           </w:p>
         </w:tc>
         <w:tc>
@@ -17895,6 +17693,9 @@
             <w:pPr>
               <w:jc w:val="center"/>
             </w:pPr>
+            <w:r>
+              <w:t>0.00%</w:t>
+            </w:r>
           </w:p>
         </w:tc>
       </w:tr>
@@ -18010,6 +17811,12 @@
                 <w:lang w:val="en-US"/>
               </w:rPr>
             </w:pPr>
+            <w:r>
+              <w:rPr>
+                <w:lang w:val="en-US"/>
+              </w:rPr>
+              <w:t>13.6</w:t>
+            </w:r>
           </w:p>
         </w:tc>
         <w:tc>
@@ -18042,6 +17849,9 @@
             <w:pPr>
               <w:jc w:val="center"/>
             </w:pPr>
+            <w:r>
+              <w:t>0.00%</w:t>
+            </w:r>
           </w:p>
         </w:tc>
       </w:tr>
@@ -18158,6 +17968,12 @@
                 <w:lang w:val="en-US"/>
               </w:rPr>
             </w:pPr>
+            <w:r>
+              <w:rPr>
+                <w:lang w:val="en-US"/>
+              </w:rPr>
+              <w:t>16.8</w:t>
+            </w:r>
           </w:p>
         </w:tc>
         <w:tc>
@@ -18190,153 +18006,9 @@
             <w:pPr>
               <w:jc w:val="center"/>
             </w:pPr>
-          </w:p>
-        </w:tc>
-      </w:tr>
-      <w:tr>
-        <w:tc>
-          <w:tcPr>
-            <w:tcW w:w="6637" w:type="dxa"/>
-            <w:vAlign w:val="center"/>
-          </w:tcPr>
-          <w:p>
-            <w:pPr>
-              <w:tabs>
-                <w:tab w:val="right" w:pos="4997"/>
-              </w:tabs>
-              <w:jc w:val="left"/>
-              <w:rPr>
-                <w:lang w:val="en-US"/>
-              </w:rPr>
-            </w:pPr>
-            <w:r>
-              <w:rPr>
-                <w:lang w:val="en-US"/>
-              </w:rPr>
-              <w:t>Deflection</w:t>
-            </w:r>
-            <w:r>
-              <w:rPr>
-                <w:lang w:val="en-US"/>
-              </w:rPr>
-              <w:t xml:space="preserve"> : </w:t>
-            </w:r>
-            <m:oMath>
-              <m:r>
-                <w:rPr>
-                  <w:rFonts w:ascii="Cambria Math" w:hAnsi="Cambria Math"/>
-                </w:rPr>
-                <m:t>δ</m:t>
-              </m:r>
-              <m:d>
-                <m:dPr>
-                  <m:ctrlPr>
-                    <w:rPr>
-                      <w:rFonts w:ascii="Cambria Math" w:hAnsi="Cambria Math"/>
-                      <w:i/>
-                      <w:lang w:val="en-US"/>
-                    </w:rPr>
-                  </m:ctrlPr>
-                </m:dPr>
-                <m:e>
-                  <m:sSub>
-                    <m:sSubPr>
-                      <m:ctrlPr>
-                        <w:rPr>
-                          <w:rFonts w:ascii="Cambria Math" w:hAnsi="Cambria Math"/>
-                          <w:i/>
-                          <w:lang w:val="en-US"/>
-                        </w:rPr>
-                      </m:ctrlPr>
-                    </m:sSubPr>
-                    <m:e>
-                      <m:r>
-                        <w:rPr>
-                          <w:rFonts w:ascii="Cambria Math" w:hAnsi="Cambria Math"/>
-                        </w:rPr>
-                        <m:t>Q</m:t>
-                      </m:r>
-                    </m:e>
-                    <m:sub>
-                      <m:r>
-                        <m:rPr>
-                          <m:sty m:val="p"/>
-                        </m:rPr>
-                        <w:rPr>
-                          <w:rFonts w:ascii="Cambria Math" w:hAnsi="Cambria Math"/>
-                          <w:lang w:val="en-US"/>
-                        </w:rPr>
-                        <m:t>c</m:t>
-                      </m:r>
-                    </m:sub>
-                  </m:sSub>
-                </m:e>
-              </m:d>
-            </m:oMath>
-            <w:r>
-              <w:rPr>
-                <w:lang w:val="en-US"/>
-              </w:rPr>
-              <w:tab/>
-              <w:t>(</w:t>
-            </w:r>
-            <w:r>
-              <w:rPr>
-                <w:lang w:val="en-US"/>
-              </w:rPr>
-              <w:t>mm</w:t>
-            </w:r>
-            <w:r>
-              <w:rPr>
-                <w:lang w:val="en-US"/>
-              </w:rPr>
-              <w:t>)</w:t>
-            </w:r>
-          </w:p>
-        </w:tc>
-        <w:tc>
-          <w:tcPr>
-            <w:tcW w:w="1397" w:type="dxa"/>
-          </w:tcPr>
-          <w:p>
-            <w:pPr>
-              <w:jc w:val="center"/>
-              <w:rPr>
-                <w:lang w:val="en-US"/>
-              </w:rPr>
-            </w:pPr>
-          </w:p>
-        </w:tc>
-        <w:tc>
-          <w:tcPr>
-            <w:tcW w:w="1384" w:type="dxa"/>
-          </w:tcPr>
-          <w:p>
-            <w:pPr>
-              <w:jc w:val="center"/>
-              <w:rPr>
-                <w:i/>
-                <w:color w:val="C00000"/>
-              </w:rPr>
-            </w:pPr>
-            <w:r>
-              <w:rPr>
-                <w:i/>
-                <w:color w:val="C00000"/>
-              </w:rPr>
-              <w:t>5.61</w:t>
-            </w:r>
-          </w:p>
-        </w:tc>
-        <w:tc>
-          <w:tcPr>
-            <w:tcW w:w="776" w:type="dxa"/>
-            <w:vAlign w:val="center"/>
-          </w:tcPr>
-          <w:p>
-            <w:pPr>
-              <w:jc w:val="center"/>
-            </w:pPr>
+            <w:r>
+              <w:t>0.00%</w:t>
+            </w:r>
           </w:p>
         </w:tc>
       </w:tr>
@@ -18428,6 +18100,12 @@
                 <w:lang w:val="en-US"/>
               </w:rPr>
             </w:pPr>
+            <w:r>
+              <w:rPr>
+                <w:lang w:val="en-US"/>
+              </w:rPr>
+              <w:t>13.8</w:t>
+            </w:r>
           </w:p>
         </w:tc>
         <w:tc>
@@ -18459,7 +18137,18 @@
           <w:p>
             <w:pPr>
               <w:jc w:val="center"/>
-            </w:pPr>
+              <w:rPr>
+                <w:i/>
+                <w:color w:val="C00000"/>
+              </w:rPr>
+            </w:pPr>
+            <w:r>
+              <w:rPr>
+                <w:i/>
+                <w:color w:val="C00000"/>
+              </w:rPr>
+              <w:t>0.72%</w:t>
+            </w:r>
           </w:p>
         </w:tc>
       </w:tr>
@@ -18551,6 +18240,12 @@
                 <w:lang w:val="en-US"/>
               </w:rPr>
             </w:pPr>
+            <w:r>
+              <w:rPr>
+                <w:lang w:val="en-US"/>
+              </w:rPr>
+              <w:t>95.5</w:t>
+            </w:r>
           </w:p>
         </w:tc>
         <w:tc>
@@ -18583,6 +18278,27 @@
             <w:pPr>
               <w:jc w:val="center"/>
             </w:pPr>
+            <w:r>
+              <w:rPr>
+                <w:i/>
+                <w:color w:val="C00000"/>
+              </w:rPr>
+              <w:t>0.</w:t>
+            </w:r>
+            <w:r>
+              <w:rPr>
+                <w:i/>
+                <w:color w:val="C00000"/>
+              </w:rPr>
+              <w:t>10</w:t>
+            </w:r>
+            <w:r>
+              <w:rPr>
+                <w:i/>
+                <w:color w:val="C00000"/>
+              </w:rPr>
+              <w:t>%</w:t>
+            </w:r>
           </w:p>
         </w:tc>
       </w:tr>
@@ -18706,6 +18422,12 @@
                 <w:lang w:val="en-US"/>
               </w:rPr>
             </w:pPr>
+            <w:r>
+              <w:rPr>
+                <w:lang w:val="en-US"/>
+              </w:rPr>
+              <w:t>3.3</w:t>
+            </w:r>
           </w:p>
         </w:tc>
         <w:tc>
@@ -18738,6 +18460,9 @@
             <w:pPr>
               <w:jc w:val="center"/>
             </w:pPr>
+            <w:r>
+              <w:t>0.00%</w:t>
+            </w:r>
           </w:p>
         </w:tc>
       </w:tr>
@@ -18768,10 +18493,7 @@
         <w:fldChar w:fldCharType="end"/>
       </w:r>
       <w:r>
-        <w:t xml:space="preserve">: </w:t>
-      </w:r>
-      <w:r>
-        <w:t>SLS</w:t>
+        <w:t>: SLS</w:t>
       </w:r>
       <w:r>
         <w:t xml:space="preserve"> assuming full connection</w:t>
@@ -18908,7 +18630,7 @@
               <w:rFonts w:ascii="Calibri" w:hAnsi="Calibri"/>
               <w:noProof/>
             </w:rPr>
-            <w:t>05/02/2024</w:t>
+            <w:t>06/02/2024</w:t>
           </w:r>
           <w:r>
             <w:rPr>
@@ -21306,7 +21028,7 @@
               <w:szCs w:val="20"/>
               <w:lang w:val="en-GB"/>
             </w:rPr>
-            <w:t>14</w:t>
+            <w:t>4</w:t>
           </w:r>
           <w:r>
             <w:rPr>
@@ -32684,18 +32406,18 @@
 </file>
 
 <file path=customXml/item2.xml><?xml version="1.0" encoding="utf-8"?>
+<p:properties xmlns:p="http://schemas.microsoft.com/office/2006/metadata/properties" xmlns:xsi="http://www.w3.org/2001/XMLSchema-instance" xmlns:pc="http://schemas.microsoft.com/office/infopath/2007/PartnerControls">
+  <documentManagement/>
+</p:properties>
+</file>
+
+<file path=customXml/item3.xml><?xml version="1.0" encoding="utf-8"?>
 <?mso-contentType ?>
 <FormTemplates xmlns="http://schemas.microsoft.com/sharepoint/v3/contenttype/forms">
   <Display>DocumentLibraryForm</Display>
   <Edit>DocumentLibraryForm</Edit>
   <New>DocumentLibraryForm</New>
 </FormTemplates>
-</file>
-
-<file path=customXml/item3.xml><?xml version="1.0" encoding="utf-8"?>
-<p:properties xmlns:p="http://schemas.microsoft.com/office/2006/metadata/properties" xmlns:xsi="http://www.w3.org/2001/XMLSchema-instance" xmlns:pc="http://schemas.microsoft.com/office/infopath/2007/PartnerControls">
-  <documentManagement/>
-</p:properties>
 </file>
 
 <file path=customXml/item4.xml><?xml version="1.0" encoding="utf-8"?>
@@ -32721,14 +32443,6 @@
 </file>
 
 <file path=customXml/itemProps2.xml><?xml version="1.0" encoding="utf-8"?>
-<ds:datastoreItem xmlns:ds="http://schemas.openxmlformats.org/officeDocument/2006/customXml" ds:itemID="{4FB0FFFE-1214-4FB0-A9C1-883B8A00FAD1}">
-  <ds:schemaRefs>
-    <ds:schemaRef ds:uri="http://schemas.microsoft.com/sharepoint/v3/contenttype/forms"/>
-  </ds:schemaRefs>
-</ds:datastoreItem>
-</file>
-
-<file path=customXml/itemProps3.xml><?xml version="1.0" encoding="utf-8"?>
 <ds:datastoreItem xmlns:ds="http://schemas.openxmlformats.org/officeDocument/2006/customXml" ds:itemID="{8244F4F7-4138-49F1-B92F-F5AC6DA6C88D}">
   <ds:schemaRefs>
     <ds:schemaRef ds:uri="http://schemas.microsoft.com/office/2006/metadata/properties"/>
@@ -32737,8 +32451,16 @@
 </ds:datastoreItem>
 </file>
 
+<file path=customXml/itemProps3.xml><?xml version="1.0" encoding="utf-8"?>
+<ds:datastoreItem xmlns:ds="http://schemas.openxmlformats.org/officeDocument/2006/customXml" ds:itemID="{4FB0FFFE-1214-4FB0-A9C1-883B8A00FAD1}">
+  <ds:schemaRefs>
+    <ds:schemaRef ds:uri="http://schemas.microsoft.com/sharepoint/v3/contenttype/forms"/>
+  </ds:schemaRefs>
+</ds:datastoreItem>
+</file>
+
 <file path=customXml/itemProps4.xml><?xml version="1.0" encoding="utf-8"?>
-<ds:datastoreItem xmlns:ds="http://schemas.openxmlformats.org/officeDocument/2006/customXml" ds:itemID="{30EA2C08-63DE-4A81-A701-7CB68DCC6A58}">
+<ds:datastoreItem xmlns:ds="http://schemas.openxmlformats.org/officeDocument/2006/customXml" ds:itemID="{82F0E2DC-9454-4C38-9F9A-848B2224289D}">
   <ds:schemaRefs>
     <ds:schemaRef ds:uri="http://schemas.openxmlformats.org/officeDocument/2006/bibliography"/>
   </ds:schemaRefs>

</xml_diff>

<commit_message>
MAJ Frm_Section (transfert des plages non effectué)
</commit_message>
<xml_diff>
--- a/Manuel Validation/ABCPMX - Manuel Validation.docx
+++ b/Manuel Validation/ABCPMX - Manuel Validation.docx
@@ -6140,152 +6140,8 @@
         <w:ind w:left="708"/>
         <w:jc w:val="center"/>
       </w:pPr>
-      <w:r>
-        <w:rPr>
-          <w:noProof/>
-        </w:rPr>
-        <w:drawing>
-          <wp:inline distT="0" distB="0" distL="0" distR="0" wp14:anchorId="5FDB0AB2" wp14:editId="1809ED07">
-            <wp:extent cx="4697676" cy="2376000"/>
-            <wp:effectExtent l="0" t="0" r="8255" b="5715"/>
-            <wp:docPr id="33" name="Image 33"/>
-            <wp:cNvGraphicFramePr>
-              <a:graphicFrameLocks xmlns:a="http://schemas.openxmlformats.org/drawingml/2006/main" noChangeAspect="1"/>
-            </wp:cNvGraphicFramePr>
-            <a:graphic xmlns:a="http://schemas.openxmlformats.org/drawingml/2006/main">
-              <a:graphicData uri="http://schemas.openxmlformats.org/drawingml/2006/picture">
-                <pic:pic xmlns:pic="http://schemas.openxmlformats.org/drawingml/2006/picture">
-                  <pic:nvPicPr>
-                    <pic:cNvPr id="1" name=""/>
-                    <pic:cNvPicPr/>
-                  </pic:nvPicPr>
-                  <pic:blipFill>
-                    <a:blip r:embed="rId33"/>
-                    <a:stretch>
-                      <a:fillRect/>
-                    </a:stretch>
-                  </pic:blipFill>
-                  <pic:spPr>
-                    <a:xfrm>
-                      <a:off x="0" y="0"/>
-                      <a:ext cx="4697676" cy="2376000"/>
-                    </a:xfrm>
-                    <a:prstGeom prst="rect">
-                      <a:avLst/>
-                    </a:prstGeom>
-                  </pic:spPr>
-                </pic:pic>
-              </a:graphicData>
-            </a:graphic>
-          </wp:inline>
-        </w:drawing>
-      </w:r>
-    </w:p>
-    <w:p>
-      <w:pPr>
-        <w:pBdr>
-          <w:top w:val="single" w:sz="4" w:space="1" w:color="auto"/>
-        </w:pBdr>
-        <w:spacing w:after="200"/>
-        <w:jc w:val="center"/>
-        <w:rPr>
-          <w:i/>
-          <w:iCs/>
-          <w:sz w:val="20"/>
-          <w:szCs w:val="18"/>
-          <w:lang w:val="en-US"/>
-        </w:rPr>
-      </w:pPr>
-      <w:r>
-        <w:rPr>
-          <w:i/>
-          <w:iCs/>
-          <w:sz w:val="20"/>
-          <w:szCs w:val="18"/>
-          <w:lang w:val="en-US"/>
-        </w:rPr>
-        <w:t xml:space="preserve">Figure </w:t>
-      </w:r>
-      <w:r>
-        <w:rPr>
-          <w:i/>
-          <w:iCs/>
-          <w:sz w:val="20"/>
-          <w:szCs w:val="18"/>
-        </w:rPr>
-        <w:fldChar w:fldCharType="begin"/>
-      </w:r>
-      <w:r>
-        <w:rPr>
-          <w:i/>
-          <w:iCs/>
-          <w:sz w:val="20"/>
-          <w:szCs w:val="18"/>
-          <w:lang w:val="en-US"/>
-        </w:rPr>
-        <w:instrText xml:space="preserve"> SEQ Figure \* ARABIC  \* MERGEFORMAT </w:instrText>
-      </w:r>
-      <w:r>
-        <w:rPr>
-          <w:i/>
-          <w:iCs/>
-          <w:sz w:val="20"/>
-          <w:szCs w:val="18"/>
-        </w:rPr>
-        <w:fldChar w:fldCharType="separate"/>
-      </w:r>
-      <w:r>
-        <w:rPr>
-          <w:i/>
-          <w:iCs/>
-          <w:noProof/>
-          <w:sz w:val="20"/>
-          <w:szCs w:val="18"/>
-          <w:lang w:val="en-US"/>
-        </w:rPr>
-        <w:t>15</w:t>
-      </w:r>
-      <w:r>
-        <w:rPr>
-          <w:i/>
-          <w:iCs/>
-          <w:sz w:val="20"/>
-          <w:szCs w:val="18"/>
-        </w:rPr>
-        <w:fldChar w:fldCharType="end"/>
-      </w:r>
-      <w:r>
-        <w:rPr>
-          <w:i/>
-          <w:iCs/>
-          <w:sz w:val="20"/>
-          <w:szCs w:val="18"/>
-          <w:lang w:val="en-US"/>
-        </w:rPr>
-        <w:t> : Definition of the load cases – Construction phase live load QC</w:t>
-      </w:r>
-    </w:p>
-    <w:p>
-      <w:pPr>
-        <w:pBdr>
-          <w:top w:val="single" w:sz="4" w:space="1" w:color="auto"/>
-        </w:pBdr>
-        <w:spacing w:after="200"/>
-        <w:jc w:val="center"/>
-        <w:rPr>
-          <w:i/>
-          <w:iCs/>
-          <w:sz w:val="20"/>
-          <w:szCs w:val="18"/>
-          <w:lang w:val="en-US"/>
-        </w:rPr>
-      </w:pPr>
-    </w:p>
-    <w:p>
-      <w:pPr>
-        <w:ind w:left="708"/>
-        <w:jc w:val="center"/>
-      </w:pPr>
+      <w:bookmarkStart w:id="25" w:name="_GoBack"/>
+      <w:bookmarkEnd w:id="25"/>
       <w:r>
         <w:rPr>
           <w:noProof/>
@@ -6439,7 +6295,6 @@
         <w:rPr>
           <w:noProof/>
         </w:rPr>
-        <w:lastRenderedPageBreak/>
         <w:drawing>
           <wp:inline distT="0" distB="0" distL="0" distR="0" wp14:anchorId="4A20CDBD" wp14:editId="74AD5A14">
             <wp:extent cx="2571541" cy="2484000"/>
@@ -6656,6 +6511,7 @@
         <w:rPr>
           <w:noProof/>
         </w:rPr>
+        <w:lastRenderedPageBreak/>
         <w:drawing>
           <wp:inline distT="0" distB="0" distL="0" distR="0" wp14:anchorId="1AEAAC69" wp14:editId="1A36A0AE">
             <wp:extent cx="2565530" cy="2484000"/>
@@ -7076,7 +6932,6 @@
         <w:rPr>
           <w:noProof/>
         </w:rPr>
-        <w:lastRenderedPageBreak/>
         <w:drawing>
           <wp:inline distT="0" distB="0" distL="0" distR="0" wp14:anchorId="5C27F6A8" wp14:editId="6F4900FF">
             <wp:extent cx="4335494" cy="1719072"/>
@@ -7234,12 +7089,13 @@
       <w:pPr>
         <w:pStyle w:val="Titre3"/>
       </w:pPr>
-      <w:bookmarkStart w:id="25" w:name="_Toc158042650"/>
+      <w:bookmarkStart w:id="26" w:name="_Toc158042650"/>
       <w:proofErr w:type="spellStart"/>
       <w:r>
+        <w:lastRenderedPageBreak/>
         <w:t>Results</w:t>
       </w:r>
-      <w:bookmarkEnd w:id="25"/>
+      <w:bookmarkEnd w:id="26"/>
       <w:proofErr w:type="spellEnd"/>
     </w:p>
     <w:tbl>
@@ -9812,7 +9668,6 @@
               <w:rPr>
                 <w:lang w:val="en-US"/>
               </w:rPr>
-              <w:lastRenderedPageBreak/>
               <w:t xml:space="preserve">Shear resistance : </w:t>
             </w:r>
             <m:oMath>
@@ -10950,6 +10805,7 @@
               <w:rPr>
                 <w:lang w:val="en-US"/>
               </w:rPr>
+              <w:lastRenderedPageBreak/>
               <w:t xml:space="preserve">Char. value of the compression </w:t>
             </w:r>
             <w:proofErr w:type="spellStart"/>
@@ -13775,7 +13631,6 @@
               <w:rPr>
                 <w:lang w:val="en-US"/>
               </w:rPr>
-              <w:lastRenderedPageBreak/>
               <w:t xml:space="preserve">Elastic neutral axis </w:t>
             </w:r>
             <w:r>
@@ -15319,6 +15174,7 @@
               <w:rPr>
                 <w:lang w:val="en-US"/>
               </w:rPr>
+              <w:lastRenderedPageBreak/>
               <w:t>Shear force</w:t>
             </w:r>
             <w:r>
@@ -17240,14 +17096,7 @@
                 <w:i/>
                 <w:color w:val="C00000"/>
               </w:rPr>
-              <w:t>0.</w:t>
-            </w:r>
-            <w:r>
-              <w:rPr>
-                <w:i/>
-                <w:color w:val="C00000"/>
-              </w:rPr>
-              <w:t>72</w:t>
+              <w:t>0.72</w:t>
             </w:r>
           </w:p>
         </w:tc>
@@ -17260,6 +17109,12 @@
             <w:pPr>
               <w:jc w:val="center"/>
             </w:pPr>
+            <w:r>
+              <w:rPr>
+                <w:lang w:val="en-US"/>
+              </w:rPr>
+              <w:t>0.00%</w:t>
+            </w:r>
           </w:p>
         </w:tc>
       </w:tr>
@@ -17382,14 +17237,7 @@
                 <w:i/>
                 <w:color w:val="C00000"/>
               </w:rPr>
-              <w:t>0.</w:t>
-            </w:r>
-            <w:r>
-              <w:rPr>
-                <w:i/>
-                <w:color w:val="C00000"/>
-              </w:rPr>
-              <w:t>11</w:t>
+              <w:t>0.11</w:t>
             </w:r>
           </w:p>
         </w:tc>
@@ -17402,6 +17250,12 @@
             <w:pPr>
               <w:jc w:val="center"/>
             </w:pPr>
+            <w:r>
+              <w:rPr>
+                <w:lang w:val="en-US"/>
+              </w:rPr>
+              <w:t>0.00%</w:t>
+            </w:r>
           </w:p>
         </w:tc>
       </w:tr>
@@ -17465,7 +17319,6 @@
               <w:rPr>
                 <w:smallCaps/>
               </w:rPr>
-              <w:lastRenderedPageBreak/>
               <w:t>Résultats</w:t>
             </w:r>
           </w:p>
@@ -18628,6 +18481,9 @@
         <w:jc w:val="center"/>
       </w:pPr>
       <w:r>
+        <w:rPr>
+          <w:noProof/>
+        </w:rPr>
         <w:drawing>
           <wp:inline distT="0" distB="0" distL="0" distR="0" wp14:anchorId="584BFF8C" wp14:editId="5CE68EDA">
             <wp:extent cx="6479540" cy="1685925"/>
@@ -18771,6 +18627,9 @@
         <w:jc w:val="center"/>
       </w:pPr>
       <w:r>
+        <w:rPr>
+          <w:noProof/>
+        </w:rPr>
         <w:drawing>
           <wp:inline distT="0" distB="0" distL="0" distR="0" wp14:anchorId="556B0575" wp14:editId="2A746134">
             <wp:extent cx="5627603" cy="2271116"/>
@@ -18913,6 +18772,9 @@
         <w:jc w:val="center"/>
       </w:pPr>
       <w:r>
+        <w:rPr>
+          <w:noProof/>
+        </w:rPr>
         <w:lastRenderedPageBreak/>
         <w:drawing>
           <wp:inline distT="0" distB="0" distL="0" distR="0" wp14:anchorId="5592D7B5" wp14:editId="4CF277C9">
@@ -19048,6 +18910,9 @@
         <w:jc w:val="center"/>
       </w:pPr>
       <w:r>
+        <w:rPr>
+          <w:noProof/>
+        </w:rPr>
         <w:drawing>
           <wp:inline distT="0" distB="0" distL="0" distR="0" wp14:anchorId="46A3922F" wp14:editId="7C787237">
             <wp:extent cx="3053950" cy="2829306"/>
@@ -19175,6 +19040,9 @@
         <w:jc w:val="center"/>
       </w:pPr>
       <w:r>
+        <w:rPr>
+          <w:noProof/>
+        </w:rPr>
         <w:lastRenderedPageBreak/>
         <w:drawing>
           <wp:inline distT="0" distB="0" distL="0" distR="0" wp14:anchorId="747BADF7" wp14:editId="30BB1005">
@@ -19319,6 +19187,9 @@
         <w:jc w:val="center"/>
       </w:pPr>
       <w:r>
+        <w:rPr>
+          <w:noProof/>
+        </w:rPr>
         <w:drawing>
           <wp:inline distT="0" distB="0" distL="0" distR="0" wp14:anchorId="0CBAAA7C" wp14:editId="60F2E9DA">
             <wp:extent cx="5704129" cy="1184540"/>
@@ -19462,6 +19333,9 @@
         <w:jc w:val="center"/>
       </w:pPr>
       <w:r>
+        <w:rPr>
+          <w:noProof/>
+        </w:rPr>
         <w:drawing>
           <wp:inline distT="0" distB="0" distL="0" distR="0" wp14:anchorId="0F0FF864" wp14:editId="3A543E28">
             <wp:extent cx="5389575" cy="2711689"/>
@@ -19605,6 +19479,9 @@
         <w:jc w:val="center"/>
       </w:pPr>
       <w:r>
+        <w:rPr>
+          <w:noProof/>
+        </w:rPr>
         <w:lastRenderedPageBreak/>
         <w:drawing>
           <wp:inline distT="0" distB="0" distL="0" distR="0" wp14:anchorId="25BA5D3C" wp14:editId="472E73E9">
@@ -19749,6 +19626,9 @@
         <w:jc w:val="center"/>
       </w:pPr>
       <w:r>
+        <w:rPr>
+          <w:noProof/>
+        </w:rPr>
         <w:drawing>
           <wp:inline distT="0" distB="0" distL="0" distR="0" wp14:anchorId="6BA8C253" wp14:editId="50EE0887">
             <wp:extent cx="5490841" cy="2748111"/>
@@ -20565,6 +20445,9 @@
         <w:jc w:val="center"/>
       </w:pPr>
       <w:r>
+        <w:rPr>
+          <w:noProof/>
+        </w:rPr>
         <w:lastRenderedPageBreak/>
         <w:drawing>
           <wp:inline distT="0" distB="0" distL="0" distR="0" wp14:anchorId="567B5F39" wp14:editId="7A851652">
@@ -24541,8 +24424,6 @@
       <w:pPr>
         <w:pStyle w:val="Lgende"/>
       </w:pPr>
-      <w:bookmarkStart w:id="26" w:name="_GoBack"/>
-      <w:bookmarkEnd w:id="26"/>
       <w:r>
         <w:t xml:space="preserve">Table </w:t>
       </w:r>
@@ -24565,13 +24446,7 @@
         <w:fldChar w:fldCharType="end"/>
       </w:r>
       <w:r>
-        <w:t xml:space="preserve">: </w:t>
-      </w:r>
-      <w:r>
-        <w:t>Partial encasement</w:t>
-      </w:r>
-      <w:r>
-        <w:t xml:space="preserve"> </w:t>
+        <w:t xml:space="preserve">: Partial encasement </w:t>
       </w:r>
     </w:p>
     <w:p>
@@ -24870,6 +24745,7 @@
               <w:rPr>
                 <w:i/>
                 <w:color w:val="C00000"/>
+                <w:lang w:val="en-US"/>
               </w:rPr>
             </w:pPr>
           </w:p>
@@ -24881,6 +24757,9 @@
           <w:p>
             <w:pPr>
               <w:jc w:val="center"/>
+              <w:rPr>
+                <w:lang w:val="en-US"/>
+              </w:rPr>
             </w:pPr>
           </w:p>
         </w:tc>
@@ -24990,6 +24869,7 @@
               <w:rPr>
                 <w:i/>
                 <w:color w:val="C00000"/>
+                <w:lang w:val="en-US"/>
               </w:rPr>
             </w:pPr>
           </w:p>
@@ -25001,6 +24881,9 @@
           <w:p>
             <w:pPr>
               <w:jc w:val="center"/>
+              <w:rPr>
+                <w:lang w:val="en-US"/>
+              </w:rPr>
             </w:pPr>
           </w:p>
         </w:tc>
@@ -25110,6 +24993,7 @@
               <w:rPr>
                 <w:i/>
                 <w:color w:val="C00000"/>
+                <w:lang w:val="en-US"/>
               </w:rPr>
             </w:pPr>
           </w:p>
@@ -25121,6 +25005,9 @@
           <w:p>
             <w:pPr>
               <w:jc w:val="center"/>
+              <w:rPr>
+                <w:lang w:val="en-US"/>
+              </w:rPr>
             </w:pPr>
           </w:p>
         </w:tc>
@@ -25216,6 +25103,7 @@
               <w:rPr>
                 <w:i/>
                 <w:color w:val="C00000"/>
+                <w:lang w:val="en-US"/>
               </w:rPr>
             </w:pPr>
           </w:p>
@@ -25227,6 +25115,9 @@
           <w:p>
             <w:pPr>
               <w:jc w:val="center"/>
+              <w:rPr>
+                <w:lang w:val="en-US"/>
+              </w:rPr>
             </w:pPr>
           </w:p>
         </w:tc>
@@ -25343,6 +25234,7 @@
               <w:rPr>
                 <w:i/>
                 <w:color w:val="C00000"/>
+                <w:lang w:val="en-US"/>
               </w:rPr>
             </w:pPr>
           </w:p>
@@ -25354,6 +25246,9 @@
           <w:p>
             <w:pPr>
               <w:jc w:val="center"/>
+              <w:rPr>
+                <w:lang w:val="en-US"/>
+              </w:rPr>
             </w:pPr>
           </w:p>
         </w:tc>
@@ -25451,6 +25346,7 @@
               <w:rPr>
                 <w:i/>
                 <w:color w:val="C00000"/>
+                <w:lang w:val="en-US"/>
               </w:rPr>
             </w:pPr>
           </w:p>
@@ -25462,6 +25358,9 @@
           <w:p>
             <w:pPr>
               <w:jc w:val="center"/>
+              <w:rPr>
+                <w:lang w:val="en-US"/>
+              </w:rPr>
             </w:pPr>
           </w:p>
         </w:tc>
@@ -25750,6 +25649,7 @@
               <w:jc w:val="center"/>
               <w:rPr>
                 <w:color w:val="C00000"/>
+                <w:lang w:val="en-US"/>
               </w:rPr>
             </w:pPr>
           </w:p>
@@ -25761,6 +25661,9 @@
           <w:p>
             <w:pPr>
               <w:jc w:val="center"/>
+              <w:rPr>
+                <w:lang w:val="en-US"/>
+              </w:rPr>
             </w:pPr>
           </w:p>
         </w:tc>
@@ -26432,6 +26335,7 @@
               <w:rPr>
                 <w:i/>
                 <w:color w:val="C00000"/>
+                <w:lang w:val="en-US"/>
               </w:rPr>
             </w:pPr>
           </w:p>
@@ -26444,6 +26348,9 @@
           <w:p>
             <w:pPr>
               <w:jc w:val="center"/>
+              <w:rPr>
+                <w:lang w:val="en-US"/>
+              </w:rPr>
             </w:pPr>
           </w:p>
         </w:tc>
@@ -26596,6 +26503,7 @@
               <w:rPr>
                 <w:i/>
                 <w:color w:val="C00000"/>
+                <w:lang w:val="en-US"/>
               </w:rPr>
             </w:pPr>
           </w:p>
@@ -26608,6 +26516,9 @@
           <w:p>
             <w:pPr>
               <w:jc w:val="center"/>
+              <w:rPr>
+                <w:lang w:val="en-US"/>
+              </w:rPr>
             </w:pPr>
           </w:p>
         </w:tc>
@@ -26760,6 +26671,7 @@
               <w:rPr>
                 <w:i/>
                 <w:color w:val="C00000"/>
+                <w:lang w:val="en-US"/>
               </w:rPr>
             </w:pPr>
           </w:p>
@@ -26772,6 +26684,9 @@
           <w:p>
             <w:pPr>
               <w:jc w:val="center"/>
+              <w:rPr>
+                <w:lang w:val="en-US"/>
+              </w:rPr>
             </w:pPr>
           </w:p>
         </w:tc>
@@ -26918,6 +26833,7 @@
               <w:rPr>
                 <w:i/>
                 <w:color w:val="C00000"/>
+                <w:lang w:val="en-US"/>
               </w:rPr>
             </w:pPr>
           </w:p>
@@ -26930,6 +26846,9 @@
           <w:p>
             <w:pPr>
               <w:jc w:val="center"/>
+              <w:rPr>
+                <w:lang w:val="en-US"/>
+              </w:rPr>
             </w:pPr>
           </w:p>
         </w:tc>
@@ -27069,6 +26988,7 @@
               <w:rPr>
                 <w:i/>
                 <w:color w:val="C00000"/>
+                <w:lang w:val="en-US"/>
               </w:rPr>
             </w:pPr>
           </w:p>
@@ -27084,6 +27004,7 @@
               <w:rPr>
                 <w:i/>
                 <w:color w:val="C00000"/>
+                <w:lang w:val="en-US"/>
               </w:rPr>
             </w:pPr>
           </w:p>
@@ -27224,6 +27145,7 @@
               <w:rPr>
                 <w:i/>
                 <w:color w:val="C00000"/>
+                <w:lang w:val="en-US"/>
               </w:rPr>
             </w:pPr>
           </w:p>
@@ -27236,6 +27158,9 @@
           <w:p>
             <w:pPr>
               <w:jc w:val="center"/>
+              <w:rPr>
+                <w:lang w:val="en-US"/>
+              </w:rPr>
             </w:pPr>
           </w:p>
         </w:tc>
@@ -27375,6 +27300,7 @@
               <w:rPr>
                 <w:i/>
                 <w:color w:val="C00000"/>
+                <w:lang w:val="en-US"/>
               </w:rPr>
             </w:pPr>
           </w:p>
@@ -27387,6 +27313,9 @@
           <w:p>
             <w:pPr>
               <w:jc w:val="center"/>
+              <w:rPr>
+                <w:lang w:val="en-US"/>
+              </w:rPr>
             </w:pPr>
           </w:p>
         </w:tc>
@@ -27526,6 +27455,7 @@
               <w:rPr>
                 <w:i/>
                 <w:color w:val="C00000"/>
+                <w:lang w:val="en-US"/>
               </w:rPr>
             </w:pPr>
           </w:p>
@@ -27538,6 +27468,9 @@
           <w:p>
             <w:pPr>
               <w:jc w:val="center"/>
+              <w:rPr>
+                <w:lang w:val="en-US"/>
+              </w:rPr>
             </w:pPr>
           </w:p>
         </w:tc>
@@ -27909,6 +27842,7 @@
               <w:rPr>
                 <w:i/>
                 <w:color w:val="C00000"/>
+                <w:lang w:val="en-US"/>
               </w:rPr>
             </w:pPr>
           </w:p>
@@ -27920,6 +27854,9 @@
           <w:p>
             <w:pPr>
               <w:jc w:val="center"/>
+              <w:rPr>
+                <w:lang w:val="en-US"/>
+              </w:rPr>
             </w:pPr>
           </w:p>
         </w:tc>
@@ -28047,6 +27984,7 @@
               <w:rPr>
                 <w:i/>
                 <w:color w:val="C00000"/>
+                <w:lang w:val="en-US"/>
               </w:rPr>
             </w:pPr>
           </w:p>
@@ -28058,6 +27996,9 @@
           <w:p>
             <w:pPr>
               <w:jc w:val="center"/>
+              <w:rPr>
+                <w:lang w:val="en-US"/>
+              </w:rPr>
             </w:pPr>
           </w:p>
         </w:tc>
@@ -28185,6 +28126,7 @@
               <w:rPr>
                 <w:i/>
                 <w:color w:val="C00000"/>
+                <w:lang w:val="en-US"/>
               </w:rPr>
             </w:pPr>
           </w:p>
@@ -28196,6 +28138,9 @@
           <w:p>
             <w:pPr>
               <w:jc w:val="center"/>
+              <w:rPr>
+                <w:lang w:val="en-US"/>
+              </w:rPr>
             </w:pPr>
           </w:p>
         </w:tc>
@@ -28323,6 +28268,7 @@
               <w:rPr>
                 <w:i/>
                 <w:color w:val="C00000"/>
+                <w:lang w:val="en-US"/>
               </w:rPr>
             </w:pPr>
           </w:p>
@@ -28334,6 +28280,9 @@
           <w:p>
             <w:pPr>
               <w:jc w:val="center"/>
+              <w:rPr>
+                <w:lang w:val="en-US"/>
+              </w:rPr>
             </w:pPr>
           </w:p>
         </w:tc>
@@ -28461,6 +28410,7 @@
               <w:rPr>
                 <w:i/>
                 <w:color w:val="C00000"/>
+                <w:lang w:val="en-US"/>
               </w:rPr>
             </w:pPr>
           </w:p>
@@ -28472,6 +28422,9 @@
           <w:p>
             <w:pPr>
               <w:jc w:val="center"/>
+              <w:rPr>
+                <w:lang w:val="en-US"/>
+              </w:rPr>
             </w:pPr>
           </w:p>
         </w:tc>
@@ -28599,6 +28552,7 @@
               <w:rPr>
                 <w:i/>
                 <w:color w:val="C00000"/>
+                <w:lang w:val="en-US"/>
               </w:rPr>
             </w:pPr>
           </w:p>
@@ -28610,6 +28564,9 @@
           <w:p>
             <w:pPr>
               <w:jc w:val="center"/>
+              <w:rPr>
+                <w:lang w:val="en-US"/>
+              </w:rPr>
             </w:pPr>
           </w:p>
         </w:tc>
@@ -28737,6 +28694,7 @@
               <w:rPr>
                 <w:i/>
                 <w:color w:val="C00000"/>
+                <w:lang w:val="en-US"/>
               </w:rPr>
             </w:pPr>
           </w:p>
@@ -28748,6 +28706,9 @@
           <w:p>
             <w:pPr>
               <w:jc w:val="center"/>
+              <w:rPr>
+                <w:lang w:val="en-US"/>
+              </w:rPr>
             </w:pPr>
           </w:p>
         </w:tc>
@@ -28875,6 +28836,7 @@
               <w:rPr>
                 <w:i/>
                 <w:color w:val="C00000"/>
+                <w:lang w:val="en-US"/>
               </w:rPr>
             </w:pPr>
           </w:p>
@@ -28887,6 +28849,9 @@
           <w:p>
             <w:pPr>
               <w:jc w:val="center"/>
+              <w:rPr>
+                <w:lang w:val="en-US"/>
+              </w:rPr>
             </w:pPr>
           </w:p>
         </w:tc>
@@ -29104,6 +29069,7 @@
               <w:rPr>
                 <w:i/>
                 <w:color w:val="C00000"/>
+                <w:lang w:val="en-US"/>
               </w:rPr>
             </w:pPr>
           </w:p>
@@ -29116,6 +29082,9 @@
           <w:p>
             <w:pPr>
               <w:jc w:val="center"/>
+              <w:rPr>
+                <w:lang w:val="en-US"/>
+              </w:rPr>
             </w:pPr>
           </w:p>
         </w:tc>
@@ -29226,6 +29195,7 @@
               <w:rPr>
                 <w:i/>
                 <w:color w:val="C00000"/>
+                <w:lang w:val="en-US"/>
               </w:rPr>
             </w:pPr>
           </w:p>
@@ -29238,6 +29208,9 @@
           <w:p>
             <w:pPr>
               <w:jc w:val="center"/>
+              <w:rPr>
+                <w:lang w:val="en-US"/>
+              </w:rPr>
             </w:pPr>
           </w:p>
         </w:tc>
@@ -29348,6 +29321,7 @@
               <w:rPr>
                 <w:i/>
                 <w:color w:val="C00000"/>
+                <w:lang w:val="en-US"/>
               </w:rPr>
             </w:pPr>
           </w:p>
@@ -29360,6 +29334,9 @@
           <w:p>
             <w:pPr>
               <w:jc w:val="center"/>
+              <w:rPr>
+                <w:lang w:val="en-US"/>
+              </w:rPr>
             </w:pPr>
           </w:p>
         </w:tc>
@@ -29659,6 +29636,7 @@
               <w:rPr>
                 <w:i/>
                 <w:color w:val="C00000"/>
+                <w:lang w:val="en-US"/>
               </w:rPr>
             </w:pPr>
           </w:p>
@@ -29671,6 +29649,9 @@
           <w:p>
             <w:pPr>
               <w:jc w:val="center"/>
+              <w:rPr>
+                <w:lang w:val="en-US"/>
+              </w:rPr>
             </w:pPr>
           </w:p>
         </w:tc>
@@ -29903,6 +29884,7 @@
               <w:rPr>
                 <w:i/>
                 <w:color w:val="C00000"/>
+                <w:lang w:val="en-US"/>
               </w:rPr>
             </w:pPr>
           </w:p>
@@ -29915,6 +29897,9 @@
           <w:p>
             <w:pPr>
               <w:jc w:val="center"/>
+              <w:rPr>
+                <w:lang w:val="en-US"/>
+              </w:rPr>
             </w:pPr>
           </w:p>
         </w:tc>
@@ -30106,6 +30091,7 @@
               <w:rPr>
                 <w:i/>
                 <w:color w:val="C00000"/>
+                <w:lang w:val="en-US"/>
               </w:rPr>
             </w:pPr>
           </w:p>
@@ -30118,6 +30104,9 @@
           <w:p>
             <w:pPr>
               <w:jc w:val="center"/>
+              <w:rPr>
+                <w:lang w:val="en-US"/>
+              </w:rPr>
             </w:pPr>
           </w:p>
         </w:tc>
@@ -31019,6 +31008,7 @@
               <w:rPr>
                 <w:i/>
                 <w:color w:val="C00000"/>
+                <w:lang w:val="en-US"/>
               </w:rPr>
             </w:pPr>
           </w:p>
@@ -31031,6 +31021,9 @@
           <w:p>
             <w:pPr>
               <w:jc w:val="center"/>
+              <w:rPr>
+                <w:lang w:val="en-US"/>
+              </w:rPr>
             </w:pPr>
           </w:p>
         </w:tc>
@@ -31196,7 +31189,7 @@
               <w:rFonts w:ascii="Calibri" w:hAnsi="Calibri"/>
               <w:noProof/>
             </w:rPr>
-            <w:t>07/02/2024</w:t>
+            <w:t>07/03/2024</w:t>
           </w:r>
           <w:r>
             <w:rPr>
@@ -31769,7 +31762,7 @@
               <w:sz w:val="20"/>
               <w:szCs w:val="20"/>
             </w:rPr>
-            <w:t>27</w:t>
+            <w:t>24</w:t>
           </w:r>
           <w:r>
             <w:rPr>
@@ -32093,7 +32086,7 @@
               <w:sz w:val="20"/>
               <w:szCs w:val="20"/>
             </w:rPr>
-            <w:t>25</w:t>
+            <w:t>24</w:t>
           </w:r>
           <w:r>
             <w:rPr>
@@ -33594,7 +33587,7 @@
               <w:szCs w:val="20"/>
               <w:lang w:val="en-GB"/>
             </w:rPr>
-            <w:t>22</w:t>
+            <w:t>19</w:t>
           </w:r>
           <w:r>
             <w:rPr>
@@ -44782,12 +44775,6 @@
 </file>
 
 <file path=customXml/item1.xml><?xml version="1.0" encoding="utf-8"?>
-<p:properties xmlns:p="http://schemas.microsoft.com/office/2006/metadata/properties" xmlns:xsi="http://www.w3.org/2001/XMLSchema-instance" xmlns:pc="http://schemas.microsoft.com/office/infopath/2007/PartnerControls">
-  <documentManagement/>
-</p:properties>
-</file>
-
-<file path=customXml/item2.xml><?xml version="1.0" encoding="utf-8"?>
 <ct:contentTypeSchema xmlns:ct="http://schemas.microsoft.com/office/2006/metadata/contentType" xmlns:ma="http://schemas.microsoft.com/office/2006/metadata/properties/metaAttributes" ct:_="" ma:_="" ma:contentTypeName="Document" ma:contentTypeID="0x010100C247FB7A51CDFF45B526B55FCBF0CC3A" ma:contentTypeVersion="11" ma:contentTypeDescription="Crée un document." ma:contentTypeScope="" ma:versionID="163d0b2c9ded4b8a7dfdd976cd200a17">
   <xsd:schema xmlns:xsd="http://www.w3.org/2001/XMLSchema" xmlns:xs="http://www.w3.org/2001/XMLSchema" xmlns:p="http://schemas.microsoft.com/office/2006/metadata/properties" xmlns:ns3="1339968c-844c-4ba9-aec6-fbaa9d140e36" targetNamespace="http://schemas.microsoft.com/office/2006/metadata/properties" ma:root="true" ma:fieldsID="d2393c41cac5a2e9ffb95dd220a5df63" ns3:_="">
     <xsd:import namespace="1339968c-844c-4ba9-aec6-fbaa9d140e36"/>
@@ -44977,7 +44964,7 @@
 </ct:contentTypeSchema>
 </file>
 
-<file path=customXml/item3.xml><?xml version="1.0" encoding="utf-8"?>
+<file path=customXml/item2.xml><?xml version="1.0" encoding="utf-8"?>
 <?mso-contentType ?>
 <FormTemplates xmlns="http://schemas.microsoft.com/sharepoint/v3/contenttype/forms">
   <Display>DocumentLibraryForm</Display>
@@ -44986,20 +44973,17 @@
 </FormTemplates>
 </file>
 
+<file path=customXml/item3.xml><?xml version="1.0" encoding="utf-8"?>
+<p:properties xmlns:p="http://schemas.microsoft.com/office/2006/metadata/properties" xmlns:xsi="http://www.w3.org/2001/XMLSchema-instance" xmlns:pc="http://schemas.microsoft.com/office/infopath/2007/PartnerControls">
+  <documentManagement/>
+</p:properties>
+</file>
+
 <file path=customXml/item4.xml><?xml version="1.0" encoding="utf-8"?>
 <b:Sources xmlns:b="http://schemas.openxmlformats.org/officeDocument/2006/bibliography" xmlns="http://schemas.openxmlformats.org/officeDocument/2006/bibliography" SelectedStyle="\APASixthEditionOfficeOnline.xsl" StyleName="APA" Version="6"/>
 </file>
 
 <file path=customXml/itemProps1.xml><?xml version="1.0" encoding="utf-8"?>
-<ds:datastoreItem xmlns:ds="http://schemas.openxmlformats.org/officeDocument/2006/customXml" ds:itemID="{8244F4F7-4138-49F1-B92F-F5AC6DA6C88D}">
-  <ds:schemaRefs>
-    <ds:schemaRef ds:uri="http://schemas.microsoft.com/office/2006/metadata/properties"/>
-    <ds:schemaRef ds:uri="http://schemas.microsoft.com/office/infopath/2007/PartnerControls"/>
-  </ds:schemaRefs>
-</ds:datastoreItem>
-</file>
-
-<file path=customXml/itemProps2.xml><?xml version="1.0" encoding="utf-8"?>
 <ds:datastoreItem xmlns:ds="http://schemas.openxmlformats.org/officeDocument/2006/customXml" ds:itemID="{763DED0B-077B-498B-B22E-F05F3E3AE21C}">
   <ds:schemaRefs>
     <ds:schemaRef ds:uri="http://schemas.microsoft.com/office/2006/metadata/contentType"/>
@@ -45017,7 +45001,7 @@
 </ds:datastoreItem>
 </file>
 
-<file path=customXml/itemProps3.xml><?xml version="1.0" encoding="utf-8"?>
+<file path=customXml/itemProps2.xml><?xml version="1.0" encoding="utf-8"?>
 <ds:datastoreItem xmlns:ds="http://schemas.openxmlformats.org/officeDocument/2006/customXml" ds:itemID="{4FB0FFFE-1214-4FB0-A9C1-883B8A00FAD1}">
   <ds:schemaRefs>
     <ds:schemaRef ds:uri="http://schemas.microsoft.com/sharepoint/v3/contenttype/forms"/>
@@ -45025,8 +45009,17 @@
 </ds:datastoreItem>
 </file>
 
+<file path=customXml/itemProps3.xml><?xml version="1.0" encoding="utf-8"?>
+<ds:datastoreItem xmlns:ds="http://schemas.openxmlformats.org/officeDocument/2006/customXml" ds:itemID="{8244F4F7-4138-49F1-B92F-F5AC6DA6C88D}">
+  <ds:schemaRefs>
+    <ds:schemaRef ds:uri="http://schemas.microsoft.com/office/2006/metadata/properties"/>
+    <ds:schemaRef ds:uri="http://schemas.microsoft.com/office/infopath/2007/PartnerControls"/>
+  </ds:schemaRefs>
+</ds:datastoreItem>
+</file>
+
 <file path=customXml/itemProps4.xml><?xml version="1.0" encoding="utf-8"?>
-<ds:datastoreItem xmlns:ds="http://schemas.openxmlformats.org/officeDocument/2006/customXml" ds:itemID="{F4F47C30-5B91-4AFB-A452-FCC24255B395}">
+<ds:datastoreItem xmlns:ds="http://schemas.openxmlformats.org/officeDocument/2006/customXml" ds:itemID="{3B61C23C-B78C-4AC9-AB4E-E1E4B00770EC}">
   <ds:schemaRefs>
     <ds:schemaRef ds:uri="http://schemas.openxmlformats.org/officeDocument/2006/bibliography"/>
   </ds:schemaRefs>

</xml_diff>

<commit_message>
Cas test RCM2023-3 dans MV
</commit_message>
<xml_diff>
--- a/Manuel Validation/ABCPMX - Manuel Validation.docx
+++ b/Manuel Validation/ABCPMX - Manuel Validation.docx
@@ -1709,7 +1709,7 @@
         </w:rPr>
         <w:fldChar w:fldCharType="separate"/>
       </w:r>
-      <w:hyperlink w:anchor="_Toc158042641" w:history="1">
+      <w:hyperlink w:anchor="_Toc167204724" w:history="1">
         <w:r>
           <w:rPr>
             <w:rStyle w:val="Lienhypertexte"/>
@@ -1736,7 +1736,7 @@
             <w:noProof/>
             <w:webHidden/>
           </w:rPr>
-          <w:instrText xml:space="preserve"> PAGEREF _Toc158042641 \h </w:instrText>
+          <w:instrText xml:space="preserve"> PAGEREF _Toc167204724 \h </w:instrText>
         </w:r>
         <w:r>
           <w:rPr>
@@ -1776,7 +1776,7 @@
           <w:szCs w:val="22"/>
         </w:rPr>
       </w:pPr>
-      <w:hyperlink w:anchor="_Toc158042642" w:history="1">
+      <w:hyperlink w:anchor="_Toc167204725" w:history="1">
         <w:r>
           <w:rPr>
             <w:rStyle w:val="Lienhypertexte"/>
@@ -1804,7 +1804,7 @@
             <w:noProof/>
             <w:webHidden/>
           </w:rPr>
-          <w:instrText xml:space="preserve"> PAGEREF _Toc158042642 \h </w:instrText>
+          <w:instrText xml:space="preserve"> PAGEREF _Toc167204725 \h </w:instrText>
         </w:r>
         <w:r>
           <w:rPr>
@@ -1847,7 +1847,7 @@
           <w:szCs w:val="22"/>
         </w:rPr>
       </w:pPr>
-      <w:hyperlink w:anchor="_Toc158042643" w:history="1">
+      <w:hyperlink w:anchor="_Toc167204726" w:history="1">
         <w:r>
           <w:rPr>
             <w:rStyle w:val="Lienhypertexte"/>
@@ -1875,7 +1875,7 @@
             <w:noProof/>
             <w:webHidden/>
           </w:rPr>
-          <w:instrText xml:space="preserve"> PAGEREF _Toc158042643 \h </w:instrText>
+          <w:instrText xml:space="preserve"> PAGEREF _Toc167204726 \h </w:instrText>
         </w:r>
         <w:r>
           <w:rPr>
@@ -1918,7 +1918,7 @@
           <w:szCs w:val="22"/>
         </w:rPr>
       </w:pPr>
-      <w:hyperlink w:anchor="_Toc158042644" w:history="1">
+      <w:hyperlink w:anchor="_Toc167204727" w:history="1">
         <w:r>
           <w:rPr>
             <w:rStyle w:val="Lienhypertexte"/>
@@ -1946,7 +1946,7 @@
             <w:noProof/>
             <w:webHidden/>
           </w:rPr>
-          <w:instrText xml:space="preserve"> PAGEREF _Toc158042644 \h </w:instrText>
+          <w:instrText xml:space="preserve"> PAGEREF _Toc167204727 \h </w:instrText>
         </w:r>
         <w:r>
           <w:rPr>
@@ -1989,7 +1989,7 @@
           <w:szCs w:val="22"/>
         </w:rPr>
       </w:pPr>
-      <w:hyperlink w:anchor="_Toc158042645" w:history="1">
+      <w:hyperlink w:anchor="_Toc167204728" w:history="1">
         <w:r>
           <w:rPr>
             <w:rStyle w:val="Lienhypertexte"/>
@@ -2017,7 +2017,7 @@
             <w:noProof/>
             <w:webHidden/>
           </w:rPr>
-          <w:instrText xml:space="preserve"> PAGEREF _Toc158042645 \h </w:instrText>
+          <w:instrText xml:space="preserve"> PAGEREF _Toc167204728 \h </w:instrText>
         </w:r>
         <w:r>
           <w:rPr>
@@ -2057,7 +2057,7 @@
           <w:szCs w:val="22"/>
         </w:rPr>
       </w:pPr>
-      <w:hyperlink w:anchor="_Toc158042646" w:history="1">
+      <w:hyperlink w:anchor="_Toc167204729" w:history="1">
         <w:r>
           <w:rPr>
             <w:rStyle w:val="Lienhypertexte"/>
@@ -2084,7 +2084,7 @@
             <w:noProof/>
             <w:webHidden/>
           </w:rPr>
-          <w:instrText xml:space="preserve"> PAGEREF _Toc158042646 \h </w:instrText>
+          <w:instrText xml:space="preserve"> PAGEREF _Toc167204729 \h </w:instrText>
         </w:r>
         <w:r>
           <w:rPr>
@@ -2124,7 +2124,7 @@
           <w:szCs w:val="22"/>
         </w:rPr>
       </w:pPr>
-      <w:hyperlink w:anchor="_Toc158042647" w:history="1">
+      <w:hyperlink w:anchor="_Toc167204730" w:history="1">
         <w:r>
           <w:rPr>
             <w:rStyle w:val="Lienhypertexte"/>
@@ -2151,7 +2151,7 @@
             <w:noProof/>
             <w:webHidden/>
           </w:rPr>
-          <w:instrText xml:space="preserve"> PAGEREF _Toc158042647 \h </w:instrText>
+          <w:instrText xml:space="preserve"> PAGEREF _Toc167204730 \h </w:instrText>
         </w:r>
         <w:r>
           <w:rPr>
@@ -2194,13 +2194,14 @@
           <w:szCs w:val="22"/>
         </w:rPr>
       </w:pPr>
-      <w:hyperlink w:anchor="_Toc158042648" w:history="1">
+      <w:hyperlink w:anchor="_Toc167204731" w:history="1">
         <w:r>
           <w:rPr>
             <w:rStyle w:val="Lienhypertexte"/>
             <w:noProof/>
+            <w:lang w:val="en-US"/>
           </w:rPr>
-          <w:t>4.1. Test case 1 : Simply supported composite beam</w:t>
+          <w:t>4.1. Test case 1: Simply supported composite beam (RCM 2018-2)</w:t>
         </w:r>
         <w:r>
           <w:rPr>
@@ -2221,7 +2222,7 @@
             <w:noProof/>
             <w:webHidden/>
           </w:rPr>
-          <w:instrText xml:space="preserve"> PAGEREF _Toc158042648 \h </w:instrText>
+          <w:instrText xml:space="preserve"> PAGEREF _Toc167204731 \h </w:instrText>
         </w:r>
         <w:r>
           <w:rPr>
@@ -2264,7 +2265,7 @@
           <w:szCs w:val="22"/>
         </w:rPr>
       </w:pPr>
-      <w:hyperlink w:anchor="_Toc158042649" w:history="1">
+      <w:hyperlink w:anchor="_Toc167204732" w:history="1">
         <w:r>
           <w:rPr>
             <w:rStyle w:val="Lienhypertexte"/>
@@ -2291,7 +2292,7 @@
             <w:noProof/>
             <w:webHidden/>
           </w:rPr>
-          <w:instrText xml:space="preserve"> PAGEREF _Toc158042649 \h </w:instrText>
+          <w:instrText xml:space="preserve"> PAGEREF _Toc167204732 \h </w:instrText>
         </w:r>
         <w:r>
           <w:rPr>
@@ -2334,7 +2335,7 @@
           <w:szCs w:val="22"/>
         </w:rPr>
       </w:pPr>
-      <w:hyperlink w:anchor="_Toc158042650" w:history="1">
+      <w:hyperlink w:anchor="_Toc167204733" w:history="1">
         <w:r>
           <w:rPr>
             <w:rStyle w:val="Lienhypertexte"/>
@@ -2361,7 +2362,7 @@
             <w:noProof/>
             <w:webHidden/>
           </w:rPr>
-          <w:instrText xml:space="preserve"> PAGEREF _Toc158042650 \h </w:instrText>
+          <w:instrText xml:space="preserve"> PAGEREF _Toc167204733 \h </w:instrText>
         </w:r>
         <w:r>
           <w:rPr>
@@ -2394,6 +2395,217 @@
     </w:p>
     <w:p>
       <w:pPr>
+        <w:pStyle w:val="TM2"/>
+        <w:tabs>
+          <w:tab w:val="right" w:leader="dot" w:pos="10194"/>
+        </w:tabs>
+        <w:rPr>
+          <w:rFonts w:asciiTheme="minorHAnsi" w:eastAsiaTheme="minorEastAsia" w:hAnsiTheme="minorHAnsi" w:cstheme="minorBidi"/>
+          <w:noProof/>
+          <w:szCs w:val="22"/>
+        </w:rPr>
+      </w:pPr>
+      <w:hyperlink w:anchor="_Toc167204734" w:history="1">
+        <w:r>
+          <w:rPr>
+            <w:rStyle w:val="Lienhypertexte"/>
+            <w:noProof/>
+            <w:lang w:val="en-US"/>
+          </w:rPr>
+          <w:t>4.2. Test case 2: Simply supported composite beam with partial encasement during its construction phase (RCM 2023-3)</w:t>
+        </w:r>
+        <w:r>
+          <w:rPr>
+            <w:noProof/>
+            <w:webHidden/>
+          </w:rPr>
+          <w:tab/>
+        </w:r>
+        <w:r>
+          <w:rPr>
+            <w:noProof/>
+            <w:webHidden/>
+          </w:rPr>
+          <w:fldChar w:fldCharType="begin"/>
+        </w:r>
+        <w:r>
+          <w:rPr>
+            <w:noProof/>
+            <w:webHidden/>
+          </w:rPr>
+          <w:instrText xml:space="preserve"> PAGEREF _Toc167204734 \h </w:instrText>
+        </w:r>
+        <w:r>
+          <w:rPr>
+            <w:noProof/>
+            <w:webHidden/>
+          </w:rPr>
+        </w:r>
+        <w:r>
+          <w:rPr>
+            <w:noProof/>
+            <w:webHidden/>
+          </w:rPr>
+          <w:fldChar w:fldCharType="separate"/>
+        </w:r>
+        <w:r>
+          <w:rPr>
+            <w:noProof/>
+            <w:webHidden/>
+          </w:rPr>
+          <w:t>14</w:t>
+        </w:r>
+        <w:r>
+          <w:rPr>
+            <w:noProof/>
+            <w:webHidden/>
+          </w:rPr>
+          <w:fldChar w:fldCharType="end"/>
+        </w:r>
+      </w:hyperlink>
+    </w:p>
+    <w:p>
+      <w:pPr>
+        <w:pStyle w:val="TM3"/>
+        <w:tabs>
+          <w:tab w:val="right" w:leader="dot" w:pos="10194"/>
+        </w:tabs>
+        <w:rPr>
+          <w:rFonts w:asciiTheme="minorHAnsi" w:eastAsiaTheme="minorEastAsia" w:hAnsiTheme="minorHAnsi" w:cstheme="minorBidi"/>
+          <w:noProof/>
+          <w:szCs w:val="22"/>
+        </w:rPr>
+      </w:pPr>
+      <w:hyperlink w:anchor="_Toc167204735" w:history="1">
+        <w:r>
+          <w:rPr>
+            <w:rStyle w:val="Lienhypertexte"/>
+            <w:noProof/>
+          </w:rPr>
+          <w:t>4.2.1. Input data</w:t>
+        </w:r>
+        <w:r>
+          <w:rPr>
+            <w:noProof/>
+            <w:webHidden/>
+          </w:rPr>
+          <w:tab/>
+        </w:r>
+        <w:r>
+          <w:rPr>
+            <w:noProof/>
+            <w:webHidden/>
+          </w:rPr>
+          <w:fldChar w:fldCharType="begin"/>
+        </w:r>
+        <w:r>
+          <w:rPr>
+            <w:noProof/>
+            <w:webHidden/>
+          </w:rPr>
+          <w:instrText xml:space="preserve"> PAGEREF _Toc167204735 \h </w:instrText>
+        </w:r>
+        <w:r>
+          <w:rPr>
+            <w:noProof/>
+            <w:webHidden/>
+          </w:rPr>
+        </w:r>
+        <w:r>
+          <w:rPr>
+            <w:noProof/>
+            <w:webHidden/>
+          </w:rPr>
+          <w:fldChar w:fldCharType="separate"/>
+        </w:r>
+        <w:r>
+          <w:rPr>
+            <w:noProof/>
+            <w:webHidden/>
+          </w:rPr>
+          <w:t>14</w:t>
+        </w:r>
+        <w:r>
+          <w:rPr>
+            <w:noProof/>
+            <w:webHidden/>
+          </w:rPr>
+          <w:fldChar w:fldCharType="end"/>
+        </w:r>
+      </w:hyperlink>
+    </w:p>
+    <w:p>
+      <w:pPr>
+        <w:pStyle w:val="TM3"/>
+        <w:tabs>
+          <w:tab w:val="right" w:leader="dot" w:pos="10194"/>
+        </w:tabs>
+        <w:rPr>
+          <w:rFonts w:asciiTheme="minorHAnsi" w:eastAsiaTheme="minorEastAsia" w:hAnsiTheme="minorHAnsi" w:cstheme="minorBidi"/>
+          <w:noProof/>
+          <w:szCs w:val="22"/>
+        </w:rPr>
+      </w:pPr>
+      <w:hyperlink w:anchor="_Toc167204736" w:history="1">
+        <w:r>
+          <w:rPr>
+            <w:rStyle w:val="Lienhypertexte"/>
+            <w:noProof/>
+          </w:rPr>
+          <w:t>4.2.2. Results</w:t>
+        </w:r>
+        <w:r>
+          <w:rPr>
+            <w:noProof/>
+            <w:webHidden/>
+          </w:rPr>
+          <w:tab/>
+        </w:r>
+        <w:r>
+          <w:rPr>
+            <w:noProof/>
+            <w:webHidden/>
+          </w:rPr>
+          <w:fldChar w:fldCharType="begin"/>
+        </w:r>
+        <w:r>
+          <w:rPr>
+            <w:noProof/>
+            <w:webHidden/>
+          </w:rPr>
+          <w:instrText xml:space="preserve"> PAGEREF _Toc167204736 \h </w:instrText>
+        </w:r>
+        <w:r>
+          <w:rPr>
+            <w:noProof/>
+            <w:webHidden/>
+          </w:rPr>
+        </w:r>
+        <w:r>
+          <w:rPr>
+            <w:noProof/>
+            <w:webHidden/>
+          </w:rPr>
+          <w:fldChar w:fldCharType="separate"/>
+        </w:r>
+        <w:r>
+          <w:rPr>
+            <w:noProof/>
+            <w:webHidden/>
+          </w:rPr>
+          <w:t>20</w:t>
+        </w:r>
+        <w:r>
+          <w:rPr>
+            <w:noProof/>
+            <w:webHidden/>
+          </w:rPr>
+          <w:fldChar w:fldCharType="end"/>
+        </w:r>
+      </w:hyperlink>
+    </w:p>
+    <w:p>
+      <w:pPr>
         <w:jc w:val="left"/>
         <w:rPr>
           <w:sz w:val="2"/>
@@ -2418,7 +2630,7 @@
       <w:pPr>
         <w:pStyle w:val="Titre1"/>
       </w:pPr>
-      <w:bookmarkStart w:id="0" w:name="_Toc158042641"/>
+      <w:bookmarkStart w:id="0" w:name="_Toc167204724"/>
       <w:r>
         <w:lastRenderedPageBreak/>
         <w:t>Introduction</w:t>
@@ -2489,7 +2701,7 @@
           <w:lang w:val="en-GB"/>
         </w:rPr>
       </w:pPr>
-      <w:bookmarkStart w:id="1" w:name="_Toc158042642"/>
+      <w:bookmarkStart w:id="1" w:name="_Toc167204725"/>
       <w:r>
         <w:rPr>
           <w:lang w:val="en-GB"/>
@@ -2505,7 +2717,7 @@
           <w:lang w:val="en-GB"/>
         </w:rPr>
       </w:pPr>
-      <w:bookmarkStart w:id="2" w:name="_Toc158042643"/>
+      <w:bookmarkStart w:id="2" w:name="_Toc167204726"/>
       <w:r>
         <w:rPr>
           <w:lang w:val="en-GB"/>
@@ -2926,7 +3138,7 @@
           <w:lang w:val="en-GB"/>
         </w:rPr>
       </w:pPr>
-      <w:bookmarkStart w:id="7" w:name="_Toc158042644"/>
+      <w:bookmarkStart w:id="7" w:name="_Toc167204727"/>
       <w:r>
         <w:rPr>
           <w:lang w:val="en-GB"/>
@@ -3245,7 +3457,7 @@
           <w:lang w:val="en-GB"/>
         </w:rPr>
       </w:pPr>
-      <w:bookmarkStart w:id="9" w:name="_Toc158042645"/>
+      <w:bookmarkStart w:id="9" w:name="_Toc167204728"/>
       <w:r>
         <w:rPr>
           <w:lang w:val="en-GB"/>
@@ -3844,7 +4056,7 @@
         <w:pStyle w:val="Titre1"/>
       </w:pPr>
       <w:bookmarkStart w:id="17" w:name="_Toc147933826"/>
-      <w:bookmarkStart w:id="18" w:name="_Toc158042646"/>
+      <w:bookmarkStart w:id="18" w:name="_Toc167204729"/>
       <w:proofErr w:type="spellStart"/>
       <w:r>
         <w:t>P</w:t>
@@ -4028,7 +4240,7 @@
       <w:pPr>
         <w:pStyle w:val="Titre1"/>
       </w:pPr>
-      <w:bookmarkStart w:id="19" w:name="_Toc158042647"/>
+      <w:bookmarkStart w:id="19" w:name="_Toc167204730"/>
       <w:r>
         <w:lastRenderedPageBreak/>
         <w:t>Tests cases</w:t>
@@ -4042,7 +4254,7 @@
           <w:lang w:val="en-US"/>
         </w:rPr>
       </w:pPr>
-      <w:bookmarkStart w:id="20" w:name="_Toc158042648"/>
+      <w:bookmarkStart w:id="20" w:name="_Toc167204731"/>
       <w:r>
         <w:rPr>
           <w:lang w:val="en-US"/>
@@ -4061,13 +4273,13 @@
         </w:rPr>
         <w:t xml:space="preserve"> Simply supported composite beam</w:t>
       </w:r>
+      <w:r>
+        <w:rPr>
+          <w:lang w:val="en-US"/>
+        </w:rPr>
+        <w:t xml:space="preserve"> (RCM 2018-2)</w:t>
+      </w:r>
       <w:bookmarkEnd w:id="20"/>
-      <w:r>
-        <w:rPr>
-          <w:lang w:val="en-US"/>
-        </w:rPr>
-        <w:t xml:space="preserve"> (RCM 2018-2)</w:t>
-      </w:r>
       <w:r>
         <w:rPr>
           <w:lang w:val="en-US"/>
@@ -4116,7 +4328,7 @@
       <w:pPr>
         <w:pStyle w:val="Titre3"/>
       </w:pPr>
-      <w:bookmarkStart w:id="21" w:name="_Toc158042649"/>
+      <w:bookmarkStart w:id="21" w:name="_Toc167204732"/>
       <w:r>
         <w:t>Input data</w:t>
       </w:r>
@@ -7071,7 +7283,7 @@
       <w:pPr>
         <w:pStyle w:val="Titre3"/>
       </w:pPr>
-      <w:bookmarkStart w:id="25" w:name="_Toc158042650"/>
+      <w:bookmarkStart w:id="25" w:name="_Toc167204733"/>
       <w:proofErr w:type="spellStart"/>
       <w:r>
         <w:lastRenderedPageBreak/>
@@ -18315,6 +18527,7 @@
           <w:lang w:val="en-US"/>
         </w:rPr>
       </w:pPr>
+      <w:bookmarkStart w:id="26" w:name="_Toc167204734"/>
       <w:r>
         <w:rPr>
           <w:lang w:val="en-US"/>
@@ -18380,7 +18593,14 @@
         <w:rPr>
           <w:lang w:val="en-US"/>
         </w:rPr>
-        <w:t xml:space="preserve">) </w:t>
+        <w:t>)</w:t>
+      </w:r>
+      <w:bookmarkEnd w:id="26"/>
+      <w:r>
+        <w:rPr>
+          <w:lang w:val="en-US"/>
+        </w:rPr>
+        <w:t xml:space="preserve"> </w:t>
       </w:r>
     </w:p>
     <w:p>
@@ -18442,9 +18662,11 @@
       <w:pPr>
         <w:pStyle w:val="Titre3"/>
       </w:pPr>
+      <w:bookmarkStart w:id="27" w:name="_Toc167204735"/>
       <w:r>
         <w:t>Input data</w:t>
       </w:r>
+      <w:bookmarkEnd w:id="27"/>
     </w:p>
     <w:p>
       <w:pPr>
@@ -19004,6 +19226,9 @@
         <w:jc w:val="center"/>
       </w:pPr>
       <w:r>
+        <w:rPr>
+          <w:noProof/>
+        </w:rPr>
         <w:lastRenderedPageBreak/>
         <w:drawing>
           <wp:inline distT="0" distB="0" distL="0" distR="0" wp14:anchorId="234458A4" wp14:editId="4CEC7C9E">
@@ -19148,6 +19373,9 @@
         <w:jc w:val="center"/>
       </w:pPr>
       <w:r>
+        <w:rPr>
+          <w:noProof/>
+        </w:rPr>
         <w:drawing>
           <wp:inline distT="0" distB="0" distL="0" distR="0" wp14:anchorId="76BE573E" wp14:editId="6A59527C">
             <wp:extent cx="5923722" cy="2488149"/>
@@ -20736,11 +20964,13 @@
       <w:pPr>
         <w:pStyle w:val="Titre3"/>
       </w:pPr>
+      <w:bookmarkStart w:id="28" w:name="_Toc167204736"/>
       <w:proofErr w:type="spellStart"/>
       <w:r>
         <w:lastRenderedPageBreak/>
         <w:t>Results</w:t>
       </w:r>
+      <w:bookmarkEnd w:id="28"/>
       <w:proofErr w:type="spellEnd"/>
     </w:p>
     <w:tbl>
@@ -24219,6 +24449,13 @@
         </w:rPr>
       </w:pPr>
     </w:p>
+    <w:p>
+      <w:pPr>
+        <w:rPr>
+          <w:lang w:val="en-GB"/>
+        </w:rPr>
+      </w:pPr>
+    </w:p>
     <w:tbl>
       <w:tblPr>
         <w:tblStyle w:val="Grilledutableau"/>
@@ -24242,6 +24479,7 @@
               <w:rPr>
                 <w:smallCaps/>
               </w:rPr>
+              <w:lastRenderedPageBreak/>
               <w:t>Résultats</w:t>
             </w:r>
           </w:p>
@@ -24302,7 +24540,6 @@
             </w:pPr>
             <w:proofErr w:type="spellStart"/>
             <w:r>
-              <w:lastRenderedPageBreak/>
               <w:t>Notional</w:t>
             </w:r>
             <w:proofErr w:type="spellEnd"/>
@@ -26116,6 +26353,12 @@
                 <w:lang w:val="en-US"/>
               </w:rPr>
             </w:pPr>
+            <w:r>
+              <w:rPr>
+                <w:lang w:val="en-US"/>
+              </w:rPr>
+              <w:t>23.7</w:t>
+            </w:r>
           </w:p>
         </w:tc>
         <w:tc>
@@ -26150,6 +26393,12 @@
                 <w:lang w:val="en-US"/>
               </w:rPr>
             </w:pPr>
+            <w:r>
+              <w:rPr>
+                <w:lang w:val="en-US"/>
+              </w:rPr>
+              <w:t>0.00%</w:t>
+            </w:r>
           </w:p>
         </w:tc>
       </w:tr>
@@ -26269,6 +26518,12 @@
                 <w:lang w:val="en-US"/>
               </w:rPr>
             </w:pPr>
+            <w:r>
+              <w:rPr>
+                <w:lang w:val="en-US"/>
+              </w:rPr>
+              <w:t>6.67</w:t>
+            </w:r>
           </w:p>
         </w:tc>
         <w:tc>
@@ -26303,6 +26558,12 @@
                 <w:lang w:val="en-US"/>
               </w:rPr>
             </w:pPr>
+            <w:r>
+              <w:rPr>
+                <w:lang w:val="en-US"/>
+              </w:rPr>
+              <w:t>0.00%</w:t>
+            </w:r>
           </w:p>
         </w:tc>
       </w:tr>
@@ -27268,7 +27529,6 @@
                 <w:lang w:val="en-US"/>
               </w:rPr>
             </w:pPr>
-            <w:bookmarkStart w:id="26" w:name="_GoBack" w:colFirst="3" w:colLast="3"/>
             <w:r>
               <w:rPr>
                 <w:lang w:val="en-US"/>
@@ -27428,7 +27688,6 @@
           </w:p>
         </w:tc>
       </w:tr>
-      <w:bookmarkEnd w:id="26"/>
       <w:tr>
         <w:tc>
           <w:tcPr>
@@ -27534,6 +27793,12 @@
                 <w:lang w:val="en-US"/>
               </w:rPr>
             </w:pPr>
+            <w:r>
+              <w:rPr>
+                <w:lang w:val="en-US"/>
+              </w:rPr>
+              <w:t>777</w:t>
+            </w:r>
           </w:p>
         </w:tc>
         <w:tc>
@@ -27555,7 +27820,7 @@
                 <w:color w:val="C00000"/>
                 <w:lang w:val="en-US"/>
               </w:rPr>
-              <w:t>799</w:t>
+              <w:t>775</w:t>
             </w:r>
           </w:p>
         </w:tc>
@@ -27571,6 +27836,30 @@
                 <w:lang w:val="en-US"/>
               </w:rPr>
             </w:pPr>
+            <w:r>
+              <w:rPr>
+                <w:i/>
+                <w:color w:val="C00000"/>
+                <w:lang w:val="en-US"/>
+              </w:rPr>
+              <w:t>0.</w:t>
+            </w:r>
+            <w:r>
+              <w:rPr>
+                <w:i/>
+                <w:color w:val="C00000"/>
+                <w:lang w:val="en-US"/>
+              </w:rPr>
+              <w:t>26</w:t>
+            </w:r>
+            <w:r>
+              <w:rPr>
+                <w:i/>
+                <w:color w:val="C00000"/>
+                <w:lang w:val="en-US"/>
+              </w:rPr>
+              <w:t>%</w:t>
+            </w:r>
           </w:p>
         </w:tc>
       </w:tr>
@@ -27610,18 +27899,23 @@
           <w:lang w:val="en-GB"/>
         </w:rPr>
       </w:pPr>
+    </w:p>
+    <w:p>
+      <w:r>
+        <w:br w:type="page"/>
+      </w:r>
     </w:p>
     <w:tbl>
       <w:tblPr>
         <w:tblStyle w:val="Grilledutableau"/>
-        <w:tblW w:w="0" w:type="auto"/>
+        <w:tblW w:w="10369" w:type="dxa"/>
         <w:tblLook w:val="04A0" w:firstRow="1" w:lastRow="0" w:firstColumn="1" w:lastColumn="0" w:noHBand="0" w:noVBand="1"/>
       </w:tblPr>
       <w:tblGrid>
         <w:gridCol w:w="6637"/>
         <w:gridCol w:w="1397"/>
         <w:gridCol w:w="1384"/>
-        <w:gridCol w:w="776"/>
+        <w:gridCol w:w="951"/>
       </w:tblGrid>
       <w:tr>
         <w:tc>
@@ -27634,6 +27928,7 @@
               <w:rPr>
                 <w:smallCaps/>
               </w:rPr>
+              <w:lastRenderedPageBreak/>
               <w:t>Résultats</w:t>
             </w:r>
           </w:p>
@@ -27668,7 +27963,7 @@
         </w:tc>
         <w:tc>
           <w:tcPr>
-            <w:tcW w:w="776" w:type="dxa"/>
+            <w:tcW w:w="951" w:type="dxa"/>
             <w:shd w:val="clear" w:color="auto" w:fill="D9D9D9" w:themeFill="background1" w:themeFillShade="D9"/>
           </w:tcPr>
           <w:p>
@@ -27792,6 +28087,12 @@
                 <w:lang w:val="en-US"/>
               </w:rPr>
             </w:pPr>
+            <w:r>
+              <w:rPr>
+                <w:lang w:val="en-US"/>
+              </w:rPr>
+              <w:t>60.5</w:t>
+            </w:r>
           </w:p>
         </w:tc>
         <w:tc>
@@ -27807,19 +28108,33 @@
                 <w:lang w:val="en-US"/>
               </w:rPr>
             </w:pPr>
-          </w:p>
-        </w:tc>
-        <w:tc>
-          <w:tcPr>
-            <w:tcW w:w="776" w:type="dxa"/>
-          </w:tcPr>
-          <w:p>
-            <w:pPr>
-              <w:jc w:val="center"/>
-              <w:rPr>
-                <w:lang w:val="en-US"/>
-              </w:rPr>
-            </w:pPr>
+            <w:r>
+              <w:rPr>
+                <w:i/>
+                <w:color w:val="C00000"/>
+                <w:lang w:val="en-US"/>
+              </w:rPr>
+              <w:t>60.5</w:t>
+            </w:r>
+          </w:p>
+        </w:tc>
+        <w:tc>
+          <w:tcPr>
+            <w:tcW w:w="951" w:type="dxa"/>
+          </w:tcPr>
+          <w:p>
+            <w:pPr>
+              <w:jc w:val="center"/>
+              <w:rPr>
+                <w:lang w:val="en-US"/>
+              </w:rPr>
+            </w:pPr>
+            <w:r>
+              <w:rPr>
+                <w:lang w:val="en-US"/>
+              </w:rPr>
+              <w:t>0.00%</w:t>
+            </w:r>
           </w:p>
         </w:tc>
       </w:tr>
@@ -27934,6 +28249,12 @@
                 <w:lang w:val="en-US"/>
               </w:rPr>
             </w:pPr>
+            <w:r>
+              <w:rPr>
+                <w:lang w:val="en-US"/>
+              </w:rPr>
+              <w:t>189</w:t>
+            </w:r>
           </w:p>
         </w:tc>
         <w:tc>
@@ -27949,588 +28270,33 @@
                 <w:lang w:val="en-US"/>
               </w:rPr>
             </w:pPr>
-          </w:p>
-        </w:tc>
-        <w:tc>
-          <w:tcPr>
-            <w:tcW w:w="776" w:type="dxa"/>
-          </w:tcPr>
-          <w:p>
-            <w:pPr>
-              <w:jc w:val="center"/>
-              <w:rPr>
-                <w:lang w:val="en-US"/>
-              </w:rPr>
-            </w:pPr>
-          </w:p>
-        </w:tc>
-      </w:tr>
-      <w:tr>
-        <w:tc>
-          <w:tcPr>
-            <w:tcW w:w="6637" w:type="dxa"/>
-            <w:vAlign w:val="center"/>
-          </w:tcPr>
-          <w:p>
-            <w:pPr>
-              <w:tabs>
-                <w:tab w:val="right" w:pos="4997"/>
-              </w:tabs>
-              <w:jc w:val="left"/>
-              <w:rPr>
-                <w:lang w:val="en-US"/>
-              </w:rPr>
-            </w:pPr>
-            <w:r>
-              <w:rPr>
-                <w:lang w:val="en-US"/>
-              </w:rPr>
-              <w:t>Shear force</w:t>
-            </w:r>
-            <w:r>
-              <w:rPr>
-                <w:lang w:val="en-US"/>
-              </w:rPr>
-              <w:t xml:space="preserve"> : </w:t>
-            </w:r>
-            <m:oMath>
-              <m:r>
-                <w:rPr>
-                  <w:rFonts w:ascii="Cambria Math" w:hAnsi="Cambria Math"/>
-                </w:rPr>
-                <m:t>V</m:t>
-              </m:r>
-              <m:r>
-                <w:rPr>
-                  <w:rFonts w:ascii="Cambria Math" w:hAnsi="Cambria Math"/>
-                  <w:lang w:val="en-US"/>
-                </w:rPr>
-                <m:t>(</m:t>
-              </m:r>
-              <m:sSub>
-                <m:sSubPr>
-                  <m:ctrlPr>
-                    <w:rPr>
-                      <w:rFonts w:ascii="Cambria Math" w:hAnsi="Cambria Math"/>
-                      <w:i/>
-                    </w:rPr>
-                  </m:ctrlPr>
-                </m:sSubPr>
-                <m:e>
-                  <m:r>
-                    <w:rPr>
-                      <w:rFonts w:ascii="Cambria Math" w:hAnsi="Cambria Math"/>
-                    </w:rPr>
-                    <m:t>G</m:t>
-                  </m:r>
-                </m:e>
-                <m:sub>
-                  <m:r>
-                    <w:rPr>
-                      <w:rFonts w:ascii="Cambria Math" w:hAnsi="Cambria Math"/>
-                      <w:lang w:val="en-US"/>
-                    </w:rPr>
-                    <m:t>2</m:t>
-                  </m:r>
-                </m:sub>
-              </m:sSub>
-              <m:r>
-                <w:rPr>
-                  <w:rFonts w:ascii="Cambria Math" w:hAnsi="Cambria Math"/>
-                  <w:lang w:val="en-US"/>
-                </w:rPr>
-                <m:t>)=</m:t>
-              </m:r>
-            </m:oMath>
-            <w:r>
-              <w:rPr>
-                <w:lang w:val="en-US"/>
-              </w:rPr>
-              <w:tab/>
-              <w:t>(</w:t>
-            </w:r>
-            <w:proofErr w:type="spellStart"/>
-            <w:r>
-              <w:rPr>
-                <w:lang w:val="en-US"/>
-              </w:rPr>
-              <w:t>kN</w:t>
-            </w:r>
-            <w:proofErr w:type="spellEnd"/>
-            <w:r>
-              <w:rPr>
-                <w:lang w:val="en-US"/>
-              </w:rPr>
-              <w:t>)</w:t>
-            </w:r>
-          </w:p>
-        </w:tc>
-        <w:tc>
-          <w:tcPr>
-            <w:tcW w:w="1397" w:type="dxa"/>
-          </w:tcPr>
-          <w:p>
-            <w:pPr>
-              <w:jc w:val="center"/>
-              <w:rPr>
-                <w:lang w:val="en-US"/>
-              </w:rPr>
-            </w:pPr>
-          </w:p>
-        </w:tc>
-        <w:tc>
-          <w:tcPr>
-            <w:tcW w:w="1384" w:type="dxa"/>
-          </w:tcPr>
-          <w:p>
-            <w:pPr>
-              <w:jc w:val="center"/>
+            <w:r>
               <w:rPr>
                 <w:i/>
                 <w:color w:val="C00000"/>
                 <w:lang w:val="en-US"/>
               </w:rPr>
-            </w:pPr>
-          </w:p>
-        </w:tc>
-        <w:tc>
-          <w:tcPr>
-            <w:tcW w:w="776" w:type="dxa"/>
-          </w:tcPr>
-          <w:p>
-            <w:pPr>
-              <w:jc w:val="center"/>
-              <w:rPr>
-                <w:lang w:val="en-US"/>
-              </w:rPr>
-            </w:pPr>
-          </w:p>
-        </w:tc>
-      </w:tr>
-      <w:tr>
-        <w:tc>
-          <w:tcPr>
-            <w:tcW w:w="6637" w:type="dxa"/>
-            <w:vAlign w:val="center"/>
-          </w:tcPr>
-          <w:p>
-            <w:pPr>
-              <w:tabs>
-                <w:tab w:val="right" w:pos="4997"/>
-              </w:tabs>
-              <w:jc w:val="left"/>
-              <w:rPr>
-                <w:lang w:val="en-US"/>
-              </w:rPr>
-            </w:pPr>
-            <w:r>
-              <w:rPr>
-                <w:lang w:val="en-US"/>
-              </w:rPr>
-              <w:t>Bending moment</w:t>
-            </w:r>
-            <w:r>
-              <w:rPr>
-                <w:lang w:val="en-US"/>
-              </w:rPr>
-              <w:t xml:space="preserve"> : </w:t>
-            </w:r>
-            <m:oMath>
-              <m:r>
-                <w:rPr>
-                  <w:rFonts w:ascii="Cambria Math" w:hAnsi="Cambria Math"/>
-                </w:rPr>
-                <m:t>M</m:t>
-              </m:r>
-              <m:r>
-                <w:rPr>
-                  <w:rFonts w:ascii="Cambria Math" w:hAnsi="Cambria Math"/>
-                  <w:lang w:val="en-US"/>
-                </w:rPr>
-                <m:t>(</m:t>
-              </m:r>
-              <m:sSub>
-                <m:sSubPr>
-                  <m:ctrlPr>
-                    <w:rPr>
-                      <w:rFonts w:ascii="Cambria Math" w:hAnsi="Cambria Math"/>
-                      <w:i/>
-                    </w:rPr>
-                  </m:ctrlPr>
-                </m:sSubPr>
-                <m:e>
-                  <m:r>
-                    <w:rPr>
-                      <w:rFonts w:ascii="Cambria Math" w:hAnsi="Cambria Math"/>
-                    </w:rPr>
-                    <m:t>G</m:t>
-                  </m:r>
-                </m:e>
-                <m:sub>
-                  <m:r>
-                    <w:rPr>
-                      <w:rFonts w:ascii="Cambria Math" w:hAnsi="Cambria Math"/>
-                      <w:lang w:val="en-US"/>
-                    </w:rPr>
-                    <m:t>2</m:t>
-                  </m:r>
-                </m:sub>
-              </m:sSub>
-              <m:r>
-                <w:rPr>
-                  <w:rFonts w:ascii="Cambria Math" w:hAnsi="Cambria Math"/>
-                  <w:lang w:val="en-US"/>
-                </w:rPr>
-                <m:t>)=</m:t>
-              </m:r>
-            </m:oMath>
-            <w:r>
-              <w:rPr>
-                <w:lang w:val="en-US"/>
-              </w:rPr>
-              <w:tab/>
-              <w:t>(</w:t>
-            </w:r>
-            <w:proofErr w:type="spellStart"/>
-            <w:r>
-              <w:rPr>
-                <w:lang w:val="en-US"/>
-              </w:rPr>
-              <w:t>kN.m</w:t>
-            </w:r>
-            <w:proofErr w:type="spellEnd"/>
-            <w:r>
-              <w:rPr>
-                <w:lang w:val="en-US"/>
-              </w:rPr>
-              <w:t>)</w:t>
-            </w:r>
-          </w:p>
-        </w:tc>
-        <w:tc>
-          <w:tcPr>
-            <w:tcW w:w="1397" w:type="dxa"/>
-          </w:tcPr>
-          <w:p>
-            <w:pPr>
-              <w:jc w:val="center"/>
-              <w:rPr>
-                <w:lang w:val="en-US"/>
-              </w:rPr>
-            </w:pPr>
-          </w:p>
-        </w:tc>
-        <w:tc>
-          <w:tcPr>
-            <w:tcW w:w="1384" w:type="dxa"/>
-          </w:tcPr>
-          <w:p>
-            <w:pPr>
-              <w:jc w:val="center"/>
-              <w:rPr>
-                <w:i/>
-                <w:color w:val="C00000"/>
-                <w:lang w:val="en-US"/>
-              </w:rPr>
-            </w:pPr>
-          </w:p>
-        </w:tc>
-        <w:tc>
-          <w:tcPr>
-            <w:tcW w:w="776" w:type="dxa"/>
-          </w:tcPr>
-          <w:p>
-            <w:pPr>
-              <w:jc w:val="center"/>
-              <w:rPr>
-                <w:lang w:val="en-US"/>
-              </w:rPr>
-            </w:pPr>
-          </w:p>
-        </w:tc>
-      </w:tr>
-      <w:tr>
-        <w:tc>
-          <w:tcPr>
-            <w:tcW w:w="6637" w:type="dxa"/>
-            <w:vAlign w:val="center"/>
-          </w:tcPr>
-          <w:p>
-            <w:pPr>
-              <w:tabs>
-                <w:tab w:val="right" w:pos="4997"/>
-              </w:tabs>
-              <w:jc w:val="left"/>
-              <w:rPr>
-                <w:lang w:val="en-US"/>
-              </w:rPr>
-            </w:pPr>
-            <w:r>
-              <w:rPr>
-                <w:lang w:val="en-US"/>
-              </w:rPr>
-              <w:lastRenderedPageBreak/>
-              <w:t>Shear force</w:t>
-            </w:r>
-            <w:r>
-              <w:rPr>
-                <w:lang w:val="en-US"/>
-              </w:rPr>
-              <w:t xml:space="preserve"> : </w:t>
-            </w:r>
-            <m:oMath>
-              <m:r>
-                <w:rPr>
-                  <w:rFonts w:ascii="Cambria Math" w:hAnsi="Cambria Math"/>
-                </w:rPr>
-                <m:t>V</m:t>
-              </m:r>
-              <m:r>
-                <w:rPr>
-                  <w:rFonts w:ascii="Cambria Math" w:hAnsi="Cambria Math"/>
-                  <w:lang w:val="en-US"/>
-                </w:rPr>
-                <m:t>(</m:t>
-              </m:r>
-              <m:sSub>
-                <m:sSubPr>
-                  <m:ctrlPr>
-                    <w:rPr>
-                      <w:rFonts w:ascii="Cambria Math" w:hAnsi="Cambria Math"/>
-                      <w:i/>
-                    </w:rPr>
-                  </m:ctrlPr>
-                </m:sSubPr>
-                <m:e>
-                  <m:r>
-                    <w:rPr>
-                      <w:rFonts w:ascii="Cambria Math" w:hAnsi="Cambria Math"/>
-                    </w:rPr>
-                    <m:t>Q</m:t>
-                  </m:r>
-                </m:e>
-                <m:sub>
-                  <m:r>
-                    <w:rPr>
-                      <w:rFonts w:ascii="Cambria Math" w:hAnsi="Cambria Math"/>
-                      <w:lang w:val="en-US"/>
-                    </w:rPr>
-                    <m:t>1</m:t>
-                  </m:r>
-                </m:sub>
-              </m:sSub>
-              <m:r>
-                <w:rPr>
-                  <w:rFonts w:ascii="Cambria Math" w:hAnsi="Cambria Math"/>
-                  <w:lang w:val="en-US"/>
-                </w:rPr>
-                <m:t>)=</m:t>
-              </m:r>
-            </m:oMath>
-            <w:r>
-              <w:rPr>
-                <w:lang w:val="en-US"/>
-              </w:rPr>
-              <w:tab/>
-              <w:t>(</w:t>
-            </w:r>
-            <w:proofErr w:type="spellStart"/>
-            <w:r>
-              <w:rPr>
-                <w:lang w:val="en-US"/>
-              </w:rPr>
-              <w:t>kN</w:t>
-            </w:r>
-            <w:proofErr w:type="spellEnd"/>
-            <w:r>
-              <w:rPr>
-                <w:lang w:val="en-US"/>
-              </w:rPr>
-              <w:t>)</w:t>
-            </w:r>
-          </w:p>
-        </w:tc>
-        <w:tc>
-          <w:tcPr>
-            <w:tcW w:w="1397" w:type="dxa"/>
-          </w:tcPr>
-          <w:p>
-            <w:pPr>
-              <w:jc w:val="center"/>
-              <w:rPr>
-                <w:lang w:val="en-US"/>
-              </w:rPr>
-            </w:pPr>
-          </w:p>
-        </w:tc>
-        <w:tc>
-          <w:tcPr>
-            <w:tcW w:w="1384" w:type="dxa"/>
-          </w:tcPr>
-          <w:p>
-            <w:pPr>
-              <w:jc w:val="center"/>
-              <w:rPr>
-                <w:i/>
-                <w:color w:val="C00000"/>
-                <w:lang w:val="en-US"/>
-              </w:rPr>
-            </w:pPr>
-          </w:p>
-        </w:tc>
-        <w:tc>
-          <w:tcPr>
-            <w:tcW w:w="776" w:type="dxa"/>
-          </w:tcPr>
-          <w:p>
-            <w:pPr>
-              <w:jc w:val="center"/>
-              <w:rPr>
-                <w:lang w:val="en-US"/>
-              </w:rPr>
-            </w:pPr>
-          </w:p>
-        </w:tc>
-      </w:tr>
-      <w:tr>
-        <w:tc>
-          <w:tcPr>
-            <w:tcW w:w="6637" w:type="dxa"/>
-            <w:vAlign w:val="center"/>
-          </w:tcPr>
-          <w:p>
-            <w:pPr>
-              <w:tabs>
-                <w:tab w:val="right" w:pos="4997"/>
-              </w:tabs>
-              <w:jc w:val="left"/>
-              <w:rPr>
-                <w:lang w:val="en-US"/>
-              </w:rPr>
-            </w:pPr>
-            <w:r>
-              <w:rPr>
-                <w:lang w:val="en-US"/>
-              </w:rPr>
-              <w:t>Bending moment</w:t>
-            </w:r>
-            <w:r>
-              <w:rPr>
-                <w:lang w:val="en-US"/>
-              </w:rPr>
-              <w:t xml:space="preserve"> : </w:t>
-            </w:r>
-            <m:oMath>
-              <m:r>
-                <w:rPr>
-                  <w:rFonts w:ascii="Cambria Math" w:hAnsi="Cambria Math"/>
-                </w:rPr>
-                <m:t>M</m:t>
-              </m:r>
-              <m:r>
-                <w:rPr>
-                  <w:rFonts w:ascii="Cambria Math" w:hAnsi="Cambria Math"/>
-                  <w:lang w:val="en-US"/>
-                </w:rPr>
-                <m:t>(</m:t>
-              </m:r>
-              <m:sSub>
-                <m:sSubPr>
-                  <m:ctrlPr>
-                    <w:rPr>
-                      <w:rFonts w:ascii="Cambria Math" w:hAnsi="Cambria Math"/>
-                      <w:i/>
-                    </w:rPr>
-                  </m:ctrlPr>
-                </m:sSubPr>
-                <m:e>
-                  <m:r>
-                    <w:rPr>
-                      <w:rFonts w:ascii="Cambria Math" w:hAnsi="Cambria Math"/>
-                    </w:rPr>
-                    <m:t>Q</m:t>
-                  </m:r>
-                </m:e>
-                <m:sub>
-                  <m:r>
-                    <w:rPr>
-                      <w:rFonts w:ascii="Cambria Math" w:hAnsi="Cambria Math"/>
-                      <w:lang w:val="en-US"/>
-                    </w:rPr>
-                    <m:t>1</m:t>
-                  </m:r>
-                </m:sub>
-              </m:sSub>
-              <m:r>
-                <w:rPr>
-                  <w:rFonts w:ascii="Cambria Math" w:hAnsi="Cambria Math"/>
-                  <w:lang w:val="en-US"/>
-                </w:rPr>
-                <m:t>)=</m:t>
-              </m:r>
-            </m:oMath>
-            <w:r>
-              <w:rPr>
-                <w:lang w:val="en-US"/>
-              </w:rPr>
-              <w:tab/>
-              <w:t>(</w:t>
-            </w:r>
-            <w:proofErr w:type="spellStart"/>
-            <w:r>
-              <w:rPr>
-                <w:lang w:val="en-US"/>
-              </w:rPr>
-              <w:t>kN.m</w:t>
-            </w:r>
-            <w:proofErr w:type="spellEnd"/>
-            <w:r>
-              <w:rPr>
-                <w:lang w:val="en-US"/>
-              </w:rPr>
-              <w:t>)</w:t>
-            </w:r>
-          </w:p>
-        </w:tc>
-        <w:tc>
-          <w:tcPr>
-            <w:tcW w:w="1397" w:type="dxa"/>
-          </w:tcPr>
-          <w:p>
-            <w:pPr>
-              <w:jc w:val="center"/>
-              <w:rPr>
-                <w:lang w:val="en-US"/>
-              </w:rPr>
-            </w:pPr>
-          </w:p>
-        </w:tc>
-        <w:tc>
-          <w:tcPr>
-            <w:tcW w:w="1384" w:type="dxa"/>
-          </w:tcPr>
-          <w:p>
-            <w:pPr>
-              <w:jc w:val="center"/>
-              <w:rPr>
-                <w:i/>
-                <w:color w:val="C00000"/>
-                <w:lang w:val="en-US"/>
-              </w:rPr>
-            </w:pPr>
-          </w:p>
-        </w:tc>
-        <w:tc>
-          <w:tcPr>
-            <w:tcW w:w="776" w:type="dxa"/>
-          </w:tcPr>
-          <w:p>
-            <w:pPr>
-              <w:jc w:val="center"/>
-              <w:rPr>
-                <w:lang w:val="en-US"/>
-              </w:rPr>
-            </w:pPr>
+              <w:t>189</w:t>
+            </w:r>
+          </w:p>
+        </w:tc>
+        <w:tc>
+          <w:tcPr>
+            <w:tcW w:w="951" w:type="dxa"/>
+          </w:tcPr>
+          <w:p>
+            <w:pPr>
+              <w:jc w:val="center"/>
+              <w:rPr>
+                <w:lang w:val="en-US"/>
+              </w:rPr>
+            </w:pPr>
+            <w:r>
+              <w:rPr>
+                <w:lang w:val="en-US"/>
+              </w:rPr>
+              <w:t>0.00%</w:t>
+            </w:r>
           </w:p>
         </w:tc>
       </w:tr>
@@ -28645,6 +28411,12 @@
                 <w:lang w:val="en-US"/>
               </w:rPr>
             </w:pPr>
+            <w:r>
+              <w:rPr>
+                <w:lang w:val="en-US"/>
+              </w:rPr>
+              <w:t>13.3</w:t>
+            </w:r>
           </w:p>
         </w:tc>
         <w:tc>
@@ -28660,19 +28432,41 @@
                 <w:lang w:val="en-US"/>
               </w:rPr>
             </w:pPr>
-          </w:p>
-        </w:tc>
-        <w:tc>
-          <w:tcPr>
-            <w:tcW w:w="776" w:type="dxa"/>
-          </w:tcPr>
-          <w:p>
-            <w:pPr>
-              <w:jc w:val="center"/>
-              <w:rPr>
-                <w:lang w:val="en-US"/>
-              </w:rPr>
-            </w:pPr>
+            <w:r>
+              <w:rPr>
+                <w:i/>
+                <w:color w:val="C00000"/>
+                <w:lang w:val="en-US"/>
+              </w:rPr>
+              <w:t>13.</w:t>
+            </w:r>
+            <w:r>
+              <w:rPr>
+                <w:i/>
+                <w:color w:val="C00000"/>
+                <w:lang w:val="en-US"/>
+              </w:rPr>
+              <w:t>3</w:t>
+            </w:r>
+          </w:p>
+        </w:tc>
+        <w:tc>
+          <w:tcPr>
+            <w:tcW w:w="951" w:type="dxa"/>
+          </w:tcPr>
+          <w:p>
+            <w:pPr>
+              <w:jc w:val="center"/>
+              <w:rPr>
+                <w:lang w:val="en-US"/>
+              </w:rPr>
+            </w:pPr>
+            <w:r>
+              <w:rPr>
+                <w:lang w:val="en-US"/>
+              </w:rPr>
+              <w:t>0.00%</w:t>
+            </w:r>
           </w:p>
         </w:tc>
       </w:tr>
@@ -28787,6 +28581,12 @@
                 <w:lang w:val="en-US"/>
               </w:rPr>
             </w:pPr>
+            <w:r>
+              <w:rPr>
+                <w:lang w:val="en-US"/>
+              </w:rPr>
+              <w:t>45.3</w:t>
+            </w:r>
           </w:p>
         </w:tc>
         <w:tc>
@@ -28802,11 +28602,27 @@
                 <w:lang w:val="en-US"/>
               </w:rPr>
             </w:pPr>
-          </w:p>
-        </w:tc>
-        <w:tc>
-          <w:tcPr>
-            <w:tcW w:w="776" w:type="dxa"/>
+            <w:r>
+              <w:rPr>
+                <w:i/>
+                <w:color w:val="C00000"/>
+                <w:lang w:val="en-US"/>
+              </w:rPr>
+              <w:t>45</w:t>
+            </w:r>
+            <w:r>
+              <w:rPr>
+                <w:i/>
+                <w:color w:val="C00000"/>
+                <w:lang w:val="en-US"/>
+              </w:rPr>
+              <w:t>.4</w:t>
+            </w:r>
+          </w:p>
+        </w:tc>
+        <w:tc>
+          <w:tcPr>
+            <w:tcW w:w="951" w:type="dxa"/>
             <w:vAlign w:val="center"/>
           </w:tcPr>
           <w:p>
@@ -28816,6 +28632,38 @@
                 <w:lang w:val="en-US"/>
               </w:rPr>
             </w:pPr>
+            <w:r>
+              <w:rPr>
+                <w:i/>
+                <w:color w:val="C00000"/>
+                <w:lang w:val="en-US"/>
+              </w:rPr>
+              <w:t>-</w:t>
+            </w:r>
+            <w:r>
+              <w:rPr>
+                <w:i/>
+                <w:color w:val="C00000"/>
+                <w:lang w:val="en-US"/>
+              </w:rPr>
+              <w:t>0.2</w:t>
+            </w:r>
+            <w:r>
+              <w:rPr>
+                <w:i/>
+                <w:color w:val="C00000"/>
+                <w:lang w:val="en-US"/>
+              </w:rPr>
+              <w:t>2</w:t>
+            </w:r>
+            <w:r>
+              <w:rPr>
+                <w:i/>
+                <w:color w:val="C00000"/>
+                <w:lang w:val="en-US"/>
+              </w:rPr>
+              <w:t>%</w:t>
+            </w:r>
           </w:p>
         </w:tc>
       </w:tr>
@@ -28859,14 +28707,14 @@
     <w:tbl>
       <w:tblPr>
         <w:tblStyle w:val="Grilledutableau"/>
-        <w:tblW w:w="0" w:type="auto"/>
+        <w:tblW w:w="10369" w:type="dxa"/>
         <w:tblLook w:val="04A0" w:firstRow="1" w:lastRow="0" w:firstColumn="1" w:lastColumn="0" w:noHBand="0" w:noVBand="1"/>
       </w:tblPr>
       <w:tblGrid>
         <w:gridCol w:w="6637"/>
         <w:gridCol w:w="1397"/>
         <w:gridCol w:w="1384"/>
-        <w:gridCol w:w="776"/>
+        <w:gridCol w:w="951"/>
       </w:tblGrid>
       <w:tr>
         <w:tc>
@@ -28913,7 +28761,7 @@
         </w:tc>
         <w:tc>
           <w:tcPr>
-            <w:tcW w:w="776" w:type="dxa"/>
+            <w:tcW w:w="951" w:type="dxa"/>
             <w:shd w:val="clear" w:color="auto" w:fill="D9D9D9" w:themeFill="background1" w:themeFillShade="D9"/>
           </w:tcPr>
           <w:p>
@@ -29020,6 +28868,12 @@
                 <w:lang w:val="en-US"/>
               </w:rPr>
             </w:pPr>
+            <w:r>
+              <w:rPr>
+                <w:lang w:val="en-US"/>
+              </w:rPr>
+              <w:t>0.42</w:t>
+            </w:r>
           </w:p>
         </w:tc>
         <w:tc>
@@ -29035,11 +28889,19 @@
                 <w:lang w:val="en-US"/>
               </w:rPr>
             </w:pPr>
-          </w:p>
-        </w:tc>
-        <w:tc>
-          <w:tcPr>
-            <w:tcW w:w="776" w:type="dxa"/>
+            <w:r>
+              <w:rPr>
+                <w:i/>
+                <w:color w:val="C00000"/>
+                <w:lang w:val="en-US"/>
+              </w:rPr>
+              <w:t>0.42</w:t>
+            </w:r>
+          </w:p>
+        </w:tc>
+        <w:tc>
+          <w:tcPr>
+            <w:tcW w:w="951" w:type="dxa"/>
             <w:vAlign w:val="center"/>
           </w:tcPr>
           <w:p>
@@ -29049,6 +28911,12 @@
                 <w:lang w:val="en-US"/>
               </w:rPr>
             </w:pPr>
+            <w:r>
+              <w:rPr>
+                <w:lang w:val="en-US"/>
+              </w:rPr>
+              <w:t>0.00%</w:t>
+            </w:r>
           </w:p>
         </w:tc>
       </w:tr>
@@ -29146,6 +29014,18 @@
                 <w:lang w:val="en-US"/>
               </w:rPr>
             </w:pPr>
+            <w:r>
+              <w:rPr>
+                <w:lang w:val="en-US"/>
+              </w:rPr>
+              <w:t>0.1</w:t>
+            </w:r>
+            <w:r>
+              <w:rPr>
+                <w:lang w:val="en-US"/>
+              </w:rPr>
+              <w:t>0</w:t>
+            </w:r>
           </w:p>
         </w:tc>
         <w:tc>
@@ -29161,11 +29041,27 @@
                 <w:lang w:val="en-US"/>
               </w:rPr>
             </w:pPr>
-          </w:p>
-        </w:tc>
-        <w:tc>
-          <w:tcPr>
-            <w:tcW w:w="776" w:type="dxa"/>
+            <w:r>
+              <w:rPr>
+                <w:i/>
+                <w:color w:val="C00000"/>
+                <w:lang w:val="en-US"/>
+              </w:rPr>
+              <w:t>0.1</w:t>
+            </w:r>
+            <w:r>
+              <w:rPr>
+                <w:i/>
+                <w:color w:val="C00000"/>
+                <w:lang w:val="en-US"/>
+              </w:rPr>
+              <w:t>0</w:t>
+            </w:r>
+          </w:p>
+        </w:tc>
+        <w:tc>
+          <w:tcPr>
+            <w:tcW w:w="951" w:type="dxa"/>
             <w:vAlign w:val="center"/>
           </w:tcPr>
           <w:p>
@@ -29175,8 +29071,16 @@
                 <w:lang w:val="en-US"/>
               </w:rPr>
             </w:pPr>
-          </w:p>
-        </w:tc>
+            <w:r>
+              <w:rPr>
+                <w:lang w:val="en-US"/>
+              </w:rPr>
+              <w:t>0.00%</w:t>
+            </w:r>
+          </w:p>
+        </w:tc>
+        <w:bookmarkStart w:id="29" w:name="_GoBack"/>
+        <w:bookmarkEnd w:id="29"/>
       </w:tr>
       <w:tr>
         <w:tc>
@@ -29272,6 +29176,12 @@
                 <w:lang w:val="en-US"/>
               </w:rPr>
             </w:pPr>
+            <w:r>
+              <w:rPr>
+                <w:lang w:val="en-US"/>
+              </w:rPr>
+              <w:t>0.42</w:t>
+            </w:r>
           </w:p>
         </w:tc>
         <w:tc>
@@ -29287,11 +29197,19 @@
                 <w:lang w:val="en-US"/>
               </w:rPr>
             </w:pPr>
-          </w:p>
-        </w:tc>
-        <w:tc>
-          <w:tcPr>
-            <w:tcW w:w="776" w:type="dxa"/>
+            <w:r>
+              <w:rPr>
+                <w:i/>
+                <w:color w:val="C00000"/>
+                <w:lang w:val="en-US"/>
+              </w:rPr>
+              <w:t>0.42</w:t>
+            </w:r>
+          </w:p>
+        </w:tc>
+        <w:tc>
+          <w:tcPr>
+            <w:tcW w:w="951" w:type="dxa"/>
             <w:vAlign w:val="center"/>
           </w:tcPr>
           <w:p>
@@ -29301,6 +29219,12 @@
                 <w:lang w:val="en-US"/>
               </w:rPr>
             </w:pPr>
+            <w:r>
+              <w:rPr>
+                <w:lang w:val="en-US"/>
+              </w:rPr>
+              <w:t>0.00%</w:t>
+            </w:r>
           </w:p>
         </w:tc>
       </w:tr>
@@ -29324,83 +29248,7 @@
               <w:rPr>
                 <w:lang w:val="en-US"/>
               </w:rPr>
-              <w:t xml:space="preserve">Degree of shear connection : </w:t>
-            </w:r>
-            <m:oMath>
-              <m:r>
-                <w:rPr>
-                  <w:rFonts w:ascii="Cambria Math" w:hAnsi="Cambria Math"/>
-                  <w:lang w:val="en-US"/>
-                </w:rPr>
-                <m:t>η=</m:t>
-              </m:r>
-            </m:oMath>
-          </w:p>
-        </w:tc>
-        <w:tc>
-          <w:tcPr>
-            <w:tcW w:w="1397" w:type="dxa"/>
-          </w:tcPr>
-          <w:p>
-            <w:pPr>
-              <w:jc w:val="center"/>
-              <w:rPr>
-                <w:lang w:val="en-US"/>
-              </w:rPr>
-            </w:pPr>
-          </w:p>
-        </w:tc>
-        <w:tc>
-          <w:tcPr>
-            <w:tcW w:w="1384" w:type="dxa"/>
-          </w:tcPr>
-          <w:p>
-            <w:pPr>
-              <w:jc w:val="center"/>
-              <w:rPr>
-                <w:i/>
-                <w:color w:val="C00000"/>
-                <w:lang w:val="en-US"/>
-              </w:rPr>
-            </w:pPr>
-          </w:p>
-        </w:tc>
-        <w:tc>
-          <w:tcPr>
-            <w:tcW w:w="776" w:type="dxa"/>
-            <w:vAlign w:val="center"/>
-          </w:tcPr>
-          <w:p>
-            <w:pPr>
-              <w:jc w:val="center"/>
-              <w:rPr>
-                <w:lang w:val="en-US"/>
-              </w:rPr>
-            </w:pPr>
-          </w:p>
-        </w:tc>
-      </w:tr>
-      <w:tr>
-        <w:tc>
-          <w:tcPr>
-            <w:tcW w:w="6637" w:type="dxa"/>
-            <w:vAlign w:val="center"/>
-          </w:tcPr>
-          <w:p>
-            <w:pPr>
-              <w:tabs>
-                <w:tab w:val="right" w:pos="4997"/>
-              </w:tabs>
-              <w:jc w:val="left"/>
-              <w:rPr>
-                <w:lang w:val="en-US"/>
-              </w:rPr>
-            </w:pPr>
-            <w:r>
-              <w:rPr>
-                <w:lang w:val="en-US"/>
-              </w:rPr>
-              <w:t xml:space="preserve">Minimum degree of connection : </w:t>
+              <w:t xml:space="preserve">Critical moment to lateral torsional buckling : </w:t>
             </w:r>
             <m:oMath>
               <m:sSub>
@@ -29419,7 +29267,7 @@
                       <w:rFonts w:ascii="Cambria Math" w:hAnsi="Cambria Math"/>
                       <w:lang w:val="en-US"/>
                     </w:rPr>
-                    <m:t>η</m:t>
+                    <m:t>M</m:t>
                   </m:r>
                 </m:e>
                 <m:sub>
@@ -29431,18 +29279,31 @@
                       <w:rFonts w:ascii="Cambria Math" w:hAnsi="Cambria Math"/>
                       <w:lang w:val="en-US"/>
                     </w:rPr>
-                    <m:t>min</m:t>
+                    <m:t>cr</m:t>
                   </m:r>
                 </m:sub>
               </m:sSub>
-              <m:r>
-                <w:rPr>
-                  <w:rFonts w:ascii="Cambria Math" w:hAnsi="Cambria Math"/>
-                  <w:lang w:val="en-US"/>
-                </w:rPr>
-                <m:t>=</m:t>
-              </m:r>
             </m:oMath>
+            <w:r>
+              <w:rPr>
+                <w:lang w:val="en-US"/>
+              </w:rPr>
+              <w:t xml:space="preserve"> (</w:t>
+            </w:r>
+            <w:proofErr w:type="spellStart"/>
+            <w:r>
+              <w:rPr>
+                <w:lang w:val="en-US"/>
+              </w:rPr>
+              <w:t>kN.m</w:t>
+            </w:r>
+            <w:proofErr w:type="spellEnd"/>
+            <w:r>
+              <w:rPr>
+                <w:lang w:val="en-US"/>
+              </w:rPr>
+              <w:t>)</w:t>
+            </w:r>
           </w:p>
         </w:tc>
         <w:tc>
@@ -29456,6 +29317,12 @@
                 <w:lang w:val="en-US"/>
               </w:rPr>
             </w:pPr>
+            <w:r>
+              <w:rPr>
+                <w:lang w:val="en-US"/>
+              </w:rPr>
+              <w:t>903</w:t>
+            </w:r>
           </w:p>
         </w:tc>
         <w:tc>
@@ -29471,11 +29338,19 @@
                 <w:lang w:val="en-US"/>
               </w:rPr>
             </w:pPr>
-          </w:p>
-        </w:tc>
-        <w:tc>
-          <w:tcPr>
-            <w:tcW w:w="776" w:type="dxa"/>
+            <w:r>
+              <w:rPr>
+                <w:i/>
+                <w:color w:val="C00000"/>
+                <w:lang w:val="en-US"/>
+              </w:rPr>
+              <w:t>914</w:t>
+            </w:r>
+          </w:p>
+        </w:tc>
+        <w:tc>
+          <w:tcPr>
+            <w:tcW w:w="951" w:type="dxa"/>
             <w:vAlign w:val="center"/>
           </w:tcPr>
           <w:p>
@@ -29485,6 +29360,22 @@
                 <w:lang w:val="en-US"/>
               </w:rPr>
             </w:pPr>
+            <w:r>
+              <w:rPr>
+                <w:i/>
+                <w:color w:val="C00000"/>
+                <w:lang w:val="en-US"/>
+              </w:rPr>
+              <w:t>-1.20</w:t>
+            </w:r>
+            <w:r>
+              <w:rPr>
+                <w:i/>
+                <w:color w:val="C00000"/>
+                <w:lang w:val="en-US"/>
+              </w:rPr>
+              <w:t>%</w:t>
+            </w:r>
           </w:p>
         </w:tc>
       </w:tr>
@@ -29508,13 +29399,19 @@
               <w:rPr>
                 <w:lang w:val="en-US"/>
               </w:rPr>
-              <w:t xml:space="preserve">Longitudinal shear force </w:t>
-            </w:r>
-            <w:r>
-              <w:rPr>
-                <w:lang w:val="en-US"/>
-              </w:rPr>
-              <w:t xml:space="preserve">: </w:t>
+              <w:t xml:space="preserve">Resistance to </w:t>
+            </w:r>
+            <w:r>
+              <w:rPr>
+                <w:lang w:val="en-US"/>
+              </w:rPr>
+              <w:t>lateral torsional buckling</w:t>
+            </w:r>
+            <w:r>
+              <w:rPr>
+                <w:lang w:val="en-US"/>
+              </w:rPr>
+              <w:t xml:space="preserve"> : </w:t>
             </w:r>
             <m:oMath>
               <m:sSub>
@@ -29528,260 +29425,17 @@
                 </m:sSubPr>
                 <m:e>
                   <m:r>
-                    <w:rPr>
-                      <w:rFonts w:ascii="Cambria Math" w:hAnsi="Cambria Math"/>
-                    </w:rPr>
-                    <m:t>τ</m:t>
-                  </m:r>
-                </m:e>
-                <m:sub>
-                  <m:r>
-                    <m:rPr>
-                      <m:sty m:val="p"/>
-                    </m:rPr>
-                    <w:rPr>
-                      <w:rFonts w:ascii="Cambria Math" w:hAnsi="Cambria Math"/>
-                      <w:lang w:val="en-US"/>
-                    </w:rPr>
-                    <m:t>Ed</m:t>
-                  </m:r>
-                </m:sub>
-              </m:sSub>
-              <m:r>
-                <w:rPr>
-                  <w:rFonts w:ascii="Cambria Math" w:hAnsi="Cambria Math"/>
-                  <w:lang w:val="en-US"/>
-                </w:rPr>
-                <m:t>=</m:t>
-              </m:r>
-            </m:oMath>
-            <w:r>
-              <w:rPr>
-                <w:lang w:val="en-US"/>
-              </w:rPr>
-              <w:tab/>
-              <w:t>(</w:t>
-            </w:r>
-            <w:r>
-              <w:rPr>
-                <w:lang w:val="en-US"/>
-              </w:rPr>
-              <w:t>MPa</w:t>
-            </w:r>
-            <w:r>
-              <w:rPr>
-                <w:lang w:val="en-US"/>
-              </w:rPr>
-              <w:t>)</w:t>
-            </w:r>
-          </w:p>
-        </w:tc>
-        <w:tc>
-          <w:tcPr>
-            <w:tcW w:w="1397" w:type="dxa"/>
-          </w:tcPr>
-          <w:p>
-            <w:pPr>
-              <w:jc w:val="center"/>
-              <w:rPr>
-                <w:lang w:val="en-US"/>
-              </w:rPr>
-            </w:pPr>
-          </w:p>
-        </w:tc>
-        <w:tc>
-          <w:tcPr>
-            <w:tcW w:w="1384" w:type="dxa"/>
-          </w:tcPr>
-          <w:p>
-            <w:pPr>
-              <w:jc w:val="center"/>
-              <w:rPr>
-                <w:i/>
-                <w:color w:val="C00000"/>
-                <w:lang w:val="en-US"/>
-              </w:rPr>
-            </w:pPr>
-          </w:p>
-        </w:tc>
-        <w:tc>
-          <w:tcPr>
-            <w:tcW w:w="776" w:type="dxa"/>
-            <w:vAlign w:val="center"/>
-          </w:tcPr>
-          <w:p>
-            <w:pPr>
-              <w:jc w:val="center"/>
-              <w:rPr>
-                <w:lang w:val="en-US"/>
-              </w:rPr>
-            </w:pPr>
-          </w:p>
-        </w:tc>
-      </w:tr>
-      <w:tr>
-        <w:tc>
-          <w:tcPr>
-            <w:tcW w:w="6637" w:type="dxa"/>
-            <w:vAlign w:val="center"/>
-          </w:tcPr>
-          <w:p>
-            <w:pPr>
-              <w:tabs>
-                <w:tab w:val="right" w:pos="4997"/>
-              </w:tabs>
-              <w:jc w:val="left"/>
-            </w:pPr>
-            <w:r>
-              <w:t>Min. c</w:t>
-            </w:r>
-            <w:r>
-              <w:t xml:space="preserve">ompression </w:t>
-            </w:r>
-            <w:proofErr w:type="spellStart"/>
-            <w:r>
-              <w:t>strut</w:t>
-            </w:r>
-            <w:proofErr w:type="spellEnd"/>
-            <w:r>
-              <w:t xml:space="preserve"> inclination angle</w:t>
-            </w:r>
-            <w:r>
-              <w:t xml:space="preserve"> : </w:t>
-            </w:r>
-            <m:oMath>
-              <m:sSub>
-                <m:sSubPr>
-                  <m:ctrlPr>
-                    <w:rPr>
-                      <w:rFonts w:ascii="Cambria Math" w:hAnsi="Cambria Math"/>
-                      <w:i/>
-                    </w:rPr>
-                  </m:ctrlPr>
-                </m:sSubPr>
-                <m:e>
-                  <m:r>
-                    <w:rPr>
-                      <w:rFonts w:ascii="Cambria Math" w:hAnsi="Cambria Math"/>
-                    </w:rPr>
-                    <m:t>θ</m:t>
-                  </m:r>
-                </m:e>
-                <m:sub>
-                  <m:r>
                     <m:rPr>
                       <m:sty m:val="p"/>
                     </m:rPr>
                     <w:rPr>
                       <w:rFonts w:ascii="Cambria Math" w:hAnsi="Cambria Math"/>
                     </w:rPr>
-                    <m:t>f,min</m:t>
-                  </m:r>
-                </m:sub>
-              </m:sSub>
-              <m:r>
-                <w:rPr>
-                  <w:rFonts w:ascii="Cambria Math" w:hAnsi="Cambria Math"/>
-                </w:rPr>
-                <m:t>=</m:t>
-              </m:r>
-            </m:oMath>
-            <w:r>
-              <w:tab/>
-              <w:t>(</w:t>
-            </w:r>
-            <w:r>
-              <w:t>°</w:t>
-            </w:r>
-            <w:r>
-              <w:t>)</w:t>
-            </w:r>
-          </w:p>
-        </w:tc>
-        <w:tc>
-          <w:tcPr>
-            <w:tcW w:w="1397" w:type="dxa"/>
-          </w:tcPr>
-          <w:p>
-            <w:pPr>
-              <w:jc w:val="center"/>
-            </w:pPr>
-          </w:p>
-        </w:tc>
-        <w:tc>
-          <w:tcPr>
-            <w:tcW w:w="1384" w:type="dxa"/>
-          </w:tcPr>
-          <w:p>
-            <w:pPr>
-              <w:jc w:val="center"/>
-              <w:rPr>
-                <w:i/>
-                <w:color w:val="C00000"/>
-              </w:rPr>
-            </w:pPr>
-          </w:p>
-        </w:tc>
-        <w:tc>
-          <w:tcPr>
-            <w:tcW w:w="776" w:type="dxa"/>
-            <w:vAlign w:val="center"/>
-          </w:tcPr>
-          <w:p>
-            <w:pPr>
-              <w:jc w:val="center"/>
-            </w:pPr>
-          </w:p>
-        </w:tc>
-      </w:tr>
-      <w:tr>
-        <w:tc>
-          <w:tcPr>
-            <w:tcW w:w="6637" w:type="dxa"/>
-            <w:vAlign w:val="center"/>
-          </w:tcPr>
-          <w:p>
-            <w:pPr>
-              <w:tabs>
-                <w:tab w:val="right" w:pos="4997"/>
-              </w:tabs>
-              <w:jc w:val="left"/>
-              <w:rPr>
-                <w:lang w:val="en-US"/>
-              </w:rPr>
-            </w:pPr>
-            <w:r>
-              <w:rPr>
-                <w:lang w:val="en-US"/>
-              </w:rPr>
-              <w:t xml:space="preserve">Resistance of the compression strut : </w:t>
-            </w:r>
-            <m:oMath>
-              <m:sSub>
-                <m:sSubPr>
-                  <m:ctrlPr>
-                    <w:rPr>
-                      <w:rFonts w:ascii="Cambria Math" w:hAnsi="Cambria Math"/>
-                      <w:i/>
-                      <w:lang w:val="en-US"/>
-                    </w:rPr>
-                  </m:ctrlPr>
-                </m:sSubPr>
-                <m:e>
-                  <m:r>
-                    <m:rPr>
-                      <m:sty m:val="p"/>
-                    </m:rPr>
-                    <w:rPr>
-                      <w:rFonts w:ascii="Cambria Math" w:hAnsi="Cambria Math"/>
-                      <w:lang w:val="en-US"/>
-                    </w:rPr>
                     <m:t>Γ</m:t>
                   </m:r>
                   <m:ctrlPr>
                     <w:rPr>
                       <w:rFonts w:ascii="Cambria Math" w:hAnsi="Cambria Math"/>
-                      <w:lang w:val="en-US"/>
                     </w:rPr>
                   </m:ctrlPr>
                 </m:e>
@@ -29794,20 +29448,10 @@
                       <w:rFonts w:ascii="Cambria Math" w:hAnsi="Cambria Math"/>
                       <w:lang w:val="en-US"/>
                     </w:rPr>
-                    <m:t>sf</m:t>
+                    <m:t>LT</m:t>
                   </m:r>
                 </m:sub>
               </m:sSub>
-              <m:r>
-                <m:rPr>
-                  <m:sty m:val="p"/>
-                </m:rPr>
-                <w:rPr>
-                  <w:rFonts w:ascii="Cambria Math" w:hAnsi="Cambria Math"/>
-                  <w:lang w:val="en-US"/>
-                </w:rPr>
-                <m:t xml:space="preserve"> </m:t>
-              </m:r>
               <m:r>
                 <w:rPr>
                   <w:rFonts w:ascii="Cambria Math" w:hAnsi="Cambria Math"/>
@@ -29835,6 +29479,12 @@
                 <w:lang w:val="en-US"/>
               </w:rPr>
             </w:pPr>
+            <w:r>
+              <w:rPr>
+                <w:lang w:val="en-US"/>
+              </w:rPr>
+              <w:t>0.66</w:t>
+            </w:r>
           </w:p>
         </w:tc>
         <w:tc>
@@ -29850,226 +29500,46 @@
                 <w:lang w:val="en-US"/>
               </w:rPr>
             </w:pPr>
-          </w:p>
-        </w:tc>
-        <w:tc>
-          <w:tcPr>
-            <w:tcW w:w="776" w:type="dxa"/>
-            <w:vAlign w:val="center"/>
-          </w:tcPr>
-          <w:p>
-            <w:pPr>
-              <w:jc w:val="center"/>
-              <w:rPr>
-                <w:lang w:val="en-US"/>
-              </w:rPr>
-            </w:pPr>
-          </w:p>
-        </w:tc>
-      </w:tr>
-      <w:tr>
-        <w:tc>
-          <w:tcPr>
-            <w:tcW w:w="6637" w:type="dxa"/>
-            <w:vAlign w:val="center"/>
-          </w:tcPr>
-          <w:p>
-            <w:pPr>
-              <w:tabs>
-                <w:tab w:val="right" w:pos="4997"/>
-              </w:tabs>
-              <w:jc w:val="left"/>
-              <w:rPr>
-                <w:lang w:val="en-US"/>
-              </w:rPr>
-            </w:pPr>
-            <w:r>
-              <w:rPr>
-                <w:lang w:val="en-US"/>
-              </w:rPr>
-              <w:t xml:space="preserve">Area of </w:t>
-            </w:r>
-            <w:proofErr w:type="spellStart"/>
-            <w:r>
-              <w:rPr>
-                <w:lang w:val="en-US"/>
-              </w:rPr>
-              <w:t>reinf</w:t>
-            </w:r>
-            <w:proofErr w:type="spellEnd"/>
-            <w:r>
-              <w:rPr>
-                <w:lang w:val="en-US"/>
-              </w:rPr>
-              <w:t>. by length unit</w:t>
-            </w:r>
-            <w:r>
-              <w:rPr>
-                <w:lang w:val="en-US"/>
-              </w:rPr>
-              <w:t xml:space="preserve"> : </w:t>
-            </w:r>
-            <m:oMath>
-              <m:sSub>
-                <m:sSubPr>
-                  <m:ctrlPr>
-                    <w:rPr>
-                      <w:rFonts w:ascii="Cambria Math" w:hAnsi="Cambria Math"/>
-                      <w:i/>
-                      <w:lang w:val="en-US"/>
-                    </w:rPr>
-                  </m:ctrlPr>
-                </m:sSubPr>
-                <m:e>
-                  <m:r>
-                    <w:rPr>
-                      <w:rFonts w:ascii="Cambria Math" w:hAnsi="Cambria Math"/>
-                      <w:lang w:val="en-US"/>
-                    </w:rPr>
-                    <m:t>A</m:t>
-                  </m:r>
-                </m:e>
-                <m:sub>
-                  <m:r>
-                    <m:rPr>
-                      <m:sty m:val="p"/>
-                    </m:rPr>
-                    <w:rPr>
-                      <w:rFonts w:ascii="Cambria Math" w:hAnsi="Cambria Math"/>
-                      <w:lang w:val="en-US"/>
-                    </w:rPr>
-                    <m:t>sf</m:t>
-                  </m:r>
-                </m:sub>
-              </m:sSub>
-              <m:r>
-                <m:rPr>
-                  <m:sty m:val="p"/>
-                </m:rPr>
-                <w:rPr>
-                  <w:rFonts w:ascii="Cambria Math" w:hAnsi="Cambria Math"/>
-                  <w:lang w:val="en-US"/>
-                </w:rPr>
-                <m:t>/</m:t>
-              </m:r>
-              <m:sSub>
-                <m:sSubPr>
-                  <m:ctrlPr>
-                    <w:rPr>
-                      <w:rFonts w:ascii="Cambria Math" w:hAnsi="Cambria Math"/>
-                      <w:lang w:val="en-US"/>
-                    </w:rPr>
-                  </m:ctrlPr>
-                </m:sSubPr>
-                <m:e>
-                  <m:r>
-                    <m:rPr>
-                      <m:sty m:val="p"/>
-                    </m:rPr>
-                    <w:rPr>
-                      <w:rFonts w:ascii="Cambria Math" w:hAnsi="Cambria Math"/>
-                      <w:lang w:val="en-US"/>
-                    </w:rPr>
-                    <m:t>s</m:t>
-                  </m:r>
-                </m:e>
-                <m:sub>
-                  <m:r>
-                    <m:rPr>
-                      <m:sty m:val="p"/>
-                    </m:rPr>
-                    <w:rPr>
-                      <w:rFonts w:ascii="Cambria Math" w:hAnsi="Cambria Math"/>
-                      <w:lang w:val="en-US"/>
-                    </w:rPr>
-                    <m:t>f</m:t>
-                  </m:r>
-                </m:sub>
-              </m:sSub>
-              <m:r>
-                <m:rPr>
-                  <m:sty m:val="p"/>
-                </m:rPr>
-                <w:rPr>
-                  <w:rFonts w:ascii="Cambria Math" w:hAnsi="Cambria Math"/>
-                  <w:lang w:val="en-US"/>
-                </w:rPr>
-                <m:t xml:space="preserve"> </m:t>
-              </m:r>
-              <m:r>
-                <w:rPr>
-                  <w:rFonts w:ascii="Cambria Math" w:hAnsi="Cambria Math"/>
-                  <w:lang w:val="en-US"/>
-                </w:rPr>
-                <m:t>=</m:t>
-              </m:r>
-            </m:oMath>
-            <w:r>
-              <w:rPr>
-                <w:lang w:val="en-US"/>
-              </w:rPr>
-              <w:tab/>
-            </w:r>
-            <w:r>
-              <w:rPr>
-                <w:lang w:val="en-US"/>
-              </w:rPr>
-              <w:t>(</w:t>
-            </w:r>
-            <w:r>
-              <w:rPr>
-                <w:lang w:val="en-US"/>
-              </w:rPr>
-              <w:t>cm²/m</w:t>
-            </w:r>
-            <w:r>
-              <w:rPr>
-                <w:lang w:val="en-US"/>
-              </w:rPr>
-              <w:t>)</w:t>
-            </w:r>
-          </w:p>
-        </w:tc>
-        <w:tc>
-          <w:tcPr>
-            <w:tcW w:w="1397" w:type="dxa"/>
-          </w:tcPr>
-          <w:p>
-            <w:pPr>
-              <w:jc w:val="center"/>
-              <w:rPr>
-                <w:lang w:val="en-US"/>
-              </w:rPr>
-            </w:pPr>
-          </w:p>
-        </w:tc>
-        <w:tc>
-          <w:tcPr>
-            <w:tcW w:w="1384" w:type="dxa"/>
-          </w:tcPr>
-          <w:p>
-            <w:pPr>
-              <w:jc w:val="center"/>
+            <w:r>
               <w:rPr>
                 <w:i/>
                 <w:color w:val="C00000"/>
                 <w:lang w:val="en-US"/>
               </w:rPr>
-            </w:pPr>
-          </w:p>
-        </w:tc>
-        <w:tc>
-          <w:tcPr>
-            <w:tcW w:w="776" w:type="dxa"/>
+              <w:t>0.</w:t>
+            </w:r>
+            <w:r>
+              <w:rPr>
+                <w:i/>
+                <w:color w:val="C00000"/>
+                <w:lang w:val="en-US"/>
+              </w:rPr>
+              <w:t>63</w:t>
+            </w:r>
+          </w:p>
+        </w:tc>
+        <w:tc>
+          <w:tcPr>
+            <w:tcW w:w="951" w:type="dxa"/>
             <w:vAlign w:val="center"/>
           </w:tcPr>
           <w:p>
             <w:pPr>
               <w:jc w:val="center"/>
               <w:rPr>
-                <w:lang w:val="en-US"/>
-              </w:rPr>
-            </w:pPr>
+                <w:i/>
+                <w:color w:val="C00000"/>
+                <w:lang w:val="en-US"/>
+              </w:rPr>
+            </w:pPr>
+            <w:r>
+              <w:rPr>
+                <w:i/>
+                <w:color w:val="C00000"/>
+                <w:lang w:val="en-US"/>
+              </w:rPr>
+              <w:t>4.76%</w:t>
+            </w:r>
           </w:p>
         </w:tc>
       </w:tr>
@@ -30100,7 +29570,10 @@
         <w:fldChar w:fldCharType="end"/>
       </w:r>
       <w:r>
-        <w:t xml:space="preserve">: ULS at final stage </w:t>
+        <w:t>: UL</w:t>
+      </w:r>
+      <w:r>
+        <w:t>S</w:t>
       </w:r>
     </w:p>
     <w:p>
@@ -30113,14 +29586,14 @@
     <w:tbl>
       <w:tblPr>
         <w:tblStyle w:val="Grilledutableau"/>
-        <w:tblW w:w="0" w:type="auto"/>
+        <w:tblW w:w="10369" w:type="dxa"/>
         <w:tblLook w:val="04A0" w:firstRow="1" w:lastRow="0" w:firstColumn="1" w:lastColumn="0" w:noHBand="0" w:noVBand="1"/>
       </w:tblPr>
       <w:tblGrid>
         <w:gridCol w:w="6637"/>
         <w:gridCol w:w="1397"/>
         <w:gridCol w:w="1384"/>
-        <w:gridCol w:w="776"/>
+        <w:gridCol w:w="951"/>
       </w:tblGrid>
       <w:tr>
         <w:tc>
@@ -30167,7 +29640,7 @@
         </w:tc>
         <w:tc>
           <w:tcPr>
-            <w:tcW w:w="776" w:type="dxa"/>
+            <w:tcW w:w="951" w:type="dxa"/>
             <w:shd w:val="clear" w:color="auto" w:fill="D9D9D9" w:themeFill="background1" w:themeFillShade="D9"/>
           </w:tcPr>
           <w:p>
@@ -30293,6 +29766,12 @@
                 <w:lang w:val="en-US"/>
               </w:rPr>
             </w:pPr>
+            <w:r>
+              <w:rPr>
+                <w:lang w:val="en-US"/>
+              </w:rPr>
+              <w:t>31.0</w:t>
+            </w:r>
           </w:p>
         </w:tc>
         <w:tc>
@@ -30307,157 +29786,48 @@
                 <w:color w:val="C00000"/>
               </w:rPr>
             </w:pPr>
-          </w:p>
-        </w:tc>
-        <w:tc>
-          <w:tcPr>
-            <w:tcW w:w="776" w:type="dxa"/>
-            <w:vAlign w:val="center"/>
-          </w:tcPr>
-          <w:p>
-            <w:pPr>
-              <w:jc w:val="center"/>
-            </w:pPr>
-          </w:p>
-        </w:tc>
-      </w:tr>
-      <w:tr>
-        <w:tc>
-          <w:tcPr>
-            <w:tcW w:w="6637" w:type="dxa"/>
-            <w:vAlign w:val="center"/>
-          </w:tcPr>
-          <w:p>
-            <w:pPr>
-              <w:tabs>
-                <w:tab w:val="right" w:pos="4997"/>
-              </w:tabs>
-              <w:jc w:val="left"/>
-              <w:rPr>
-                <w:lang w:val="en-US"/>
-              </w:rPr>
-            </w:pPr>
-            <w:r>
-              <w:rPr>
-                <w:lang w:val="en-US"/>
-              </w:rPr>
-              <w:t>Deflection</w:t>
-            </w:r>
-            <w:r>
-              <w:rPr>
-                <w:lang w:val="en-US"/>
-              </w:rPr>
-              <w:t xml:space="preserve"> : </w:t>
-            </w:r>
-            <m:oMath>
-              <m:r>
-                <w:rPr>
-                  <w:rFonts w:ascii="Cambria Math" w:hAnsi="Cambria Math"/>
-                </w:rPr>
-                <m:t>δ</m:t>
-              </m:r>
-              <m:d>
-                <m:dPr>
-                  <m:ctrlPr>
-                    <w:rPr>
-                      <w:rFonts w:ascii="Cambria Math" w:hAnsi="Cambria Math"/>
-                      <w:i/>
-                      <w:lang w:val="en-US"/>
-                    </w:rPr>
-                  </m:ctrlPr>
-                </m:dPr>
-                <m:e>
-                  <m:sSub>
-                    <m:sSubPr>
-                      <m:ctrlPr>
-                        <w:rPr>
-                          <w:rFonts w:ascii="Cambria Math" w:hAnsi="Cambria Math"/>
-                          <w:i/>
-                          <w:lang w:val="en-US"/>
-                        </w:rPr>
-                      </m:ctrlPr>
-                    </m:sSubPr>
-                    <m:e>
-                      <m:r>
-                        <w:rPr>
-                          <w:rFonts w:ascii="Cambria Math" w:hAnsi="Cambria Math"/>
-                        </w:rPr>
-                        <m:t>G</m:t>
-                      </m:r>
-                    </m:e>
-                    <m:sub>
-                      <m:r>
-                        <m:rPr>
-                          <m:sty m:val="p"/>
-                        </m:rPr>
-                        <w:rPr>
-                          <w:rFonts w:ascii="Cambria Math" w:hAnsi="Cambria Math"/>
-                          <w:lang w:val="en-US"/>
-                        </w:rPr>
-                        <m:t>2</m:t>
-                      </m:r>
-                    </m:sub>
-                  </m:sSub>
-                </m:e>
-              </m:d>
-            </m:oMath>
-            <w:r>
-              <w:rPr>
-                <w:lang w:val="en-US"/>
-              </w:rPr>
-              <w:tab/>
-              <w:t>(</w:t>
-            </w:r>
-            <w:r>
-              <w:rPr>
-                <w:lang w:val="en-US"/>
-              </w:rPr>
-              <w:t>mm</w:t>
-            </w:r>
-            <w:r>
-              <w:rPr>
-                <w:lang w:val="en-US"/>
-              </w:rPr>
-              <w:t>)</w:t>
-            </w:r>
-          </w:p>
-        </w:tc>
-        <w:tc>
-          <w:tcPr>
-            <w:tcW w:w="1397" w:type="dxa"/>
-          </w:tcPr>
-          <w:p>
-            <w:pPr>
-              <w:jc w:val="center"/>
-              <w:rPr>
-                <w:lang w:val="en-US"/>
-              </w:rPr>
-            </w:pPr>
-          </w:p>
-        </w:tc>
-        <w:tc>
-          <w:tcPr>
-            <w:tcW w:w="1384" w:type="dxa"/>
-          </w:tcPr>
-          <w:p>
-            <w:pPr>
-              <w:jc w:val="center"/>
+            <w:r>
               <w:rPr>
                 <w:i/>
                 <w:color w:val="C00000"/>
               </w:rPr>
-            </w:pPr>
-          </w:p>
-        </w:tc>
-        <w:tc>
-          <w:tcPr>
-            <w:tcW w:w="776" w:type="dxa"/>
+              <w:t>31.1</w:t>
+            </w:r>
+          </w:p>
+        </w:tc>
+        <w:tc>
+          <w:tcPr>
+            <w:tcW w:w="951" w:type="dxa"/>
             <w:vAlign w:val="center"/>
           </w:tcPr>
           <w:p>
             <w:pPr>
               <w:jc w:val="center"/>
             </w:pPr>
+            <w:r>
+              <w:rPr>
+                <w:i/>
+                <w:color w:val="C00000"/>
+                <w:lang w:val="en-US"/>
+              </w:rPr>
+              <w:t>-</w:t>
+            </w:r>
+            <w:r>
+              <w:rPr>
+                <w:i/>
+                <w:color w:val="C00000"/>
+                <w:lang w:val="en-US"/>
+              </w:rPr>
+              <w:t>0.32</w:t>
+            </w:r>
+            <w:r>
+              <w:rPr>
+                <w:i/>
+                <w:color w:val="C00000"/>
+                <w:lang w:val="en-US"/>
+              </w:rPr>
+              <w:t>%</w:t>
+            </w:r>
           </w:p>
         </w:tc>
       </w:tr>
@@ -30530,7 +29900,7 @@
                       <w:rFonts w:ascii="Cambria Math" w:hAnsi="Cambria Math"/>
                       <w:lang w:val="en-US"/>
                     </w:rPr>
-                    <m:t>1</m:t>
+                    <m:t>c</m:t>
                   </m:r>
                 </m:sub>
               </m:sSub>
@@ -30574,6 +29944,12 @@
                 <w:lang w:val="en-US"/>
               </w:rPr>
             </w:pPr>
+            <w:r>
+              <w:rPr>
+                <w:lang w:val="en-US"/>
+              </w:rPr>
+              <w:t>6.5</w:t>
+            </w:r>
           </w:p>
         </w:tc>
         <w:tc>
@@ -30588,137 +29964,27 @@
                 <w:color w:val="C00000"/>
               </w:rPr>
             </w:pPr>
-          </w:p>
-        </w:tc>
-        <w:tc>
-          <w:tcPr>
-            <w:tcW w:w="776" w:type="dxa"/>
-            <w:vAlign w:val="center"/>
-          </w:tcPr>
-          <w:p>
-            <w:pPr>
-              <w:jc w:val="center"/>
-            </w:pPr>
-          </w:p>
-        </w:tc>
-      </w:tr>
-      <w:tr>
-        <w:tc>
-          <w:tcPr>
-            <w:tcW w:w="6637" w:type="dxa"/>
-            <w:vAlign w:val="center"/>
-          </w:tcPr>
-          <w:p>
-            <w:pPr>
-              <w:tabs>
-                <w:tab w:val="right" w:pos="4997"/>
-              </w:tabs>
-              <w:jc w:val="left"/>
-              <w:rPr>
-                <w:lang w:val="en-US"/>
-              </w:rPr>
-            </w:pPr>
-            <w:r>
-              <w:rPr>
-                <w:lang w:val="en-US"/>
-              </w:rPr>
-              <w:t>Deflection</w:t>
-            </w:r>
-            <w:r>
-              <w:rPr>
-                <w:lang w:val="en-US"/>
-              </w:rPr>
-              <w:t xml:space="preserve"> : </w:t>
-            </w:r>
-            <m:oMath>
-              <m:r>
-                <w:rPr>
-                  <w:rFonts w:ascii="Cambria Math" w:hAnsi="Cambria Math"/>
-                </w:rPr>
-                <m:t>δ</m:t>
-              </m:r>
-              <m:d>
-                <m:dPr>
-                  <m:ctrlPr>
-                    <w:rPr>
-                      <w:rFonts w:ascii="Cambria Math" w:hAnsi="Cambria Math"/>
-                      <w:i/>
-                      <w:lang w:val="en-US"/>
-                    </w:rPr>
-                  </m:ctrlPr>
-                </m:dPr>
-                <m:e>
-                  <m:r>
-                    <w:rPr>
-                      <w:rFonts w:ascii="Cambria Math" w:hAnsi="Cambria Math"/>
-                      <w:lang w:val="en-US"/>
-                    </w:rPr>
-                    <m:t>SHC</m:t>
-                  </m:r>
-                </m:e>
-              </m:d>
-            </m:oMath>
-            <w:r>
-              <w:rPr>
-                <w:lang w:val="en-US"/>
-              </w:rPr>
-              <w:tab/>
-              <w:t>(</w:t>
-            </w:r>
-            <w:r>
-              <w:rPr>
-                <w:lang w:val="en-US"/>
-              </w:rPr>
-              <w:t>mm</w:t>
-            </w:r>
-            <w:r>
-              <w:rPr>
-                <w:lang w:val="en-US"/>
-              </w:rPr>
-              <w:t>)</w:t>
-            </w:r>
-          </w:p>
-        </w:tc>
-        <w:tc>
-          <w:tcPr>
-            <w:tcW w:w="1397" w:type="dxa"/>
-          </w:tcPr>
-          <w:p>
-            <w:pPr>
-              <w:jc w:val="center"/>
-              <w:rPr>
-                <w:lang w:val="en-US"/>
-              </w:rPr>
-            </w:pPr>
-          </w:p>
-        </w:tc>
-        <w:tc>
-          <w:tcPr>
-            <w:tcW w:w="1384" w:type="dxa"/>
-          </w:tcPr>
-          <w:p>
-            <w:pPr>
-              <w:jc w:val="center"/>
+            <w:r>
               <w:rPr>
                 <w:i/>
                 <w:color w:val="C00000"/>
               </w:rPr>
-            </w:pPr>
-          </w:p>
-        </w:tc>
-        <w:tc>
-          <w:tcPr>
-            <w:tcW w:w="776" w:type="dxa"/>
+              <w:t>6.5</w:t>
+            </w:r>
+          </w:p>
+        </w:tc>
+        <w:tc>
+          <w:tcPr>
+            <w:tcW w:w="951" w:type="dxa"/>
             <w:vAlign w:val="center"/>
           </w:tcPr>
           <w:p>
             <w:pPr>
               <w:jc w:val="center"/>
-              <w:rPr>
-                <w:i/>
-                <w:color w:val="C00000"/>
-              </w:rPr>
-            </w:pPr>
+            </w:pPr>
+            <w:r>
+              <w:t>0.00%</w:t>
+            </w:r>
           </w:p>
         </w:tc>
       </w:tr>
@@ -30810,6 +30076,12 @@
                 <w:lang w:val="en-US"/>
               </w:rPr>
             </w:pPr>
+            <w:r>
+              <w:rPr>
+                <w:lang w:val="en-US"/>
+              </w:rPr>
+              <w:t>37.5</w:t>
+            </w:r>
           </w:p>
         </w:tc>
         <w:tc>
@@ -30824,169 +30096,56 @@
                 <w:color w:val="C00000"/>
               </w:rPr>
             </w:pPr>
-          </w:p>
-        </w:tc>
-        <w:tc>
-          <w:tcPr>
-            <w:tcW w:w="776" w:type="dxa"/>
-            <w:vAlign w:val="center"/>
-          </w:tcPr>
-          <w:p>
-            <w:pPr>
-              <w:jc w:val="center"/>
-            </w:pPr>
-          </w:p>
-        </w:tc>
-      </w:tr>
-      <w:tr>
-        <w:tc>
-          <w:tcPr>
-            <w:tcW w:w="6637" w:type="dxa"/>
-            <w:vAlign w:val="center"/>
-          </w:tcPr>
-          <w:p>
-            <w:pPr>
-              <w:tabs>
-                <w:tab w:val="right" w:pos="4997"/>
-              </w:tabs>
-              <w:jc w:val="left"/>
-              <w:rPr>
-                <w:lang w:val="en-US"/>
-              </w:rPr>
-            </w:pPr>
-            <w:r>
-              <w:rPr>
-                <w:lang w:val="en-US"/>
-              </w:rPr>
-              <w:t>Eigen frequency</w:t>
-            </w:r>
-            <w:r>
-              <w:rPr>
-                <w:lang w:val="en-US"/>
-              </w:rPr>
-              <w:t xml:space="preserve"> : </w:t>
-            </w:r>
-            <m:oMath>
-              <m:r>
-                <w:rPr>
-                  <w:rFonts w:ascii="Cambria Math" w:hAnsi="Cambria Math"/>
-                </w:rPr>
-                <m:t>f</m:t>
-              </m:r>
-              <m:d>
-                <m:dPr>
-                  <m:ctrlPr>
-                    <w:rPr>
-                      <w:rFonts w:ascii="Cambria Math" w:hAnsi="Cambria Math"/>
-                      <w:i/>
-                      <w:lang w:val="en-US"/>
-                    </w:rPr>
-                  </m:ctrlPr>
-                </m:dPr>
-                <m:e>
-                  <m:r>
-                    <w:rPr>
-                      <w:rFonts w:ascii="Cambria Math" w:hAnsi="Cambria Math"/>
-                      <w:lang w:val="en-US"/>
-                    </w:rPr>
-                    <m:t>G+0.2</m:t>
-                  </m:r>
-                  <m:sSub>
-                    <m:sSubPr>
-                      <m:ctrlPr>
-                        <w:rPr>
-                          <w:rFonts w:ascii="Cambria Math" w:hAnsi="Cambria Math"/>
-                          <w:i/>
-                          <w:lang w:val="en-US"/>
-                        </w:rPr>
-                      </m:ctrlPr>
-                    </m:sSubPr>
-                    <m:e>
-                      <m:r>
-                        <w:rPr>
-                          <w:rFonts w:ascii="Cambria Math" w:hAnsi="Cambria Math"/>
-                          <w:lang w:val="en-US"/>
-                        </w:rPr>
-                        <m:t>Q</m:t>
-                      </m:r>
-                    </m:e>
-                    <m:sub>
-                      <m:r>
-                        <m:rPr>
-                          <m:sty m:val="p"/>
-                        </m:rPr>
-                        <w:rPr>
-                          <w:rFonts w:ascii="Cambria Math" w:hAnsi="Cambria Math"/>
-                          <w:lang w:val="en-US"/>
-                        </w:rPr>
-                        <m:t>1</m:t>
-                      </m:r>
-                    </m:sub>
-                  </m:sSub>
-                </m:e>
-              </m:d>
-            </m:oMath>
-            <w:r>
-              <w:rPr>
-                <w:lang w:val="en-US"/>
-              </w:rPr>
-              <w:tab/>
-              <w:t>(</w:t>
-            </w:r>
-            <w:r>
-              <w:rPr>
-                <w:lang w:val="en-US"/>
-              </w:rPr>
-              <w:t>Hz</w:t>
-            </w:r>
-            <w:r>
-              <w:rPr>
-                <w:lang w:val="en-US"/>
-              </w:rPr>
-              <w:t>)</w:t>
-            </w:r>
-          </w:p>
-        </w:tc>
-        <w:tc>
-          <w:tcPr>
-            <w:tcW w:w="1397" w:type="dxa"/>
-          </w:tcPr>
-          <w:p>
-            <w:pPr>
-              <w:jc w:val="center"/>
-              <w:rPr>
-                <w:lang w:val="en-US"/>
-              </w:rPr>
-            </w:pPr>
-          </w:p>
-        </w:tc>
-        <w:tc>
-          <w:tcPr>
-            <w:tcW w:w="1384" w:type="dxa"/>
-          </w:tcPr>
-          <w:p>
-            <w:pPr>
-              <w:jc w:val="center"/>
+            <w:r>
               <w:rPr>
                 <w:i/>
                 <w:color w:val="C00000"/>
-                <w:lang w:val="en-US"/>
-              </w:rPr>
-            </w:pPr>
-          </w:p>
-        </w:tc>
-        <w:tc>
-          <w:tcPr>
-            <w:tcW w:w="776" w:type="dxa"/>
+              </w:rPr>
+              <w:t>37.6</w:t>
+            </w:r>
+          </w:p>
+        </w:tc>
+        <w:tc>
+          <w:tcPr>
+            <w:tcW w:w="951" w:type="dxa"/>
             <w:vAlign w:val="center"/>
           </w:tcPr>
           <w:p>
             <w:pPr>
               <w:jc w:val="center"/>
-              <w:rPr>
-                <w:lang w:val="en-US"/>
-              </w:rPr>
-            </w:pPr>
+            </w:pPr>
+            <w:r>
+              <w:rPr>
+                <w:i/>
+                <w:color w:val="C00000"/>
+                <w:lang w:val="en-US"/>
+              </w:rPr>
+              <w:t>-</w:t>
+            </w:r>
+            <w:r>
+              <w:rPr>
+                <w:i/>
+                <w:color w:val="C00000"/>
+                <w:lang w:val="en-US"/>
+              </w:rPr>
+              <w:t>0.</w:t>
+            </w:r>
+            <w:r>
+              <w:rPr>
+                <w:i/>
+                <w:color w:val="C00000"/>
+                <w:lang w:val="en-US"/>
+              </w:rPr>
+              <w:t>27</w:t>
+            </w:r>
+            <w:r>
+              <w:rPr>
+                <w:i/>
+                <w:color w:val="C00000"/>
+                <w:lang w:val="en-US"/>
+              </w:rPr>
+              <w:t>%</w:t>
+            </w:r>
           </w:p>
         </w:tc>
       </w:tr>
@@ -31017,13 +30176,13 @@
         <w:fldChar w:fldCharType="end"/>
       </w:r>
       <w:r>
-        <w:t>: SLS assuming full connection</w:t>
+        <w:t xml:space="preserve">: SLS </w:t>
       </w:r>
     </w:p>
     <w:p>
       <w:pPr>
         <w:rPr>
-          <w:lang w:val="en-US"/>
+          <w:lang w:val="en-GB"/>
         </w:rPr>
       </w:pPr>
     </w:p>
@@ -31151,7 +30310,7 @@
               <w:rFonts w:ascii="Calibri" w:hAnsi="Calibri"/>
               <w:noProof/>
             </w:rPr>
-            <w:t>16/05/2024</w:t>
+            <w:t>17/05/2024</w:t>
           </w:r>
           <w:r>
             <w:rPr>
@@ -32048,7 +31207,7 @@
               <w:sz w:val="20"/>
               <w:szCs w:val="20"/>
             </w:rPr>
-            <w:t>25</w:t>
+            <w:t>24</w:t>
           </w:r>
           <w:r>
             <w:rPr>
@@ -44737,6 +43896,21 @@
 </file>
 
 <file path=customXml/item1.xml><?xml version="1.0" encoding="utf-8"?>
+<?mso-contentType ?>
+<FormTemplates xmlns="http://schemas.microsoft.com/sharepoint/v3/contenttype/forms">
+  <Display>DocumentLibraryForm</Display>
+  <Edit>DocumentLibraryForm</Edit>
+  <New>DocumentLibraryForm</New>
+</FormTemplates>
+</file>
+
+<file path=customXml/item2.xml><?xml version="1.0" encoding="utf-8"?>
+<p:properties xmlns:p="http://schemas.microsoft.com/office/2006/metadata/properties" xmlns:xsi="http://www.w3.org/2001/XMLSchema-instance" xmlns:pc="http://schemas.microsoft.com/office/infopath/2007/PartnerControls">
+  <documentManagement/>
+</p:properties>
+</file>
+
+<file path=customXml/item3.xml><?xml version="1.0" encoding="utf-8"?>
 <ct:contentTypeSchema xmlns:ct="http://schemas.microsoft.com/office/2006/metadata/contentType" xmlns:ma="http://schemas.microsoft.com/office/2006/metadata/properties/metaAttributes" ct:_="" ma:_="" ma:contentTypeName="Document" ma:contentTypeID="0x010100C247FB7A51CDFF45B526B55FCBF0CC3A" ma:contentTypeVersion="11" ma:contentTypeDescription="Crée un document." ma:contentTypeScope="" ma:versionID="163d0b2c9ded4b8a7dfdd976cd200a17">
   <xsd:schema xmlns:xsd="http://www.w3.org/2001/XMLSchema" xmlns:xs="http://www.w3.org/2001/XMLSchema" xmlns:p="http://schemas.microsoft.com/office/2006/metadata/properties" xmlns:ns3="1339968c-844c-4ba9-aec6-fbaa9d140e36" targetNamespace="http://schemas.microsoft.com/office/2006/metadata/properties" ma:root="true" ma:fieldsID="d2393c41cac5a2e9ffb95dd220a5df63" ns3:_="">
     <xsd:import namespace="1339968c-844c-4ba9-aec6-fbaa9d140e36"/>
@@ -44926,26 +44100,28 @@
 </ct:contentTypeSchema>
 </file>
 
-<file path=customXml/item2.xml><?xml version="1.0" encoding="utf-8"?>
-<?mso-contentType ?>
-<FormTemplates xmlns="http://schemas.microsoft.com/sharepoint/v3/contenttype/forms">
-  <Display>DocumentLibraryForm</Display>
-  <Edit>DocumentLibraryForm</Edit>
-  <New>DocumentLibraryForm</New>
-</FormTemplates>
-</file>
-
-<file path=customXml/item3.xml><?xml version="1.0" encoding="utf-8"?>
-<p:properties xmlns:p="http://schemas.microsoft.com/office/2006/metadata/properties" xmlns:xsi="http://www.w3.org/2001/XMLSchema-instance" xmlns:pc="http://schemas.microsoft.com/office/infopath/2007/PartnerControls">
-  <documentManagement/>
-</p:properties>
-</file>
-
 <file path=customXml/item4.xml><?xml version="1.0" encoding="utf-8"?>
 <b:Sources xmlns:b="http://schemas.openxmlformats.org/officeDocument/2006/bibliography" xmlns="http://schemas.openxmlformats.org/officeDocument/2006/bibliography" SelectedStyle="\APASixthEditionOfficeOnline.xsl" StyleName="APA" Version="6"/>
 </file>
 
 <file path=customXml/itemProps1.xml><?xml version="1.0" encoding="utf-8"?>
+<ds:datastoreItem xmlns:ds="http://schemas.openxmlformats.org/officeDocument/2006/customXml" ds:itemID="{4FB0FFFE-1214-4FB0-A9C1-883B8A00FAD1}">
+  <ds:schemaRefs>
+    <ds:schemaRef ds:uri="http://schemas.microsoft.com/sharepoint/v3/contenttype/forms"/>
+  </ds:schemaRefs>
+</ds:datastoreItem>
+</file>
+
+<file path=customXml/itemProps2.xml><?xml version="1.0" encoding="utf-8"?>
+<ds:datastoreItem xmlns:ds="http://schemas.openxmlformats.org/officeDocument/2006/customXml" ds:itemID="{8244F4F7-4138-49F1-B92F-F5AC6DA6C88D}">
+  <ds:schemaRefs>
+    <ds:schemaRef ds:uri="http://schemas.microsoft.com/office/2006/metadata/properties"/>
+    <ds:schemaRef ds:uri="http://schemas.microsoft.com/office/infopath/2007/PartnerControls"/>
+  </ds:schemaRefs>
+</ds:datastoreItem>
+</file>
+
+<file path=customXml/itemProps3.xml><?xml version="1.0" encoding="utf-8"?>
 <ds:datastoreItem xmlns:ds="http://schemas.openxmlformats.org/officeDocument/2006/customXml" ds:itemID="{763DED0B-077B-498B-B22E-F05F3E3AE21C}">
   <ds:schemaRefs>
     <ds:schemaRef ds:uri="http://schemas.microsoft.com/office/2006/metadata/contentType"/>
@@ -44963,25 +44139,8 @@
 </ds:datastoreItem>
 </file>
 
-<file path=customXml/itemProps2.xml><?xml version="1.0" encoding="utf-8"?>
-<ds:datastoreItem xmlns:ds="http://schemas.openxmlformats.org/officeDocument/2006/customXml" ds:itemID="{4FB0FFFE-1214-4FB0-A9C1-883B8A00FAD1}">
-  <ds:schemaRefs>
-    <ds:schemaRef ds:uri="http://schemas.microsoft.com/sharepoint/v3/contenttype/forms"/>
-  </ds:schemaRefs>
-</ds:datastoreItem>
-</file>
-
-<file path=customXml/itemProps3.xml><?xml version="1.0" encoding="utf-8"?>
-<ds:datastoreItem xmlns:ds="http://schemas.openxmlformats.org/officeDocument/2006/customXml" ds:itemID="{8244F4F7-4138-49F1-B92F-F5AC6DA6C88D}">
-  <ds:schemaRefs>
-    <ds:schemaRef ds:uri="http://schemas.microsoft.com/office/2006/metadata/properties"/>
-    <ds:schemaRef ds:uri="http://schemas.microsoft.com/office/infopath/2007/PartnerControls"/>
-  </ds:schemaRefs>
-</ds:datastoreItem>
-</file>
-
 <file path=customXml/itemProps4.xml><?xml version="1.0" encoding="utf-8"?>
-<ds:datastoreItem xmlns:ds="http://schemas.openxmlformats.org/officeDocument/2006/customXml" ds:itemID="{0E3E100C-2DF6-4605-AEAF-4672BB9E06FA}">
+<ds:datastoreItem xmlns:ds="http://schemas.openxmlformats.org/officeDocument/2006/customXml" ds:itemID="{0A36576A-7A9C-4FBF-8D34-63B25201C05A}">
   <ds:schemaRefs>
     <ds:schemaRef ds:uri="http://schemas.openxmlformats.org/officeDocument/2006/bibliography"/>
   </ds:schemaRefs>

</xml_diff>

<commit_message>
Fin cas test 3
</commit_message>
<xml_diff>
--- a/Manuel Validation/ABCPMX - Manuel Validation.docx
+++ b/Manuel Validation/ABCPMX - Manuel Validation.docx
@@ -3057,7 +3057,6 @@
           <w:lang w:val="en-GB"/>
         </w:rPr>
       </w:pPr>
-      <w:proofErr w:type="gramStart"/>
       <w:r>
         <w:rPr>
           <w:rFonts w:asciiTheme="minorHAnsi" w:hAnsiTheme="minorHAnsi"/>
@@ -3072,16 +3071,7 @@
           <w:szCs w:val="22"/>
           <w:lang w:val="en-GB"/>
         </w:rPr>
-        <w:t>EN</w:t>
-      </w:r>
-      <w:proofErr w:type="gramEnd"/>
-      <w:r>
-        <w:rPr>
-          <w:rFonts w:asciiTheme="minorHAnsi" w:hAnsiTheme="minorHAnsi"/>
-          <w:szCs w:val="22"/>
-          <w:lang w:val="en-GB"/>
-        </w:rPr>
-        <w:t xml:space="preserve"> 199</w:t>
+        <w:t>EN 199</w:t>
       </w:r>
       <w:r>
         <w:rPr>
@@ -3233,7 +3223,6 @@
         </w:rPr>
       </w:pPr>
       <w:bookmarkStart w:id="8" w:name="_Ref142557327"/>
-      <w:proofErr w:type="gramStart"/>
       <w:r>
         <w:rPr>
           <w:rFonts w:asciiTheme="minorHAnsi" w:hAnsiTheme="minorHAnsi"/>
@@ -3248,16 +3237,7 @@
           <w:szCs w:val="22"/>
           <w:lang w:val="en-GB"/>
         </w:rPr>
-        <w:t>EN</w:t>
-      </w:r>
-      <w:proofErr w:type="gramEnd"/>
-      <w:r>
-        <w:rPr>
-          <w:rFonts w:asciiTheme="minorHAnsi" w:hAnsiTheme="minorHAnsi"/>
-          <w:szCs w:val="22"/>
-          <w:lang w:val="en-GB"/>
-        </w:rPr>
-        <w:t xml:space="preserve"> 1994-1-1 – Design of composite steel and concrete structures. Part 1-1: General rules and rules for buildings. </w:t>
+        <w:t xml:space="preserve">EN 1994-1-1 – Design of composite steel and concrete structures. Part 1-1: General rules and rules for buildings. </w:t>
       </w:r>
       <w:r>
         <w:rPr>
@@ -3685,13 +3665,8 @@
           <w:numId w:val="80"/>
         </w:numPr>
       </w:pPr>
-      <w:proofErr w:type="gramStart"/>
-      <w:r>
-        <w:t>software</w:t>
-      </w:r>
-      <w:proofErr w:type="gramEnd"/>
-      <w:r>
-        <w:t xml:space="preserve"> output data ;</w:t>
+      <w:r>
+        <w:t>software output data ;</w:t>
       </w:r>
     </w:p>
     <w:p>
@@ -3723,19 +3698,11 @@
           <w:lang w:val="en-US"/>
         </w:rPr>
       </w:pPr>
-      <w:proofErr w:type="gramStart"/>
       <w:r>
         <w:rPr>
           <w:lang w:val="en-US"/>
         </w:rPr>
-        <w:t>the</w:t>
-      </w:r>
-      <w:proofErr w:type="gramEnd"/>
-      <w:r>
-        <w:rPr>
-          <w:lang w:val="en-US"/>
-        </w:rPr>
-        <w:t xml:space="preserve"> comparison between the software output results and those obtained by the reference.</w:t>
+        <w:t>the comparison between the software output results and those obtained by the reference.</w:t>
       </w:r>
     </w:p>
     <w:p>
@@ -10083,16 +10050,8 @@
               <w:rPr>
                 <w:lang w:val="en-US"/>
               </w:rPr>
-              <w:t xml:space="preserve">Verification of web buckling </w:t>
-            </w:r>
-            <w:proofErr w:type="gramStart"/>
-            <w:r>
-              <w:rPr>
-                <w:lang w:val="en-US"/>
-              </w:rPr>
-              <w:t>necessary ?</w:t>
-            </w:r>
-            <w:proofErr w:type="gramEnd"/>
+              <w:t>Verification of web buckling necessary ?</w:t>
+            </w:r>
           </w:p>
         </w:tc>
         <w:tc>
@@ -18948,6 +18907,9 @@
         <w:jc w:val="center"/>
       </w:pPr>
       <w:r>
+        <w:rPr>
+          <w:noProof/>
+        </w:rPr>
         <w:lastRenderedPageBreak/>
         <w:drawing>
           <wp:inline distT="0" distB="0" distL="0" distR="0" wp14:anchorId="04B5A27B" wp14:editId="5229445F">
@@ -29259,6 +29221,9 @@
         <w:jc w:val="center"/>
       </w:pPr>
       <w:r>
+        <w:rPr>
+          <w:noProof/>
+        </w:rPr>
         <w:drawing>
           <wp:inline distT="0" distB="0" distL="0" distR="0" wp14:anchorId="0029E9D5" wp14:editId="6053CF92">
             <wp:extent cx="6416702" cy="1884680"/>
@@ -29398,6 +29363,9 @@
         <w:jc w:val="center"/>
       </w:pPr>
       <w:r>
+        <w:rPr>
+          <w:noProof/>
+        </w:rPr>
         <w:drawing>
           <wp:inline distT="0" distB="0" distL="0" distR="0" wp14:anchorId="64F1CE72" wp14:editId="62E8533F">
             <wp:extent cx="5755971" cy="2326306"/>
@@ -29540,6 +29508,9 @@
         <w:jc w:val="center"/>
       </w:pPr>
       <w:r>
+        <w:rPr>
+          <w:noProof/>
+        </w:rPr>
         <w:lastRenderedPageBreak/>
         <w:drawing>
           <wp:inline distT="0" distB="0" distL="0" distR="0" wp14:anchorId="186F4BD2" wp14:editId="51AF9543">
@@ -29675,6 +29646,9 @@
         <w:jc w:val="center"/>
       </w:pPr>
       <w:r>
+        <w:rPr>
+          <w:noProof/>
+        </w:rPr>
         <w:drawing>
           <wp:inline distT="0" distB="0" distL="0" distR="0" wp14:anchorId="27458392" wp14:editId="2F503195">
             <wp:extent cx="3770847" cy="3494019"/>
@@ -29802,6 +29776,9 @@
         <w:jc w:val="center"/>
       </w:pPr>
       <w:r>
+        <w:rPr>
+          <w:noProof/>
+        </w:rPr>
         <w:lastRenderedPageBreak/>
         <w:drawing>
           <wp:inline distT="0" distB="0" distL="0" distR="0" wp14:anchorId="4E04BA84" wp14:editId="086C57CE">
@@ -29946,6 +29923,9 @@
         <w:jc w:val="center"/>
       </w:pPr>
       <w:r>
+        <w:rPr>
+          <w:noProof/>
+        </w:rPr>
         <w:drawing>
           <wp:inline distT="0" distB="0" distL="0" distR="0" wp14:anchorId="55452930" wp14:editId="6370E6AE">
             <wp:extent cx="6479540" cy="2716530"/>
@@ -30115,6 +30095,9 @@
         <w:jc w:val="center"/>
       </w:pPr>
       <w:r>
+        <w:rPr>
+          <w:noProof/>
+        </w:rPr>
         <w:lastRenderedPageBreak/>
         <w:drawing>
           <wp:inline distT="0" distB="0" distL="0" distR="0" wp14:anchorId="657EF64D" wp14:editId="21DBE39E">
@@ -30389,6 +30372,9 @@
         <w:jc w:val="center"/>
       </w:pPr>
       <w:r>
+        <w:rPr>
+          <w:noProof/>
+        </w:rPr>
         <w:drawing>
           <wp:inline distT="0" distB="0" distL="0" distR="0" wp14:anchorId="633F5605" wp14:editId="06999F03">
             <wp:extent cx="6031717" cy="2536466"/>
@@ -30679,6 +30665,9 @@
         <w:jc w:val="center"/>
       </w:pPr>
       <w:r>
+        <w:rPr>
+          <w:noProof/>
+        </w:rPr>
         <w:drawing>
           <wp:inline distT="0" distB="0" distL="0" distR="0" wp14:anchorId="75E7B9DE" wp14:editId="31DC6E1B">
             <wp:extent cx="5955527" cy="2996440"/>
@@ -30806,6 +30795,9 @@
         <w:jc w:val="center"/>
       </w:pPr>
       <w:r>
+        <w:rPr>
+          <w:noProof/>
+        </w:rPr>
         <w:lastRenderedPageBreak/>
         <w:drawing>
           <wp:inline distT="0" distB="0" distL="0" distR="0" wp14:anchorId="1D61C418" wp14:editId="4D48E248">
@@ -30950,6 +30942,9 @@
         <w:jc w:val="center"/>
       </w:pPr>
       <w:r>
+        <w:rPr>
+          <w:noProof/>
+        </w:rPr>
         <w:drawing>
           <wp:inline distT="0" distB="0" distL="0" distR="0" wp14:anchorId="3528A174" wp14:editId="6A289C5A">
             <wp:extent cx="5980862" cy="3021496"/>
@@ -31093,6 +31088,9 @@
         <w:jc w:val="center"/>
       </w:pPr>
       <w:r>
+        <w:rPr>
+          <w:noProof/>
+        </w:rPr>
         <w:lastRenderedPageBreak/>
         <w:drawing>
           <wp:inline distT="0" distB="0" distL="0" distR="0" wp14:anchorId="61DC970E" wp14:editId="5DFF0771">
@@ -31222,6 +31220,9 @@
       </w:pPr>
       <w:commentRangeStart w:id="29"/>
       <w:r>
+        <w:rPr>
+          <w:noProof/>
+        </w:rPr>
         <w:drawing>
           <wp:inline distT="0" distB="0" distL="0" distR="0" wp14:anchorId="7E12F59F" wp14:editId="0597B032">
             <wp:extent cx="5980862" cy="3021496"/>
@@ -32201,14 +32202,14 @@
     <w:tbl>
       <w:tblPr>
         <w:tblStyle w:val="Grilledutableau"/>
-        <w:tblW w:w="0" w:type="auto"/>
+        <w:tblW w:w="10369" w:type="dxa"/>
         <w:tblLook w:val="04A0" w:firstRow="1" w:lastRow="0" w:firstColumn="1" w:lastColumn="0" w:noHBand="0" w:noVBand="1"/>
       </w:tblPr>
       <w:tblGrid>
         <w:gridCol w:w="6637"/>
         <w:gridCol w:w="1397"/>
         <w:gridCol w:w="1384"/>
-        <w:gridCol w:w="776"/>
+        <w:gridCol w:w="951"/>
       </w:tblGrid>
       <w:tr>
         <w:tc>
@@ -32255,7 +32256,7 @@
         </w:tc>
         <w:tc>
           <w:tcPr>
-            <w:tcW w:w="776" w:type="dxa"/>
+            <w:tcW w:w="951" w:type="dxa"/>
             <w:shd w:val="clear" w:color="auto" w:fill="D9D9D9" w:themeFill="background1" w:themeFillShade="D9"/>
           </w:tcPr>
           <w:p>
@@ -32335,6 +32336,12 @@
                 <w:lang w:val="en-US"/>
               </w:rPr>
             </w:pPr>
+            <w:r>
+              <w:rPr>
+                <w:lang w:val="en-US"/>
+              </w:rPr>
+              <w:t>101.3</w:t>
+            </w:r>
           </w:p>
         </w:tc>
         <w:tc>
@@ -32360,12 +32367,20 @@
         </w:tc>
         <w:tc>
           <w:tcPr>
-            <w:tcW w:w="776" w:type="dxa"/>
-          </w:tcPr>
-          <w:p>
-            <w:pPr>
-              <w:jc w:val="center"/>
-            </w:pPr>
+            <w:tcW w:w="951" w:type="dxa"/>
+            <w:vAlign w:val="center"/>
+          </w:tcPr>
+          <w:p>
+            <w:pPr>
+              <w:jc w:val="center"/>
+            </w:pPr>
+            <w:r>
+              <w:rPr>
+                <w:i/>
+                <w:color w:val="C00000"/>
+              </w:rPr>
+              <w:t>0.15%</w:t>
+            </w:r>
           </w:p>
         </w:tc>
       </w:tr>
@@ -32460,6 +32475,12 @@
                 <w:lang w:val="en-US"/>
               </w:rPr>
             </w:pPr>
+            <w:r>
+              <w:rPr>
+                <w:lang w:val="en-US"/>
+              </w:rPr>
+              <w:t>50.6</w:t>
+            </w:r>
           </w:p>
         </w:tc>
         <w:tc>
@@ -32485,16 +32506,23 @@
         </w:tc>
         <w:tc>
           <w:tcPr>
-            <w:tcW w:w="776" w:type="dxa"/>
-          </w:tcPr>
-          <w:p>
-            <w:pPr>
-              <w:jc w:val="center"/>
-              <w:rPr>
-                <w:i/>
-                <w:color w:val="C00000"/>
-              </w:rPr>
-            </w:pPr>
+            <w:tcW w:w="951" w:type="dxa"/>
+          </w:tcPr>
+          <w:p>
+            <w:pPr>
+              <w:jc w:val="center"/>
+              <w:rPr>
+                <w:i/>
+                <w:color w:val="C00000"/>
+              </w:rPr>
+            </w:pPr>
+            <w:r>
+              <w:rPr>
+                <w:i/>
+                <w:color w:val="C00000"/>
+              </w:rPr>
+              <w:t>0.32%</w:t>
+            </w:r>
           </w:p>
         </w:tc>
       </w:tr>
@@ -32589,6 +32617,12 @@
                 <w:lang w:val="en-US"/>
               </w:rPr>
             </w:pPr>
+            <w:r>
+              <w:rPr>
+                <w:lang w:val="en-US"/>
+              </w:rPr>
+              <w:t>43 014</w:t>
+            </w:r>
           </w:p>
         </w:tc>
         <w:tc>
@@ -32614,16 +32648,23 @@
         </w:tc>
         <w:tc>
           <w:tcPr>
-            <w:tcW w:w="776" w:type="dxa"/>
-          </w:tcPr>
-          <w:p>
-            <w:pPr>
-              <w:jc w:val="center"/>
-              <w:rPr>
-                <w:i/>
-                <w:color w:val="C00000"/>
-              </w:rPr>
-            </w:pPr>
+            <w:tcW w:w="951" w:type="dxa"/>
+          </w:tcPr>
+          <w:p>
+            <w:pPr>
+              <w:jc w:val="center"/>
+              <w:rPr>
+                <w:i/>
+                <w:color w:val="C00000"/>
+              </w:rPr>
+            </w:pPr>
+            <w:r>
+              <w:rPr>
+                <w:i/>
+                <w:color w:val="C00000"/>
+              </w:rPr>
+              <w:t>0.19%</w:t>
+            </w:r>
           </w:p>
         </w:tc>
       </w:tr>
@@ -32718,6 +32759,12 @@
                 <w:lang w:val="en-US"/>
               </w:rPr>
             </w:pPr>
+            <w:r>
+              <w:rPr>
+                <w:lang w:val="en-US"/>
+              </w:rPr>
+              <w:t>1 940</w:t>
+            </w:r>
           </w:p>
         </w:tc>
         <w:tc>
@@ -32743,12 +32790,19 @@
         </w:tc>
         <w:tc>
           <w:tcPr>
-            <w:tcW w:w="776" w:type="dxa"/>
-          </w:tcPr>
-          <w:p>
-            <w:pPr>
-              <w:jc w:val="center"/>
-            </w:pPr>
+            <w:tcW w:w="951" w:type="dxa"/>
+          </w:tcPr>
+          <w:p>
+            <w:pPr>
+              <w:jc w:val="center"/>
+            </w:pPr>
+            <w:r>
+              <w:rPr>
+                <w:i/>
+                <w:color w:val="C00000"/>
+              </w:rPr>
+              <w:t>0.18%</w:t>
+            </w:r>
           </w:p>
         </w:tc>
       </w:tr>
@@ -32823,6 +32877,9 @@
             <w:pPr>
               <w:jc w:val="center"/>
             </w:pPr>
+            <w:r>
+              <w:t>1 731</w:t>
+            </w:r>
           </w:p>
         </w:tc>
         <w:tc>
@@ -32848,12 +32905,19 @@
         </w:tc>
         <w:tc>
           <w:tcPr>
-            <w:tcW w:w="776" w:type="dxa"/>
-          </w:tcPr>
-          <w:p>
-            <w:pPr>
-              <w:jc w:val="center"/>
-            </w:pPr>
+            <w:tcW w:w="951" w:type="dxa"/>
+          </w:tcPr>
+          <w:p>
+            <w:pPr>
+              <w:jc w:val="center"/>
+            </w:pPr>
+            <w:r>
+              <w:rPr>
+                <w:i/>
+                <w:color w:val="C00000"/>
+              </w:rPr>
+              <w:t>0.17%</w:t>
+            </w:r>
           </w:p>
         </w:tc>
       </w:tr>
@@ -32948,6 +33012,12 @@
                 <w:lang w:val="en-US"/>
               </w:rPr>
             </w:pPr>
+            <w:r>
+              <w:rPr>
+                <w:lang w:val="en-US"/>
+              </w:rPr>
+              <w:t>194.0</w:t>
+            </w:r>
           </w:p>
         </w:tc>
         <w:tc>
@@ -32973,12 +33043,19 @@
         </w:tc>
         <w:tc>
           <w:tcPr>
-            <w:tcW w:w="776" w:type="dxa"/>
-          </w:tcPr>
-          <w:p>
-            <w:pPr>
-              <w:jc w:val="center"/>
-            </w:pPr>
+            <w:tcW w:w="951" w:type="dxa"/>
+          </w:tcPr>
+          <w:p>
+            <w:pPr>
+              <w:jc w:val="center"/>
+            </w:pPr>
+            <w:r>
+              <w:rPr>
+                <w:i/>
+                <w:color w:val="C00000"/>
+              </w:rPr>
+              <w:t>0.18%</w:t>
+            </w:r>
           </w:p>
         </w:tc>
       </w:tr>
@@ -33053,6 +33130,9 @@
             <w:pPr>
               <w:jc w:val="center"/>
             </w:pPr>
+            <w:r>
+              <w:t>1 950</w:t>
+            </w:r>
           </w:p>
         </w:tc>
         <w:tc>
@@ -33078,12 +33158,19 @@
         </w:tc>
         <w:tc>
           <w:tcPr>
-            <w:tcW w:w="776" w:type="dxa"/>
-          </w:tcPr>
-          <w:p>
-            <w:pPr>
-              <w:jc w:val="center"/>
-            </w:pPr>
+            <w:tcW w:w="951" w:type="dxa"/>
+          </w:tcPr>
+          <w:p>
+            <w:pPr>
+              <w:jc w:val="center"/>
+            </w:pPr>
+            <w:r>
+              <w:rPr>
+                <w:i/>
+                <w:color w:val="C00000"/>
+              </w:rPr>
+              <w:t>0.18%</w:t>
+            </w:r>
           </w:p>
         </w:tc>
       </w:tr>
@@ -33158,6 +33245,9 @@
             <w:pPr>
               <w:jc w:val="center"/>
             </w:pPr>
+            <w:r>
+              <w:t>301.7</w:t>
+            </w:r>
           </w:p>
         </w:tc>
         <w:tc>
@@ -33183,12 +33273,19 @@
         </w:tc>
         <w:tc>
           <w:tcPr>
-            <w:tcW w:w="776" w:type="dxa"/>
-          </w:tcPr>
-          <w:p>
-            <w:pPr>
-              <w:jc w:val="center"/>
-            </w:pPr>
+            <w:tcW w:w="951" w:type="dxa"/>
+          </w:tcPr>
+          <w:p>
+            <w:pPr>
+              <w:jc w:val="center"/>
+            </w:pPr>
+            <w:r>
+              <w:rPr>
+                <w:i/>
+                <w:color w:val="C00000"/>
+              </w:rPr>
+              <w:t>1.15%</w:t>
+            </w:r>
           </w:p>
         </w:tc>
       </w:tr>
@@ -33263,6 +33360,9 @@
             <w:pPr>
               <w:jc w:val="center"/>
             </w:pPr>
+            <w:r>
+              <w:t>64.18</w:t>
+            </w:r>
           </w:p>
         </w:tc>
         <w:tc>
@@ -33288,16 +33388,23 @@
         </w:tc>
         <w:tc>
           <w:tcPr>
-            <w:tcW w:w="776" w:type="dxa"/>
-          </w:tcPr>
-          <w:p>
-            <w:pPr>
-              <w:jc w:val="center"/>
-              <w:rPr>
-                <w:i/>
-                <w:color w:val="C00000"/>
-              </w:rPr>
-            </w:pPr>
+            <w:tcW w:w="951" w:type="dxa"/>
+          </w:tcPr>
+          <w:p>
+            <w:pPr>
+              <w:jc w:val="center"/>
+              <w:rPr>
+                <w:i/>
+                <w:color w:val="C00000"/>
+              </w:rPr>
+            </w:pPr>
+            <w:r>
+              <w:rPr>
+                <w:i/>
+                <w:color w:val="C00000"/>
+              </w:rPr>
+              <w:t>-0.16%</w:t>
+            </w:r>
           </w:p>
         </w:tc>
       </w:tr>
@@ -33393,6 +33500,12 @@
                 <w:lang w:val="en-US"/>
               </w:rPr>
             </w:pPr>
+            <w:r>
+              <w:rPr>
+                <w:lang w:val="en-US"/>
+              </w:rPr>
+              <w:t>1 113 252</w:t>
+            </w:r>
           </w:p>
         </w:tc>
         <w:tc>
@@ -33418,12 +33531,19 @@
         </w:tc>
         <w:tc>
           <w:tcPr>
-            <w:tcW w:w="776" w:type="dxa"/>
-          </w:tcPr>
-          <w:p>
-            <w:pPr>
-              <w:jc w:val="center"/>
-            </w:pPr>
+            <w:tcW w:w="951" w:type="dxa"/>
+          </w:tcPr>
+          <w:p>
+            <w:pPr>
+              <w:jc w:val="center"/>
+            </w:pPr>
+            <w:r>
+              <w:rPr>
+                <w:i/>
+                <w:color w:val="C00000"/>
+              </w:rPr>
+              <w:t>-1.06%</w:t>
+            </w:r>
           </w:p>
         </w:tc>
       </w:tr>
@@ -33505,6 +33625,12 @@
                 <w:lang w:val="en-US"/>
               </w:rPr>
             </w:pPr>
+            <w:r>
+              <w:rPr>
+                <w:lang w:val="en-US"/>
+              </w:rPr>
+              <w:t>79.5</w:t>
+            </w:r>
           </w:p>
         </w:tc>
         <w:tc>
@@ -33530,12 +33656,19 @@
         </w:tc>
         <w:tc>
           <w:tcPr>
-            <w:tcW w:w="776" w:type="dxa"/>
-          </w:tcPr>
-          <w:p>
-            <w:pPr>
-              <w:jc w:val="center"/>
-            </w:pPr>
+            <w:tcW w:w="951" w:type="dxa"/>
+          </w:tcPr>
+          <w:p>
+            <w:pPr>
+              <w:jc w:val="center"/>
+            </w:pPr>
+            <w:r>
+              <w:rPr>
+                <w:i/>
+                <w:color w:val="C00000"/>
+              </w:rPr>
+              <w:t>6.12%</w:t>
+            </w:r>
           </w:p>
         </w:tc>
       </w:tr>
@@ -33578,6 +33711,9 @@
             <w:pPr>
               <w:jc w:val="center"/>
             </w:pPr>
+            <w:r>
+              <w:t>994</w:t>
+            </w:r>
           </w:p>
         </w:tc>
         <w:tc>
@@ -33603,12 +33739,19 @@
         </w:tc>
         <w:tc>
           <w:tcPr>
-            <w:tcW w:w="776" w:type="dxa"/>
-          </w:tcPr>
-          <w:p>
-            <w:pPr>
-              <w:jc w:val="center"/>
-            </w:pPr>
+            <w:tcW w:w="951" w:type="dxa"/>
+          </w:tcPr>
+          <w:p>
+            <w:pPr>
+              <w:jc w:val="center"/>
+            </w:pPr>
+            <w:r>
+              <w:rPr>
+                <w:i/>
+                <w:color w:val="C00000"/>
+              </w:rPr>
+              <w:t>0.16%</w:t>
+            </w:r>
           </w:p>
         </w:tc>
       </w:tr>
@@ -33660,6 +33803,9 @@
             <w:pPr>
               <w:jc w:val="center"/>
             </w:pPr>
+            <w:r>
+              <w:t>217 643</w:t>
+            </w:r>
           </w:p>
         </w:tc>
         <w:tc>
@@ -33685,12 +33831,15 @@
         </w:tc>
         <w:tc>
           <w:tcPr>
-            <w:tcW w:w="776" w:type="dxa"/>
-          </w:tcPr>
-          <w:p>
-            <w:pPr>
-              <w:jc w:val="center"/>
-            </w:pPr>
+            <w:tcW w:w="951" w:type="dxa"/>
+          </w:tcPr>
+          <w:p>
+            <w:pPr>
+              <w:jc w:val="center"/>
+            </w:pPr>
+            <w:r>
+              <w:t>0.00%</w:t>
+            </w:r>
           </w:p>
         </w:tc>
       </w:tr>
@@ -33761,6 +33910,12 @@
                 <w:lang w:val="en-US"/>
               </w:rPr>
             </w:pPr>
+            <w:r>
+              <w:rPr>
+                <w:lang w:val="en-US"/>
+              </w:rPr>
+              <w:t>192 643</w:t>
+            </w:r>
           </w:p>
         </w:tc>
         <w:tc>
@@ -33786,12 +33941,15 @@
         </w:tc>
         <w:tc>
           <w:tcPr>
-            <w:tcW w:w="776" w:type="dxa"/>
-          </w:tcPr>
-          <w:p>
-            <w:pPr>
-              <w:jc w:val="center"/>
-            </w:pPr>
+            <w:tcW w:w="951" w:type="dxa"/>
+          </w:tcPr>
+          <w:p>
+            <w:pPr>
+              <w:jc w:val="center"/>
+            </w:pPr>
+            <w:r>
+              <w:t>0.00%</w:t>
+            </w:r>
           </w:p>
         </w:tc>
       </w:tr>
@@ -33843,6 +34001,9 @@
             <w:pPr>
               <w:jc w:val="center"/>
             </w:pPr>
+            <w:r>
+              <w:t>171.9</w:t>
+            </w:r>
           </w:p>
         </w:tc>
         <w:tc>
@@ -33868,12 +34029,19 @@
         </w:tc>
         <w:tc>
           <w:tcPr>
-            <w:tcW w:w="776" w:type="dxa"/>
-          </w:tcPr>
-          <w:p>
-            <w:pPr>
-              <w:jc w:val="center"/>
-            </w:pPr>
+            <w:tcW w:w="951" w:type="dxa"/>
+          </w:tcPr>
+          <w:p>
+            <w:pPr>
+              <w:jc w:val="center"/>
+            </w:pPr>
+            <w:r>
+              <w:rPr>
+                <w:i/>
+                <w:color w:val="C00000"/>
+              </w:rPr>
+              <w:t>-0.14%</w:t>
+            </w:r>
           </w:p>
         </w:tc>
       </w:tr>
@@ -33944,6 +34112,12 @@
                 <w:lang w:val="en-US"/>
               </w:rPr>
             </w:pPr>
+            <w:r>
+              <w:rPr>
+                <w:lang w:val="en-US"/>
+              </w:rPr>
+              <w:t>152.1</w:t>
+            </w:r>
           </w:p>
         </w:tc>
         <w:tc>
@@ -33969,12 +34143,19 @@
         </w:tc>
         <w:tc>
           <w:tcPr>
-            <w:tcW w:w="776" w:type="dxa"/>
-          </w:tcPr>
-          <w:p>
-            <w:pPr>
-              <w:jc w:val="center"/>
-            </w:pPr>
+            <w:tcW w:w="951" w:type="dxa"/>
+          </w:tcPr>
+          <w:p>
+            <w:pPr>
+              <w:jc w:val="center"/>
+            </w:pPr>
+            <w:r>
+              <w:rPr>
+                <w:i/>
+                <w:color w:val="C00000"/>
+              </w:rPr>
+              <w:t>-0.13%</w:t>
+            </w:r>
           </w:p>
         </w:tc>
       </w:tr>
@@ -34062,6 +34243,12 @@
                 <w:lang w:val="en-US"/>
               </w:rPr>
             </w:pPr>
+            <w:r>
+              <w:rPr>
+                <w:lang w:val="en-US"/>
+              </w:rPr>
+              <w:t>355</w:t>
+            </w:r>
           </w:p>
         </w:tc>
         <w:tc>
@@ -34087,12 +34274,19 @@
         </w:tc>
         <w:tc>
           <w:tcPr>
-            <w:tcW w:w="776" w:type="dxa"/>
-          </w:tcPr>
-          <w:p>
-            <w:pPr>
-              <w:jc w:val="center"/>
-            </w:pPr>
+            <w:tcW w:w="951" w:type="dxa"/>
+          </w:tcPr>
+          <w:p>
+            <w:pPr>
+              <w:jc w:val="center"/>
+            </w:pPr>
+            <w:r>
+              <w:rPr>
+                <w:i/>
+                <w:color w:val="C00000"/>
+              </w:rPr>
+              <w:t>0.00%</w:t>
+            </w:r>
           </w:p>
         </w:tc>
       </w:tr>
@@ -34138,6 +34332,9 @@
             <w:pPr>
               <w:jc w:val="center"/>
             </w:pPr>
+            <w:r>
+              <w:t>210 000</w:t>
+            </w:r>
           </w:p>
         </w:tc>
         <w:tc>
@@ -34163,12 +34360,15 @@
         </w:tc>
         <w:tc>
           <w:tcPr>
-            <w:tcW w:w="776" w:type="dxa"/>
-          </w:tcPr>
-          <w:p>
-            <w:pPr>
-              <w:jc w:val="center"/>
-            </w:pPr>
+            <w:tcW w:w="951" w:type="dxa"/>
+          </w:tcPr>
+          <w:p>
+            <w:pPr>
+              <w:jc w:val="center"/>
+            </w:pPr>
+            <w:r>
+              <w:t>0.00%</w:t>
+            </w:r>
           </w:p>
         </w:tc>
       </w:tr>
@@ -34223,6 +34423,9 @@
             <w:pPr>
               <w:jc w:val="center"/>
             </w:pPr>
+            <w:r>
+              <w:t>7 850</w:t>
+            </w:r>
           </w:p>
         </w:tc>
         <w:tc>
@@ -34248,12 +34451,15 @@
         </w:tc>
         <w:tc>
           <w:tcPr>
-            <w:tcW w:w="776" w:type="dxa"/>
-          </w:tcPr>
-          <w:p>
-            <w:pPr>
-              <w:jc w:val="center"/>
-            </w:pPr>
+            <w:tcW w:w="951" w:type="dxa"/>
+          </w:tcPr>
+          <w:p>
+            <w:pPr>
+              <w:jc w:val="center"/>
+            </w:pPr>
+            <w:r>
+              <w:t>0.00%</w:t>
+            </w:r>
           </w:p>
         </w:tc>
       </w:tr>
@@ -34322,6 +34528,9 @@
             <w:pPr>
               <w:jc w:val="center"/>
             </w:pPr>
+            <w:r>
+              <w:t>3 596</w:t>
+            </w:r>
           </w:p>
         </w:tc>
         <w:tc>
@@ -34347,12 +34556,19 @@
         </w:tc>
         <w:tc>
           <w:tcPr>
-            <w:tcW w:w="776" w:type="dxa"/>
-          </w:tcPr>
-          <w:p>
-            <w:pPr>
-              <w:jc w:val="center"/>
-            </w:pPr>
+            <w:tcW w:w="951" w:type="dxa"/>
+          </w:tcPr>
+          <w:p>
+            <w:pPr>
+              <w:jc w:val="center"/>
+            </w:pPr>
+            <w:r>
+              <w:rPr>
+                <w:i/>
+                <w:color w:val="C00000"/>
+              </w:rPr>
+              <w:t>0.15%</w:t>
+            </w:r>
           </w:p>
         </w:tc>
       </w:tr>
@@ -34440,6 +34656,12 @@
                 <w:lang w:val="en-US"/>
               </w:rPr>
             </w:pPr>
+            <w:r>
+              <w:rPr>
+                <w:lang w:val="en-US"/>
+              </w:rPr>
+              <w:t>1 037</w:t>
+            </w:r>
           </w:p>
         </w:tc>
         <w:tc>
@@ -34465,12 +34687,19 @@
         </w:tc>
         <w:tc>
           <w:tcPr>
-            <w:tcW w:w="776" w:type="dxa"/>
-          </w:tcPr>
-          <w:p>
-            <w:pPr>
-              <w:jc w:val="center"/>
-            </w:pPr>
+            <w:tcW w:w="951" w:type="dxa"/>
+          </w:tcPr>
+          <w:p>
+            <w:pPr>
+              <w:jc w:val="center"/>
+            </w:pPr>
+            <w:r>
+              <w:rPr>
+                <w:i/>
+                <w:color w:val="C00000"/>
+              </w:rPr>
+              <w:t>0.32%</w:t>
+            </w:r>
           </w:p>
         </w:tc>
       </w:tr>
@@ -34558,6 +34787,12 @@
                 <w:lang w:val="en-US"/>
               </w:rPr>
             </w:pPr>
+            <w:r>
+              <w:rPr>
+                <w:lang w:val="en-US"/>
+              </w:rPr>
+              <w:t>692</w:t>
+            </w:r>
           </w:p>
         </w:tc>
         <w:tc>
@@ -34583,12 +34818,19 @@
         </w:tc>
         <w:tc>
           <w:tcPr>
-            <w:tcW w:w="776" w:type="dxa"/>
-          </w:tcPr>
-          <w:p>
-            <w:pPr>
-              <w:jc w:val="center"/>
-            </w:pPr>
+            <w:tcW w:w="951" w:type="dxa"/>
+          </w:tcPr>
+          <w:p>
+            <w:pPr>
+              <w:jc w:val="center"/>
+            </w:pPr>
+            <w:r>
+              <w:rPr>
+                <w:i/>
+                <w:color w:val="C00000"/>
+              </w:rPr>
+              <w:t>0.16%</w:t>
+            </w:r>
           </w:p>
         </w:tc>
       </w:tr>
@@ -34676,6 +34918,12 @@
                 <w:lang w:val="en-US"/>
               </w:rPr>
             </w:pPr>
+            <w:r>
+              <w:rPr>
+                <w:lang w:val="en-US"/>
+              </w:rPr>
+              <w:t>614</w:t>
+            </w:r>
           </w:p>
         </w:tc>
         <w:tc>
@@ -34701,16 +34949,23 @@
         </w:tc>
         <w:tc>
           <w:tcPr>
-            <w:tcW w:w="776" w:type="dxa"/>
-          </w:tcPr>
-          <w:p>
-            <w:pPr>
-              <w:jc w:val="center"/>
-              <w:rPr>
-                <w:i/>
-                <w:color w:val="C00000"/>
-              </w:rPr>
-            </w:pPr>
+            <w:tcW w:w="951" w:type="dxa"/>
+          </w:tcPr>
+          <w:p>
+            <w:pPr>
+              <w:jc w:val="center"/>
+              <w:rPr>
+                <w:i/>
+                <w:color w:val="C00000"/>
+              </w:rPr>
+            </w:pPr>
+            <w:r>
+              <w:rPr>
+                <w:i/>
+                <w:color w:val="C00000"/>
+              </w:rPr>
+              <w:t>0.24%</w:t>
+            </w:r>
           </w:p>
         </w:tc>
       </w:tr>
@@ -34741,6 +34996,9 @@
             <w:pPr>
               <w:jc w:val="center"/>
             </w:pPr>
+            <w:r>
+              <w:t>1</w:t>
+            </w:r>
           </w:p>
         </w:tc>
         <w:tc>
@@ -34766,12 +35024,15 @@
         </w:tc>
         <w:tc>
           <w:tcPr>
-            <w:tcW w:w="776" w:type="dxa"/>
-          </w:tcPr>
-          <w:p>
-            <w:pPr>
-              <w:jc w:val="center"/>
-            </w:pPr>
+            <w:tcW w:w="951" w:type="dxa"/>
+          </w:tcPr>
+          <w:p>
+            <w:pPr>
+              <w:jc w:val="center"/>
+            </w:pPr>
+            <w:r>
+              <w:t>0.00%</w:t>
+            </w:r>
           </w:p>
         </w:tc>
       </w:tr>
@@ -34802,6 +35063,9 @@
             <w:pPr>
               <w:jc w:val="center"/>
             </w:pPr>
+            <w:r>
+              <w:t>4</w:t>
+            </w:r>
           </w:p>
         </w:tc>
         <w:tc>
@@ -34827,12 +35091,15 @@
         </w:tc>
         <w:tc>
           <w:tcPr>
-            <w:tcW w:w="776" w:type="dxa"/>
-          </w:tcPr>
-          <w:p>
-            <w:pPr>
-              <w:jc w:val="center"/>
-            </w:pPr>
+            <w:tcW w:w="951" w:type="dxa"/>
+          </w:tcPr>
+          <w:p>
+            <w:pPr>
+              <w:jc w:val="center"/>
+            </w:pPr>
+            <w:r>
+              <w:t>0.00%</w:t>
+            </w:r>
           </w:p>
         </w:tc>
       </w:tr>
@@ -34951,6 +35218,12 @@
                 <w:lang w:val="en-US"/>
               </w:rPr>
             </w:pPr>
+            <w:r>
+              <w:rPr>
+                <w:lang w:val="en-US"/>
+              </w:rPr>
+              <w:t>50.7</w:t>
+            </w:r>
           </w:p>
         </w:tc>
         <w:tc>
@@ -34977,12 +35250,18 @@
         </w:tc>
         <w:tc>
           <w:tcPr>
-            <w:tcW w:w="776" w:type="dxa"/>
-          </w:tcPr>
-          <w:p>
-            <w:pPr>
-              <w:jc w:val="center"/>
-            </w:pPr>
+            <w:tcW w:w="951" w:type="dxa"/>
+          </w:tcPr>
+          <w:p>
+            <w:pPr>
+              <w:jc w:val="center"/>
+            </w:pPr>
+            <w:r>
+              <w:rPr>
+                <w:lang w:val="en-US"/>
+              </w:rPr>
+              <w:t>0.00%</w:t>
+            </w:r>
           </w:p>
         </w:tc>
       </w:tr>
@@ -35059,6 +35338,12 @@
                 <w:lang w:val="en-US"/>
               </w:rPr>
             </w:pPr>
+            <w:r>
+              <w:rPr>
+                <w:lang w:val="en-US"/>
+              </w:rPr>
+              <w:t>101</w:t>
+            </w:r>
           </w:p>
         </w:tc>
         <w:tc>
@@ -35085,12 +35370,18 @@
         </w:tc>
         <w:tc>
           <w:tcPr>
-            <w:tcW w:w="776" w:type="dxa"/>
-          </w:tcPr>
-          <w:p>
-            <w:pPr>
-              <w:jc w:val="center"/>
-            </w:pPr>
+            <w:tcW w:w="951" w:type="dxa"/>
+          </w:tcPr>
+          <w:p>
+            <w:pPr>
+              <w:jc w:val="center"/>
+            </w:pPr>
+            <w:r>
+              <w:rPr>
+                <w:lang w:val="en-US"/>
+              </w:rPr>
+              <w:t>0.00%</w:t>
+            </w:r>
           </w:p>
         </w:tc>
       </w:tr>
@@ -35112,16 +35403,8 @@
               <w:rPr>
                 <w:lang w:val="en-US"/>
               </w:rPr>
-              <w:t xml:space="preserve">Verification of web buckling </w:t>
-            </w:r>
-            <w:proofErr w:type="gramStart"/>
-            <w:r>
-              <w:rPr>
-                <w:lang w:val="en-US"/>
-              </w:rPr>
-              <w:t>necessary ?</w:t>
-            </w:r>
-            <w:proofErr w:type="gramEnd"/>
+              <w:t>Verification of web buckling necessary ?</w:t>
+            </w:r>
           </w:p>
         </w:tc>
         <w:tc>
@@ -35135,6 +35418,12 @@
                 <w:lang w:val="en-US"/>
               </w:rPr>
             </w:pPr>
+            <w:r>
+              <w:rPr>
+                <w:lang w:val="en-US"/>
+              </w:rPr>
+              <w:t>No</w:t>
+            </w:r>
           </w:p>
         </w:tc>
         <w:tc>
@@ -35161,12 +35450,18 @@
         </w:tc>
         <w:tc>
           <w:tcPr>
-            <w:tcW w:w="776" w:type="dxa"/>
-          </w:tcPr>
-          <w:p>
-            <w:pPr>
-              <w:jc w:val="center"/>
-            </w:pPr>
+            <w:tcW w:w="951" w:type="dxa"/>
+          </w:tcPr>
+          <w:p>
+            <w:pPr>
+              <w:jc w:val="center"/>
+            </w:pPr>
+            <w:r>
+              <w:rPr>
+                <w:lang w:val="en-US"/>
+              </w:rPr>
+              <w:t>OK</w:t>
+            </w:r>
           </w:p>
         </w:tc>
       </w:tr>
@@ -36080,6 +36375,9 @@
             <w:pPr>
               <w:jc w:val="center"/>
             </w:pPr>
+            <w:r>
+              <w:t>164</w:t>
+            </w:r>
           </w:p>
         </w:tc>
         <w:tc>
@@ -36111,6 +36409,9 @@
             <w:pPr>
               <w:jc w:val="center"/>
             </w:pPr>
+            <w:r>
+              <w:t>0.00%</w:t>
+            </w:r>
           </w:p>
         </w:tc>
       </w:tr>
@@ -36193,6 +36494,12 @@
                 <w:lang w:val="en-US"/>
               </w:rPr>
             </w:pPr>
+            <w:r>
+              <w:rPr>
+                <w:lang w:val="en-US"/>
+              </w:rPr>
+              <w:t>25</w:t>
+            </w:r>
           </w:p>
         </w:tc>
         <w:tc>
@@ -36224,6 +36531,9 @@
             <w:pPr>
               <w:jc w:val="center"/>
             </w:pPr>
+            <w:r>
+              <w:t>0.00%</w:t>
+            </w:r>
           </w:p>
         </w:tc>
       </w:tr>
@@ -36306,6 +36616,12 @@
                 <w:lang w:val="en-US"/>
               </w:rPr>
             </w:pPr>
+            <w:r>
+              <w:rPr>
+                <w:lang w:val="en-US"/>
+              </w:rPr>
+              <w:t>33</w:t>
+            </w:r>
           </w:p>
         </w:tc>
         <w:tc>
@@ -36337,6 +36653,9 @@
             <w:pPr>
               <w:jc w:val="center"/>
             </w:pPr>
+            <w:r>
+              <w:t>0.00%</w:t>
+            </w:r>
           </w:p>
         </w:tc>
       </w:tr>
@@ -36420,6 +36739,12 @@
                 <w:lang w:val="en-US"/>
               </w:rPr>
             </w:pPr>
+            <w:r>
+              <w:rPr>
+                <w:lang w:val="en-US"/>
+              </w:rPr>
+              <w:t>2.56</w:t>
+            </w:r>
           </w:p>
         </w:tc>
         <w:tc>
@@ -36451,6 +36776,9 @@
             <w:pPr>
               <w:jc w:val="center"/>
             </w:pPr>
+            <w:r>
+              <w:t>0.00%</w:t>
+            </w:r>
           </w:p>
         </w:tc>
       </w:tr>
@@ -36533,6 +36861,12 @@
                 <w:lang w:val="en-US"/>
               </w:rPr>
             </w:pPr>
+            <w:r>
+              <w:rPr>
+                <w:lang w:val="en-US"/>
+              </w:rPr>
+              <w:t>31 476</w:t>
+            </w:r>
           </w:p>
         </w:tc>
         <w:tc>
@@ -36564,6 +36898,9 @@
             <w:pPr>
               <w:jc w:val="center"/>
             </w:pPr>
+            <w:r>
+              <w:t>0.00%</w:t>
+            </w:r>
           </w:p>
         </w:tc>
       </w:tr>
@@ -36667,6 +37004,12 @@
                 <w:lang w:val="en-US"/>
               </w:rPr>
             </w:pPr>
+            <w:r>
+              <w:rPr>
+                <w:lang w:val="en-US"/>
+              </w:rPr>
+              <w:t>60.08</w:t>
+            </w:r>
           </w:p>
         </w:tc>
         <w:tc>
@@ -36698,6 +37041,9 @@
             <w:pPr>
               <w:jc w:val="center"/>
             </w:pPr>
+            <w:r>
+              <w:t>0.00%</w:t>
+            </w:r>
           </w:p>
         </w:tc>
       </w:tr>
@@ -36782,6 +37128,12 @@
                 <w:lang w:val="en-US"/>
               </w:rPr>
             </w:pPr>
+            <w:r>
+              <w:rPr>
+                <w:lang w:val="en-US"/>
+              </w:rPr>
+              <w:t>37.4</w:t>
+            </w:r>
           </w:p>
         </w:tc>
         <w:tc>
@@ -36813,6 +37165,9 @@
             <w:pPr>
               <w:jc w:val="center"/>
             </w:pPr>
+            <w:r>
+              <w:t>0.00%</w:t>
+            </w:r>
           </w:p>
         </w:tc>
       </w:tr>
@@ -36876,6 +37231,9 @@
             <w:pPr>
               <w:jc w:val="center"/>
             </w:pPr>
+            <w:r>
+              <w:t>0.50</w:t>
+            </w:r>
           </w:p>
         </w:tc>
         <w:tc>
@@ -36907,6 +37265,9 @@
             <w:pPr>
               <w:jc w:val="center"/>
             </w:pPr>
+            <w:r>
+              <w:t>0.00%</w:t>
+            </w:r>
           </w:p>
         </w:tc>
       </w:tr>
@@ -36943,14 +37304,14 @@
     <w:tbl>
       <w:tblPr>
         <w:tblStyle w:val="Grilledutableau"/>
-        <w:tblW w:w="10155" w:type="dxa"/>
+        <w:tblW w:w="10332" w:type="dxa"/>
         <w:tblLook w:val="04A0" w:firstRow="1" w:lastRow="0" w:firstColumn="1" w:lastColumn="0" w:noHBand="0" w:noVBand="1"/>
       </w:tblPr>
       <w:tblGrid>
         <w:gridCol w:w="6605"/>
         <w:gridCol w:w="1395"/>
         <w:gridCol w:w="1381"/>
-        <w:gridCol w:w="774"/>
+        <w:gridCol w:w="951"/>
       </w:tblGrid>
       <w:tr>
         <w:tc>
@@ -36997,7 +37358,7 @@
         </w:tc>
         <w:tc>
           <w:tcPr>
-            <w:tcW w:w="774" w:type="dxa"/>
+            <w:tcW w:w="951" w:type="dxa"/>
             <w:shd w:val="clear" w:color="auto" w:fill="D9D9D9" w:themeFill="background1" w:themeFillShade="D9"/>
           </w:tcPr>
           <w:p>
@@ -37091,6 +37452,12 @@
                 <w:lang w:val="en-US"/>
               </w:rPr>
             </w:pPr>
+            <w:r>
+              <w:rPr>
+                <w:lang w:val="en-US"/>
+              </w:rPr>
+              <w:t>2.50</w:t>
+            </w:r>
           </w:p>
         </w:tc>
         <w:tc>
@@ -37114,12 +37481,15 @@
         </w:tc>
         <w:tc>
           <w:tcPr>
-            <w:tcW w:w="774" w:type="dxa"/>
-          </w:tcPr>
-          <w:p>
-            <w:pPr>
-              <w:jc w:val="center"/>
-            </w:pPr>
+            <w:tcW w:w="951" w:type="dxa"/>
+          </w:tcPr>
+          <w:p>
+            <w:pPr>
+              <w:jc w:val="center"/>
+            </w:pPr>
+            <w:r>
+              <w:t>0.00%</w:t>
+            </w:r>
           </w:p>
         </w:tc>
       </w:tr>
@@ -37240,6 +37610,17 @@
                 <w:lang w:val="en-US"/>
               </w:rPr>
             </w:pPr>
+            <m:oMathPara>
+              <m:oMath>
+                <m:r>
+                  <w:rPr>
+                    <w:rFonts w:ascii="Cambria Math" w:hAnsi="Cambria Math"/>
+                    <w:lang w:val="en-US"/>
+                  </w:rPr>
+                  <m:t>∞</m:t>
+                </m:r>
+              </m:oMath>
+            </m:oMathPara>
           </w:p>
         </w:tc>
         <w:tc>
@@ -37271,15 +37652,21 @@
         </w:tc>
         <w:tc>
           <w:tcPr>
-            <w:tcW w:w="774" w:type="dxa"/>
-          </w:tcPr>
-          <w:p>
-            <w:pPr>
-              <w:jc w:val="center"/>
-              <w:rPr>
-                <w:lang w:val="en-US"/>
-              </w:rPr>
-            </w:pPr>
+            <w:tcW w:w="951" w:type="dxa"/>
+          </w:tcPr>
+          <w:p>
+            <w:pPr>
+              <w:jc w:val="center"/>
+              <w:rPr>
+                <w:lang w:val="en-US"/>
+              </w:rPr>
+            </w:pPr>
+            <w:r>
+              <w:rPr>
+                <w:lang w:val="en-US"/>
+              </w:rPr>
+              <w:t>OK</w:t>
+            </w:r>
           </w:p>
         </w:tc>
       </w:tr>
@@ -37400,6 +37787,12 @@
                 <w:lang w:val="en-US"/>
               </w:rPr>
             </w:pPr>
+            <w:r>
+              <w:rPr>
+                <w:lang w:val="en-US"/>
+              </w:rPr>
+              <w:t>23.7</w:t>
+            </w:r>
           </w:p>
         </w:tc>
         <w:tc>
@@ -37427,15 +37820,18 @@
         </w:tc>
         <w:tc>
           <w:tcPr>
-            <w:tcW w:w="774" w:type="dxa"/>
-          </w:tcPr>
-          <w:p>
-            <w:pPr>
-              <w:jc w:val="center"/>
-              <w:rPr>
-                <w:lang w:val="en-US"/>
-              </w:rPr>
-            </w:pPr>
+            <w:tcW w:w="951" w:type="dxa"/>
+          </w:tcPr>
+          <w:p>
+            <w:pPr>
+              <w:jc w:val="center"/>
+              <w:rPr>
+                <w:lang w:val="en-US"/>
+              </w:rPr>
+            </w:pPr>
+            <w:r>
+              <w:t>0.00%</w:t>
+            </w:r>
           </w:p>
         </w:tc>
       </w:tr>
@@ -37555,6 +37951,18 @@
                 <w:lang w:val="en-US"/>
               </w:rPr>
             </w:pPr>
+            <w:r>
+              <w:rPr>
+                <w:lang w:val="en-US"/>
+              </w:rPr>
+              <w:t>26.</w:t>
+            </w:r>
+            <w:r>
+              <w:rPr>
+                <w:lang w:val="en-US"/>
+              </w:rPr>
+              <w:t>6</w:t>
+            </w:r>
           </w:p>
         </w:tc>
         <w:tc>
@@ -37582,15 +37990,18 @@
         </w:tc>
         <w:tc>
           <w:tcPr>
-            <w:tcW w:w="774" w:type="dxa"/>
-          </w:tcPr>
-          <w:p>
-            <w:pPr>
-              <w:jc w:val="center"/>
-              <w:rPr>
-                <w:lang w:val="en-US"/>
-              </w:rPr>
-            </w:pPr>
+            <w:tcW w:w="951" w:type="dxa"/>
+          </w:tcPr>
+          <w:p>
+            <w:pPr>
+              <w:jc w:val="center"/>
+              <w:rPr>
+                <w:lang w:val="en-US"/>
+              </w:rPr>
+            </w:pPr>
+            <w:r>
+              <w:t>0.00%</w:t>
+            </w:r>
           </w:p>
         </w:tc>
       </w:tr>
@@ -37710,6 +38121,12 @@
                 <w:lang w:val="en-US"/>
               </w:rPr>
             </w:pPr>
+            <w:r>
+              <w:rPr>
+                <w:lang w:val="en-US"/>
+              </w:rPr>
+              <w:t>23.7</w:t>
+            </w:r>
           </w:p>
         </w:tc>
         <w:tc>
@@ -37745,15 +38162,18 @@
         </w:tc>
         <w:tc>
           <w:tcPr>
-            <w:tcW w:w="774" w:type="dxa"/>
-          </w:tcPr>
-          <w:p>
-            <w:pPr>
-              <w:jc w:val="center"/>
-              <w:rPr>
-                <w:lang w:val="en-US"/>
-              </w:rPr>
-            </w:pPr>
+            <w:tcW w:w="951" w:type="dxa"/>
+          </w:tcPr>
+          <w:p>
+            <w:pPr>
+              <w:jc w:val="center"/>
+              <w:rPr>
+                <w:lang w:val="en-US"/>
+              </w:rPr>
+            </w:pPr>
+            <w:r>
+              <w:t>0.00%</w:t>
+            </w:r>
           </w:p>
         </w:tc>
       </w:tr>
@@ -37873,6 +38293,12 @@
                 <w:lang w:val="en-US"/>
               </w:rPr>
             </w:pPr>
+            <w:r>
+              <w:rPr>
+                <w:lang w:val="en-US"/>
+              </w:rPr>
+              <w:t>6.67</w:t>
+            </w:r>
           </w:p>
         </w:tc>
         <w:tc>
@@ -37900,15 +38326,18 @@
         </w:tc>
         <w:tc>
           <w:tcPr>
-            <w:tcW w:w="774" w:type="dxa"/>
-          </w:tcPr>
-          <w:p>
-            <w:pPr>
-              <w:jc w:val="center"/>
-              <w:rPr>
-                <w:lang w:val="en-US"/>
-              </w:rPr>
-            </w:pPr>
+            <w:tcW w:w="951" w:type="dxa"/>
+          </w:tcPr>
+          <w:p>
+            <w:pPr>
+              <w:jc w:val="center"/>
+              <w:rPr>
+                <w:lang w:val="en-US"/>
+              </w:rPr>
+            </w:pPr>
+            <w:r>
+              <w:t>0.00%</w:t>
+            </w:r>
           </w:p>
         </w:tc>
       </w:tr>
@@ -38034,6 +38463,12 @@
                 <w:lang w:val="en-US"/>
               </w:rPr>
             </w:pPr>
+            <w:r>
+              <w:rPr>
+                <w:lang w:val="en-US"/>
+              </w:rPr>
+              <w:t>6.67</w:t>
+            </w:r>
           </w:p>
         </w:tc>
         <w:tc>
@@ -38061,15 +38496,18 @@
         </w:tc>
         <w:tc>
           <w:tcPr>
-            <w:tcW w:w="774" w:type="dxa"/>
-          </w:tcPr>
-          <w:p>
-            <w:pPr>
-              <w:jc w:val="center"/>
-              <w:rPr>
-                <w:lang w:val="en-US"/>
-              </w:rPr>
-            </w:pPr>
+            <w:tcW w:w="951" w:type="dxa"/>
+          </w:tcPr>
+          <w:p>
+            <w:pPr>
+              <w:jc w:val="center"/>
+              <w:rPr>
+                <w:lang w:val="en-US"/>
+              </w:rPr>
+            </w:pPr>
+            <w:r>
+              <w:t>0.00%</w:t>
+            </w:r>
           </w:p>
         </w:tc>
       </w:tr>
@@ -38189,6 +38627,17 @@
                 <w:lang w:val="en-US"/>
               </w:rPr>
             </w:pPr>
+            <m:oMathPara>
+              <m:oMath>
+                <m:r>
+                  <w:rPr>
+                    <w:rFonts w:ascii="Cambria Math" w:hAnsi="Cambria Math"/>
+                    <w:lang w:val="en-US"/>
+                  </w:rPr>
+                  <m:t xml:space="preserve"> ∞</m:t>
+                </m:r>
+              </m:oMath>
+            </m:oMathPara>
           </w:p>
         </w:tc>
         <w:tc>
@@ -38220,15 +38669,21 @@
         </w:tc>
         <w:tc>
           <w:tcPr>
-            <w:tcW w:w="774" w:type="dxa"/>
-          </w:tcPr>
-          <w:p>
-            <w:pPr>
-              <w:jc w:val="center"/>
-              <w:rPr>
-                <w:lang w:val="en-US"/>
-              </w:rPr>
-            </w:pPr>
+            <w:tcW w:w="951" w:type="dxa"/>
+          </w:tcPr>
+          <w:p>
+            <w:pPr>
+              <w:jc w:val="center"/>
+              <w:rPr>
+                <w:lang w:val="en-US"/>
+              </w:rPr>
+            </w:pPr>
+            <w:r>
+              <w:rPr>
+                <w:lang w:val="en-US"/>
+              </w:rPr>
+              <w:t>OK</w:t>
+            </w:r>
           </w:p>
         </w:tc>
       </w:tr>
@@ -38354,6 +38809,12 @@
                 <w:lang w:val="en-US"/>
               </w:rPr>
             </w:pPr>
+            <w:r>
+              <w:rPr>
+                <w:lang w:val="en-US"/>
+              </w:rPr>
+              <w:t>6.67</w:t>
+            </w:r>
           </w:p>
         </w:tc>
         <w:tc>
@@ -38381,15 +38842,18 @@
         </w:tc>
         <w:tc>
           <w:tcPr>
-            <w:tcW w:w="774" w:type="dxa"/>
-          </w:tcPr>
-          <w:p>
-            <w:pPr>
-              <w:jc w:val="center"/>
-              <w:rPr>
-                <w:lang w:val="en-US"/>
-              </w:rPr>
-            </w:pPr>
+            <w:tcW w:w="951" w:type="dxa"/>
+          </w:tcPr>
+          <w:p>
+            <w:pPr>
+              <w:jc w:val="center"/>
+              <w:rPr>
+                <w:lang w:val="en-US"/>
+              </w:rPr>
+            </w:pPr>
+            <w:r>
+              <w:t>0.00%</w:t>
+            </w:r>
           </w:p>
         </w:tc>
       </w:tr>
@@ -38491,6 +38955,12 @@
                 <w:lang w:val="en-US"/>
               </w:rPr>
             </w:pPr>
+            <w:r>
+              <w:rPr>
+                <w:lang w:val="en-US"/>
+              </w:rPr>
+              <w:t>25.2</w:t>
+            </w:r>
           </w:p>
         </w:tc>
         <w:tc>
@@ -38518,15 +38988,18 @@
         </w:tc>
         <w:tc>
           <w:tcPr>
-            <w:tcW w:w="774" w:type="dxa"/>
-          </w:tcPr>
-          <w:p>
-            <w:pPr>
-              <w:jc w:val="center"/>
-              <w:rPr>
-                <w:lang w:val="en-US"/>
-              </w:rPr>
-            </w:pPr>
+            <w:tcW w:w="951" w:type="dxa"/>
+          </w:tcPr>
+          <w:p>
+            <w:pPr>
+              <w:jc w:val="center"/>
+              <w:rPr>
+                <w:lang w:val="en-US"/>
+              </w:rPr>
+            </w:pPr>
+            <w:r>
+              <w:t>0.00%</w:t>
+            </w:r>
           </w:p>
         </w:tc>
       </w:tr>
@@ -38628,6 +39101,12 @@
                 <w:lang w:val="en-US"/>
               </w:rPr>
             </w:pPr>
+            <w:r>
+              <w:rPr>
+                <w:lang w:val="en-US"/>
+              </w:rPr>
+              <w:t>24.7</w:t>
+            </w:r>
           </w:p>
         </w:tc>
         <w:tc>
@@ -38655,15 +39134,18 @@
         </w:tc>
         <w:tc>
           <w:tcPr>
-            <w:tcW w:w="774" w:type="dxa"/>
-          </w:tcPr>
-          <w:p>
-            <w:pPr>
-              <w:jc w:val="center"/>
-              <w:rPr>
-                <w:lang w:val="en-US"/>
-              </w:rPr>
-            </w:pPr>
+            <w:tcW w:w="951" w:type="dxa"/>
+          </w:tcPr>
+          <w:p>
+            <w:pPr>
+              <w:jc w:val="center"/>
+              <w:rPr>
+                <w:lang w:val="en-US"/>
+              </w:rPr>
+            </w:pPr>
+            <w:r>
+              <w:t>0.00%</w:t>
+            </w:r>
           </w:p>
         </w:tc>
       </w:tr>
@@ -38828,6 +39310,12 @@
                 <w:lang w:val="en-US"/>
               </w:rPr>
             </w:pPr>
+            <w:r>
+              <w:rPr>
+                <w:lang w:val="en-US"/>
+              </w:rPr>
+              <w:t>47 237</w:t>
+            </w:r>
           </w:p>
         </w:tc>
         <w:tc>
@@ -38849,22 +39337,56 @@
                 <w:color w:val="C00000"/>
                 <w:lang w:val="en-US"/>
               </w:rPr>
-              <w:t>47 131</w:t>
-            </w:r>
-          </w:p>
-        </w:tc>
-        <w:tc>
-          <w:tcPr>
-            <w:tcW w:w="774" w:type="dxa"/>
+              <w:t xml:space="preserve">47 </w:t>
+            </w:r>
+            <w:r>
+              <w:rPr>
+                <w:i/>
+                <w:color w:val="C00000"/>
+                <w:lang w:val="en-US"/>
+              </w:rPr>
+              <w:t>128</w:t>
+            </w:r>
+          </w:p>
+        </w:tc>
+        <w:tc>
+          <w:tcPr>
+            <w:tcW w:w="951" w:type="dxa"/>
             <w:vAlign w:val="center"/>
           </w:tcPr>
           <w:p>
             <w:pPr>
               <w:jc w:val="center"/>
               <w:rPr>
-                <w:lang w:val="en-US"/>
-              </w:rPr>
-            </w:pPr>
+                <w:i/>
+                <w:color w:val="C00000"/>
+                <w:lang w:val="en-US"/>
+              </w:rPr>
+            </w:pPr>
+            <w:r>
+              <w:rPr>
+                <w:i/>
+                <w:color w:val="C00000"/>
+                <w:lang w:val="en-US"/>
+              </w:rPr>
+              <w:t>0.2</w:t>
+            </w:r>
+            <w:r>
+              <w:rPr>
+                <w:i/>
+                <w:color w:val="C00000"/>
+                <w:lang w:val="en-US"/>
+              </w:rPr>
+              <w:t>3</w:t>
+            </w:r>
+            <w:r>
+              <w:rPr>
+                <w:i/>
+                <w:color w:val="C00000"/>
+                <w:lang w:val="en-US"/>
+              </w:rPr>
+              <w:t>%</w:t>
+            </w:r>
           </w:p>
         </w:tc>
       </w:tr>
@@ -39028,6 +39550,12 @@
                 <w:lang w:val="en-US"/>
               </w:rPr>
             </w:pPr>
+            <w:r>
+              <w:rPr>
+                <w:lang w:val="en-US"/>
+              </w:rPr>
+              <w:t>99 895</w:t>
+            </w:r>
           </w:p>
         </w:tc>
         <w:tc>
@@ -39049,13 +39577,13 @@
                 <w:color w:val="C00000"/>
                 <w:lang w:val="en-US"/>
               </w:rPr>
-              <w:t>100 204</w:t>
-            </w:r>
-          </w:p>
-        </w:tc>
-        <w:tc>
-          <w:tcPr>
-            <w:tcW w:w="774" w:type="dxa"/>
+              <w:t>99 778</w:t>
+            </w:r>
+          </w:p>
+        </w:tc>
+        <w:tc>
+          <w:tcPr>
+            <w:tcW w:w="951" w:type="dxa"/>
             <w:vAlign w:val="center"/>
           </w:tcPr>
           <w:p>
@@ -39065,6 +39593,22 @@
                 <w:lang w:val="en-US"/>
               </w:rPr>
             </w:pPr>
+            <w:r>
+              <w:rPr>
+                <w:i/>
+                <w:color w:val="C00000"/>
+                <w:lang w:val="en-US"/>
+              </w:rPr>
+              <w:t>0.12</w:t>
+            </w:r>
+            <w:r>
+              <w:rPr>
+                <w:i/>
+                <w:color w:val="C00000"/>
+                <w:lang w:val="en-US"/>
+              </w:rPr>
+              <w:t>%</w:t>
+            </w:r>
           </w:p>
         </w:tc>
       </w:tr>
@@ -39229,6 +39773,12 @@
                 <w:lang w:val="en-US"/>
               </w:rPr>
             </w:pPr>
+            <w:r>
+              <w:rPr>
+                <w:lang w:val="en-US"/>
+              </w:rPr>
+              <w:t>142 875</w:t>
+            </w:r>
           </w:p>
         </w:tc>
         <w:tc>
@@ -39250,13 +39800,13 @@
                 <w:color w:val="C00000"/>
                 <w:lang w:val="en-US"/>
               </w:rPr>
-              <w:t>144 140</w:t>
-            </w:r>
-          </w:p>
-        </w:tc>
-        <w:tc>
-          <w:tcPr>
-            <w:tcW w:w="774" w:type="dxa"/>
+              <w:t>142 677</w:t>
+            </w:r>
+          </w:p>
+        </w:tc>
+        <w:tc>
+          <w:tcPr>
+            <w:tcW w:w="951" w:type="dxa"/>
             <w:vAlign w:val="center"/>
           </w:tcPr>
           <w:p>
@@ -39266,6 +39816,22 @@
                 <w:lang w:val="en-US"/>
               </w:rPr>
             </w:pPr>
+            <w:r>
+              <w:rPr>
+                <w:i/>
+                <w:color w:val="C00000"/>
+                <w:lang w:val="en-US"/>
+              </w:rPr>
+              <w:t>0.14</w:t>
+            </w:r>
+            <w:r>
+              <w:rPr>
+                <w:i/>
+                <w:color w:val="C00000"/>
+                <w:lang w:val="en-US"/>
+              </w:rPr>
+              <w:t>%</w:t>
+            </w:r>
           </w:p>
         </w:tc>
       </w:tr>
@@ -39430,6 +39996,12 @@
                 <w:lang w:val="en-US"/>
               </w:rPr>
             </w:pPr>
+            <w:r>
+              <w:rPr>
+                <w:lang w:val="en-US"/>
+              </w:rPr>
+              <w:t>53 094</w:t>
+            </w:r>
           </w:p>
         </w:tc>
         <w:tc>
@@ -39451,13 +40023,21 @@
                 <w:color w:val="C00000"/>
                 <w:lang w:val="en-US"/>
               </w:rPr>
-              <w:t>52 959</w:t>
-            </w:r>
-          </w:p>
-        </w:tc>
-        <w:tc>
-          <w:tcPr>
-            <w:tcW w:w="774" w:type="dxa"/>
+              <w:t>52 9</w:t>
+            </w:r>
+            <w:r>
+              <w:rPr>
+                <w:i/>
+                <w:color w:val="C00000"/>
+                <w:lang w:val="en-US"/>
+              </w:rPr>
+              <w:t>21</w:t>
+            </w:r>
+          </w:p>
+        </w:tc>
+        <w:tc>
+          <w:tcPr>
+            <w:tcW w:w="951" w:type="dxa"/>
             <w:vAlign w:val="center"/>
           </w:tcPr>
           <w:p>
@@ -39467,6 +40047,30 @@
                 <w:lang w:val="en-US"/>
               </w:rPr>
             </w:pPr>
+            <w:r>
+              <w:rPr>
+                <w:i/>
+                <w:color w:val="C00000"/>
+                <w:lang w:val="en-US"/>
+              </w:rPr>
+              <w:t>0.</w:t>
+            </w:r>
+            <w:r>
+              <w:rPr>
+                <w:i/>
+                <w:color w:val="C00000"/>
+                <w:lang w:val="en-US"/>
+              </w:rPr>
+              <w:t>33</w:t>
+            </w:r>
+            <w:r>
+              <w:rPr>
+                <w:i/>
+                <w:color w:val="C00000"/>
+                <w:lang w:val="en-US"/>
+              </w:rPr>
+              <w:t>%</w:t>
+            </w:r>
           </w:p>
         </w:tc>
       </w:tr>
@@ -39600,6 +40204,12 @@
                 <w:lang w:val="en-US"/>
               </w:rPr>
             </w:pPr>
+            <w:r>
+              <w:rPr>
+                <w:lang w:val="en-US"/>
+              </w:rPr>
+              <w:t>101 577</w:t>
+            </w:r>
           </w:p>
         </w:tc>
         <w:tc>
@@ -39621,13 +40231,21 @@
                 <w:color w:val="C00000"/>
                 <w:lang w:val="en-US"/>
               </w:rPr>
-              <w:t>101 923</w:t>
-            </w:r>
-          </w:p>
-        </w:tc>
-        <w:tc>
-          <w:tcPr>
-            <w:tcW w:w="774" w:type="dxa"/>
+              <w:t xml:space="preserve">101 </w:t>
+            </w:r>
+            <w:r>
+              <w:rPr>
+                <w:i/>
+                <w:color w:val="C00000"/>
+                <w:lang w:val="en-US"/>
+              </w:rPr>
+              <w:t>471</w:t>
+            </w:r>
+          </w:p>
+        </w:tc>
+        <w:tc>
+          <w:tcPr>
+            <w:tcW w:w="951" w:type="dxa"/>
             <w:vAlign w:val="center"/>
           </w:tcPr>
           <w:p>
@@ -39637,6 +40255,22 @@
                 <w:lang w:val="en-US"/>
               </w:rPr>
             </w:pPr>
+            <w:r>
+              <w:rPr>
+                <w:i/>
+                <w:color w:val="C00000"/>
+                <w:lang w:val="en-US"/>
+              </w:rPr>
+              <w:t xml:space="preserve">0.10 </w:t>
+            </w:r>
+            <w:r>
+              <w:rPr>
+                <w:i/>
+                <w:color w:val="C00000"/>
+                <w:lang w:val="en-US"/>
+              </w:rPr>
+              <w:t>%</w:t>
+            </w:r>
           </w:p>
         </w:tc>
       </w:tr>
@@ -39794,6 +40428,12 @@
                 <w:lang w:val="en-US"/>
               </w:rPr>
             </w:pPr>
+            <w:r>
+              <w:rPr>
+                <w:lang w:val="en-US"/>
+              </w:rPr>
+              <w:t>-235</w:t>
+            </w:r>
           </w:p>
         </w:tc>
         <w:tc>
@@ -39821,7 +40461,7 @@
         </w:tc>
         <w:tc>
           <w:tcPr>
-            <w:tcW w:w="774" w:type="dxa"/>
+            <w:tcW w:w="951" w:type="dxa"/>
             <w:vAlign w:val="center"/>
           </w:tcPr>
           <w:p>
@@ -39831,6 +40471,12 @@
                 <w:lang w:val="en-US"/>
               </w:rPr>
             </w:pPr>
+            <w:r>
+              <w:rPr>
+                <w:lang w:val="en-US"/>
+              </w:rPr>
+              <w:t>0.00%</w:t>
+            </w:r>
           </w:p>
         </w:tc>
       </w:tr>
@@ -39988,6 +40634,12 @@
                 <w:lang w:val="en-US"/>
               </w:rPr>
             </w:pPr>
+            <w:r>
+              <w:rPr>
+                <w:lang w:val="en-US"/>
+              </w:rPr>
+              <w:t>-102.4</w:t>
+            </w:r>
           </w:p>
         </w:tc>
         <w:tc>
@@ -40009,13 +40661,13 @@
                 <w:color w:val="C00000"/>
                 <w:lang w:val="en-US"/>
               </w:rPr>
-              <w:t>-104</w:t>
-            </w:r>
-          </w:p>
-        </w:tc>
-        <w:tc>
-          <w:tcPr>
-            <w:tcW w:w="774" w:type="dxa"/>
+              <w:t>-102</w:t>
+            </w:r>
+          </w:p>
+        </w:tc>
+        <w:tc>
+          <w:tcPr>
+            <w:tcW w:w="951" w:type="dxa"/>
             <w:vAlign w:val="center"/>
           </w:tcPr>
           <w:p>
@@ -40025,6 +40677,22 @@
                 <w:lang w:val="en-US"/>
               </w:rPr>
             </w:pPr>
+            <w:r>
+              <w:rPr>
+                <w:i/>
+                <w:color w:val="C00000"/>
+                <w:lang w:val="en-US"/>
+              </w:rPr>
+              <w:t>0.39</w:t>
+            </w:r>
+            <w:r>
+              <w:rPr>
+                <w:i/>
+                <w:color w:val="C00000"/>
+                <w:lang w:val="en-US"/>
+              </w:rPr>
+              <w:t>%</w:t>
+            </w:r>
           </w:p>
         </w:tc>
       </w:tr>
@@ -40182,6 +40850,12 @@
                 <w:lang w:val="en-US"/>
               </w:rPr>
             </w:pPr>
+            <w:r>
+              <w:rPr>
+                <w:lang w:val="en-US"/>
+              </w:rPr>
+              <w:t>9.38</w:t>
+            </w:r>
           </w:p>
         </w:tc>
         <w:tc>
@@ -40203,13 +40877,13 @@
                 <w:color w:val="C00000"/>
                 <w:lang w:val="en-US"/>
               </w:rPr>
-              <w:t>7.86</w:t>
-            </w:r>
-          </w:p>
-        </w:tc>
-        <w:tc>
-          <w:tcPr>
-            <w:tcW w:w="774" w:type="dxa"/>
+              <w:t>9.51</w:t>
+            </w:r>
+          </w:p>
+        </w:tc>
+        <w:tc>
+          <w:tcPr>
+            <w:tcW w:w="951" w:type="dxa"/>
             <w:vAlign w:val="center"/>
           </w:tcPr>
           <w:p>
@@ -40219,6 +40893,22 @@
                 <w:lang w:val="en-US"/>
               </w:rPr>
             </w:pPr>
+            <w:r>
+              <w:rPr>
+                <w:i/>
+                <w:color w:val="C00000"/>
+                <w:lang w:val="en-US"/>
+              </w:rPr>
+              <w:t>-1.37</w:t>
+            </w:r>
+            <w:r>
+              <w:rPr>
+                <w:i/>
+                <w:color w:val="C00000"/>
+                <w:lang w:val="en-US"/>
+              </w:rPr>
+              <w:t>%</w:t>
+            </w:r>
           </w:p>
         </w:tc>
       </w:tr>
@@ -40376,6 +41066,12 @@
                 <w:lang w:val="en-US"/>
               </w:rPr>
             </w:pPr>
+            <w:r>
+              <w:rPr>
+                <w:lang w:val="en-US"/>
+              </w:rPr>
+              <w:t>-205</w:t>
+            </w:r>
           </w:p>
         </w:tc>
         <w:tc>
@@ -40403,7 +41099,7 @@
         </w:tc>
         <w:tc>
           <w:tcPr>
-            <w:tcW w:w="774" w:type="dxa"/>
+            <w:tcW w:w="951" w:type="dxa"/>
             <w:vAlign w:val="center"/>
           </w:tcPr>
           <w:p>
@@ -40413,6 +41109,12 @@
                 <w:lang w:val="en-US"/>
               </w:rPr>
             </w:pPr>
+            <w:r>
+              <w:rPr>
+                <w:lang w:val="en-US"/>
+              </w:rPr>
+              <w:t>0.00%</w:t>
+            </w:r>
           </w:p>
         </w:tc>
       </w:tr>
@@ -40539,6 +41241,12 @@
                 <w:lang w:val="en-US"/>
               </w:rPr>
             </w:pPr>
+            <w:r>
+              <w:rPr>
+                <w:lang w:val="en-US"/>
+              </w:rPr>
+              <w:t>-98.1</w:t>
+            </w:r>
           </w:p>
         </w:tc>
         <w:tc>
@@ -40560,22 +41268,32 @@
                 <w:color w:val="C00000"/>
                 <w:lang w:val="en-US"/>
               </w:rPr>
-              <w:t>-99.5</w:t>
-            </w:r>
-          </w:p>
-        </w:tc>
-        <w:tc>
-          <w:tcPr>
-            <w:tcW w:w="774" w:type="dxa"/>
+              <w:t>-97.9</w:t>
+            </w:r>
+          </w:p>
+        </w:tc>
+        <w:tc>
+          <w:tcPr>
+            <w:tcW w:w="951" w:type="dxa"/>
             <w:vAlign w:val="center"/>
           </w:tcPr>
           <w:p>
             <w:pPr>
               <w:jc w:val="center"/>
               <w:rPr>
-                <w:lang w:val="en-US"/>
-              </w:rPr>
-            </w:pPr>
+                <w:i/>
+                <w:color w:val="C00000"/>
+                <w:lang w:val="en-US"/>
+              </w:rPr>
+            </w:pPr>
+            <w:r>
+              <w:rPr>
+                <w:i/>
+                <w:color w:val="C00000"/>
+                <w:lang w:val="en-US"/>
+              </w:rPr>
+              <w:t>0.20%</w:t>
+            </w:r>
           </w:p>
         </w:tc>
       </w:tr>
@@ -40682,6 +41400,12 @@
                 <w:lang w:val="en-US"/>
               </w:rPr>
             </w:pPr>
+            <w:r>
+              <w:rPr>
+                <w:lang w:val="en-US"/>
+              </w:rPr>
+              <w:t>1 190</w:t>
+            </w:r>
           </w:p>
         </w:tc>
         <w:tc>
@@ -40703,13 +41427,13 @@
                 <w:color w:val="C00000"/>
                 <w:lang w:val="en-US"/>
               </w:rPr>
-              <w:t>1 264</w:t>
-            </w:r>
-          </w:p>
-        </w:tc>
-        <w:tc>
-          <w:tcPr>
-            <w:tcW w:w="774" w:type="dxa"/>
+              <w:t>1 237</w:t>
+            </w:r>
+          </w:p>
+        </w:tc>
+        <w:tc>
+          <w:tcPr>
+            <w:tcW w:w="951" w:type="dxa"/>
             <w:vAlign w:val="center"/>
           </w:tcPr>
           <w:p>
@@ -40719,6 +41443,14 @@
                 <w:lang w:val="en-US"/>
               </w:rPr>
             </w:pPr>
+            <w:r>
+              <w:rPr>
+                <w:i/>
+                <w:color w:val="C00000"/>
+                <w:lang w:val="en-US"/>
+              </w:rPr>
+              <w:t>-3.80%</w:t>
+            </w:r>
           </w:p>
         </w:tc>
       </w:tr>
@@ -40777,14 +41509,14 @@
     <w:tbl>
       <w:tblPr>
         <w:tblStyle w:val="Grilledutableau"/>
-        <w:tblW w:w="0" w:type="auto"/>
+        <w:tblW w:w="10369" w:type="dxa"/>
         <w:tblLook w:val="04A0" w:firstRow="1" w:lastRow="0" w:firstColumn="1" w:lastColumn="0" w:noHBand="0" w:noVBand="1"/>
       </w:tblPr>
       <w:tblGrid>
         <w:gridCol w:w="6637"/>
         <w:gridCol w:w="1397"/>
         <w:gridCol w:w="1384"/>
-        <w:gridCol w:w="776"/>
+        <w:gridCol w:w="951"/>
       </w:tblGrid>
       <w:tr>
         <w:tc>
@@ -40832,7 +41564,7 @@
         </w:tc>
         <w:tc>
           <w:tcPr>
-            <w:tcW w:w="776" w:type="dxa"/>
+            <w:tcW w:w="951" w:type="dxa"/>
             <w:shd w:val="clear" w:color="auto" w:fill="D9D9D9" w:themeFill="background1" w:themeFillShade="D9"/>
           </w:tcPr>
           <w:p>
@@ -40954,6 +41686,12 @@
                 <w:lang w:val="en-US"/>
               </w:rPr>
             </w:pPr>
+            <w:r>
+              <w:rPr>
+                <w:lang w:val="en-US"/>
+              </w:rPr>
+              <w:t>60.5</w:t>
+            </w:r>
           </w:p>
         </w:tc>
         <w:tc>
@@ -40979,12 +41717,15 @@
         </w:tc>
         <w:tc>
           <w:tcPr>
-            <w:tcW w:w="776" w:type="dxa"/>
-          </w:tcPr>
-          <w:p>
-            <w:pPr>
-              <w:jc w:val="center"/>
-            </w:pPr>
+            <w:tcW w:w="951" w:type="dxa"/>
+          </w:tcPr>
+          <w:p>
+            <w:pPr>
+              <w:jc w:val="center"/>
+            </w:pPr>
+            <w:r>
+              <w:t>0.00%</w:t>
+            </w:r>
           </w:p>
         </w:tc>
       </w:tr>
@@ -41097,6 +41838,12 @@
                 <w:lang w:val="en-US"/>
               </w:rPr>
             </w:pPr>
+            <w:r>
+              <w:rPr>
+                <w:lang w:val="en-US"/>
+              </w:rPr>
+              <w:t>189</w:t>
+            </w:r>
           </w:p>
         </w:tc>
         <w:tc>
@@ -41122,12 +41869,15 @@
         </w:tc>
         <w:tc>
           <w:tcPr>
-            <w:tcW w:w="776" w:type="dxa"/>
-          </w:tcPr>
-          <w:p>
-            <w:pPr>
-              <w:jc w:val="center"/>
-            </w:pPr>
+            <w:tcW w:w="951" w:type="dxa"/>
+          </w:tcPr>
+          <w:p>
+            <w:pPr>
+              <w:jc w:val="center"/>
+            </w:pPr>
+            <w:r>
+              <w:t>0.00%</w:t>
+            </w:r>
           </w:p>
         </w:tc>
       </w:tr>
@@ -41240,6 +41990,12 @@
                 <w:lang w:val="en-US"/>
               </w:rPr>
             </w:pPr>
+            <w:r>
+              <w:rPr>
+                <w:lang w:val="en-US"/>
+              </w:rPr>
+              <w:t>15.6</w:t>
+            </w:r>
           </w:p>
         </w:tc>
         <w:tc>
@@ -41265,12 +42021,15 @@
         </w:tc>
         <w:tc>
           <w:tcPr>
-            <w:tcW w:w="776" w:type="dxa"/>
-          </w:tcPr>
-          <w:p>
-            <w:pPr>
-              <w:jc w:val="center"/>
-            </w:pPr>
+            <w:tcW w:w="951" w:type="dxa"/>
+          </w:tcPr>
+          <w:p>
+            <w:pPr>
+              <w:jc w:val="center"/>
+            </w:pPr>
+            <w:r>
+              <w:t>0.00%</w:t>
+            </w:r>
           </w:p>
         </w:tc>
       </w:tr>
@@ -41383,6 +42142,12 @@
                 <w:lang w:val="en-US"/>
               </w:rPr>
             </w:pPr>
+            <w:r>
+              <w:rPr>
+                <w:lang w:val="en-US"/>
+              </w:rPr>
+              <w:t>48.8</w:t>
+            </w:r>
           </w:p>
         </w:tc>
         <w:tc>
@@ -41408,12 +42173,15 @@
         </w:tc>
         <w:tc>
           <w:tcPr>
-            <w:tcW w:w="776" w:type="dxa"/>
-          </w:tcPr>
-          <w:p>
-            <w:pPr>
-              <w:jc w:val="center"/>
-            </w:pPr>
+            <w:tcW w:w="951" w:type="dxa"/>
+          </w:tcPr>
+          <w:p>
+            <w:pPr>
+              <w:jc w:val="center"/>
+            </w:pPr>
+            <w:r>
+              <w:t>0.00%</w:t>
+            </w:r>
           </w:p>
         </w:tc>
       </w:tr>
@@ -41526,6 +42294,12 @@
                 <w:lang w:val="en-US"/>
               </w:rPr>
             </w:pPr>
+            <w:r>
+              <w:rPr>
+                <w:lang w:val="en-US"/>
+              </w:rPr>
+              <w:t>39.1</w:t>
+            </w:r>
           </w:p>
         </w:tc>
         <w:tc>
@@ -41551,12 +42325,15 @@
         </w:tc>
         <w:tc>
           <w:tcPr>
-            <w:tcW w:w="776" w:type="dxa"/>
-          </w:tcPr>
-          <w:p>
-            <w:pPr>
-              <w:jc w:val="center"/>
-            </w:pPr>
+            <w:tcW w:w="951" w:type="dxa"/>
+          </w:tcPr>
+          <w:p>
+            <w:pPr>
+              <w:jc w:val="center"/>
+            </w:pPr>
+            <w:r>
+              <w:t>0.00%</w:t>
+            </w:r>
           </w:p>
         </w:tc>
       </w:tr>
@@ -41669,6 +42446,12 @@
                 <w:lang w:val="en-US"/>
               </w:rPr>
             </w:pPr>
+            <w:r>
+              <w:rPr>
+                <w:lang w:val="en-US"/>
+              </w:rPr>
+              <w:t>122</w:t>
+            </w:r>
           </w:p>
         </w:tc>
         <w:tc>
@@ -41694,12 +42477,15 @@
         </w:tc>
         <w:tc>
           <w:tcPr>
-            <w:tcW w:w="776" w:type="dxa"/>
-          </w:tcPr>
-          <w:p>
-            <w:pPr>
-              <w:jc w:val="center"/>
-            </w:pPr>
+            <w:tcW w:w="951" w:type="dxa"/>
+          </w:tcPr>
+          <w:p>
+            <w:pPr>
+              <w:jc w:val="center"/>
+            </w:pPr>
+            <w:r>
+              <w:t>0.00%</w:t>
+            </w:r>
           </w:p>
         </w:tc>
       </w:tr>
@@ -41812,6 +42598,12 @@
                 <w:lang w:val="en-US"/>
               </w:rPr>
             </w:pPr>
+            <w:r>
+              <w:rPr>
+                <w:lang w:val="en-US"/>
+              </w:rPr>
+              <w:t>13.3</w:t>
+            </w:r>
           </w:p>
         </w:tc>
         <w:tc>
@@ -41837,12 +42629,15 @@
         </w:tc>
         <w:tc>
           <w:tcPr>
-            <w:tcW w:w="776" w:type="dxa"/>
-          </w:tcPr>
-          <w:p>
-            <w:pPr>
-              <w:jc w:val="center"/>
-            </w:pPr>
+            <w:tcW w:w="951" w:type="dxa"/>
+          </w:tcPr>
+          <w:p>
+            <w:pPr>
+              <w:jc w:val="center"/>
+            </w:pPr>
+            <w:r>
+              <w:t>0.00%</w:t>
+            </w:r>
           </w:p>
         </w:tc>
       </w:tr>
@@ -41955,6 +42750,12 @@
                 <w:lang w:val="en-US"/>
               </w:rPr>
             </w:pPr>
+            <w:r>
+              <w:rPr>
+                <w:lang w:val="en-US"/>
+              </w:rPr>
+              <w:t>45.3</w:t>
+            </w:r>
           </w:p>
         </w:tc>
         <w:tc>
@@ -41980,13 +42781,36 @@
         </w:tc>
         <w:tc>
           <w:tcPr>
-            <w:tcW w:w="776" w:type="dxa"/>
-            <w:vAlign w:val="center"/>
-          </w:tcPr>
-          <w:p>
-            <w:pPr>
-              <w:jc w:val="center"/>
-            </w:pPr>
+            <w:tcW w:w="951" w:type="dxa"/>
+          </w:tcPr>
+          <w:p>
+            <w:pPr>
+              <w:jc w:val="center"/>
+            </w:pPr>
+            <w:r>
+              <w:rPr>
+                <w:i/>
+                <w:color w:val="C00000"/>
+                <w:lang w:val="en-US"/>
+              </w:rPr>
+              <w:t>-</w:t>
+            </w:r>
+            <w:r>
+              <w:rPr>
+                <w:i/>
+                <w:color w:val="C00000"/>
+                <w:lang w:val="en-US"/>
+              </w:rPr>
+              <w:t>0.22</w:t>
+            </w:r>
+            <w:r>
+              <w:rPr>
+                <w:i/>
+                <w:color w:val="C00000"/>
+                <w:lang w:val="en-US"/>
+              </w:rPr>
+              <w:t>%</w:t>
+            </w:r>
           </w:p>
         </w:tc>
       </w:tr>
@@ -42078,6 +42902,12 @@
                 <w:lang w:val="en-US"/>
               </w:rPr>
             </w:pPr>
+            <w:r>
+              <w:rPr>
+                <w:lang w:val="en-US"/>
+              </w:rPr>
+              <w:t>0</w:t>
+            </w:r>
           </w:p>
         </w:tc>
         <w:tc>
@@ -42103,12 +42933,15 @@
         </w:tc>
         <w:tc>
           <w:tcPr>
-            <w:tcW w:w="776" w:type="dxa"/>
-          </w:tcPr>
-          <w:p>
-            <w:pPr>
-              <w:jc w:val="center"/>
-            </w:pPr>
+            <w:tcW w:w="951" w:type="dxa"/>
+          </w:tcPr>
+          <w:p>
+            <w:pPr>
+              <w:jc w:val="center"/>
+            </w:pPr>
+            <w:r>
+              <w:t>0.00%</w:t>
+            </w:r>
           </w:p>
         </w:tc>
       </w:tr>
@@ -42200,6 +43033,12 @@
                 <w:lang w:val="en-US"/>
               </w:rPr>
             </w:pPr>
+            <w:r>
+              <w:rPr>
+                <w:lang w:val="en-US"/>
+              </w:rPr>
+              <w:t>112.5</w:t>
+            </w:r>
           </w:p>
         </w:tc>
         <w:tc>
@@ -42225,13 +43064,15 @@
         </w:tc>
         <w:tc>
           <w:tcPr>
-            <w:tcW w:w="776" w:type="dxa"/>
-            <w:vAlign w:val="center"/>
-          </w:tcPr>
-          <w:p>
-            <w:pPr>
-              <w:jc w:val="center"/>
-            </w:pPr>
+            <w:tcW w:w="951" w:type="dxa"/>
+          </w:tcPr>
+          <w:p>
+            <w:pPr>
+              <w:jc w:val="center"/>
+            </w:pPr>
+            <w:r>
+              <w:t>0.00%</w:t>
+            </w:r>
           </w:p>
         </w:tc>
       </w:tr>
@@ -42334,6 +43175,12 @@
                 <w:lang w:val="en-US"/>
               </w:rPr>
             </w:pPr>
+            <w:r>
+              <w:rPr>
+                <w:lang w:val="en-US"/>
+              </w:rPr>
+              <w:t>161</w:t>
+            </w:r>
           </w:p>
         </w:tc>
         <w:tc>
@@ -42361,15 +43208,18 @@
         </w:tc>
         <w:tc>
           <w:tcPr>
-            <w:tcW w:w="776" w:type="dxa"/>
-          </w:tcPr>
-          <w:p>
-            <w:pPr>
-              <w:jc w:val="center"/>
-              <w:rPr>
-                <w:lang w:val="en-US"/>
-              </w:rPr>
-            </w:pPr>
+            <w:tcW w:w="951" w:type="dxa"/>
+          </w:tcPr>
+          <w:p>
+            <w:pPr>
+              <w:jc w:val="center"/>
+              <w:rPr>
+                <w:lang w:val="en-US"/>
+              </w:rPr>
+            </w:pPr>
+            <w:r>
+              <w:t>0.00%</w:t>
+            </w:r>
           </w:p>
         </w:tc>
       </w:tr>
@@ -42479,6 +43329,12 @@
                 <w:lang w:val="en-US"/>
               </w:rPr>
             </w:pPr>
+            <w:r>
+              <w:rPr>
+                <w:lang w:val="en-US"/>
+              </w:rPr>
+              <w:t>504</w:t>
+            </w:r>
           </w:p>
         </w:tc>
         <w:tc>
@@ -42506,16 +43362,18 @@
         </w:tc>
         <w:tc>
           <w:tcPr>
-            <w:tcW w:w="776" w:type="dxa"/>
-            <w:vAlign w:val="center"/>
-          </w:tcPr>
-          <w:p>
-            <w:pPr>
-              <w:jc w:val="center"/>
-              <w:rPr>
-                <w:lang w:val="en-US"/>
-              </w:rPr>
-            </w:pPr>
+            <w:tcW w:w="951" w:type="dxa"/>
+          </w:tcPr>
+          <w:p>
+            <w:pPr>
+              <w:jc w:val="center"/>
+              <w:rPr>
+                <w:lang w:val="en-US"/>
+              </w:rPr>
+            </w:pPr>
+            <w:r>
+              <w:t>0.00%</w:t>
+            </w:r>
           </w:p>
         </w:tc>
       </w:tr>
@@ -42564,161 +43422,6 @@
                     </w:rPr>
                     <m:t>V</m:t>
                   </m:r>
-                </m:e>
-                <m:sub>
-                  <m:r>
-                    <m:rPr>
-                      <m:sty m:val="p"/>
-                    </m:rPr>
-                    <w:rPr>
-                      <w:rFonts w:ascii="Cambria Math" w:hAnsi="Cambria Math"/>
-                      <w:lang w:val="en-US"/>
-                    </w:rPr>
-                    <m:t>Ed</m:t>
-                  </m:r>
-                  <m:r>
-                    <m:rPr>
-                      <m:sty m:val="p"/>
-                    </m:rPr>
-                    <w:rPr>
-                      <w:rFonts w:ascii="Cambria Math" w:hAnsi="Cambria Math"/>
-                      <w:lang w:val="en-US"/>
-                    </w:rPr>
-                    <m:t>,const</m:t>
-                  </m:r>
-                </m:sub>
-              </m:sSub>
-              <m:r>
-                <w:rPr>
-                  <w:rFonts w:ascii="Cambria Math" w:hAnsi="Cambria Math"/>
-                  <w:lang w:val="en-US"/>
-                </w:rPr>
-                <m:t>=</m:t>
-              </m:r>
-            </m:oMath>
-            <w:r>
-              <w:rPr>
-                <w:lang w:val="en-US"/>
-              </w:rPr>
-              <w:tab/>
-              <w:t>(</w:t>
-            </w:r>
-            <w:r>
-              <w:rPr>
-                <w:lang w:val="en-US"/>
-              </w:rPr>
-              <w:t>kN</w:t>
-            </w:r>
-            <w:r>
-              <w:rPr>
-                <w:lang w:val="en-US"/>
-              </w:rPr>
-              <w:t>)</w:t>
-            </w:r>
-          </w:p>
-        </w:tc>
-        <w:tc>
-          <w:tcPr>
-            <w:tcW w:w="1397" w:type="dxa"/>
-          </w:tcPr>
-          <w:p>
-            <w:pPr>
-              <w:jc w:val="center"/>
-              <w:rPr>
-                <w:lang w:val="en-US"/>
-              </w:rPr>
-            </w:pPr>
-          </w:p>
-        </w:tc>
-        <w:tc>
-          <w:tcPr>
-            <w:tcW w:w="1384" w:type="dxa"/>
-          </w:tcPr>
-          <w:p>
-            <w:pPr>
-              <w:jc w:val="center"/>
-              <w:rPr>
-                <w:i/>
-                <w:color w:val="C00000"/>
-                <w:lang w:val="en-US"/>
-              </w:rPr>
-            </w:pPr>
-            <w:r>
-              <w:rPr>
-                <w:i/>
-                <w:color w:val="C00000"/>
-                <w:lang w:val="en-US"/>
-              </w:rPr>
-              <w:t>102</w:t>
-            </w:r>
-          </w:p>
-        </w:tc>
-        <w:tc>
-          <w:tcPr>
-            <w:tcW w:w="776" w:type="dxa"/>
-          </w:tcPr>
-          <w:p>
-            <w:pPr>
-              <w:jc w:val="center"/>
-              <w:rPr>
-                <w:lang w:val="en-US"/>
-              </w:rPr>
-            </w:pPr>
-          </w:p>
-        </w:tc>
-      </w:tr>
-      <w:tr>
-        <w:tc>
-          <w:tcPr>
-            <w:tcW w:w="6637" w:type="dxa"/>
-            <w:vAlign w:val="center"/>
-          </w:tcPr>
-          <w:p>
-            <w:pPr>
-              <w:tabs>
-                <w:tab w:val="right" w:pos="4997"/>
-              </w:tabs>
-              <w:jc w:val="left"/>
-              <w:rPr>
-                <w:lang w:val="en-US"/>
-              </w:rPr>
-            </w:pPr>
-            <w:r>
-              <w:rPr>
-                <w:lang w:val="en-US"/>
-              </w:rPr>
-              <w:t>Bending moment</w:t>
-            </w:r>
-            <w:r>
-              <w:rPr>
-                <w:lang w:val="en-US"/>
-              </w:rPr>
-              <w:t xml:space="preserve"> : </w:t>
-            </w:r>
-            <m:oMath>
-              <m:sSub>
-                <m:sSubPr>
-                  <m:ctrlPr>
-                    <w:rPr>
-                      <w:rFonts w:ascii="Cambria Math" w:hAnsi="Cambria Math"/>
-                      <w:i/>
-                      <w:lang w:val="en-US"/>
-                    </w:rPr>
-                  </m:ctrlPr>
-                </m:sSubPr>
-                <m:e>
-                  <m:r>
-                    <w:rPr>
-                      <w:rFonts w:ascii="Cambria Math" w:hAnsi="Cambria Math"/>
-                    </w:rPr>
-                    <m:t>M</m:t>
-                  </m:r>
-                  <m:ctrlPr>
-                    <w:rPr>
-                      <w:rFonts w:ascii="Cambria Math" w:hAnsi="Cambria Math"/>
-                      <w:i/>
-                    </w:rPr>
-                  </m:ctrlPr>
                 </m:e>
                 <m:sub>
                   <m:r>
@@ -42752,6 +43455,160 @@
               <w:rPr>
                 <w:lang w:val="en-US"/>
               </w:rPr>
+              <w:t>kN</w:t>
+            </w:r>
+            <w:r>
+              <w:rPr>
+                <w:lang w:val="en-US"/>
+              </w:rPr>
+              <w:t>)</w:t>
+            </w:r>
+          </w:p>
+        </w:tc>
+        <w:tc>
+          <w:tcPr>
+            <w:tcW w:w="1397" w:type="dxa"/>
+          </w:tcPr>
+          <w:p>
+            <w:pPr>
+              <w:jc w:val="center"/>
+              <w:rPr>
+                <w:lang w:val="en-US"/>
+              </w:rPr>
+            </w:pPr>
+            <w:r>
+              <w:rPr>
+                <w:lang w:val="en-US"/>
+              </w:rPr>
+              <w:t>102</w:t>
+            </w:r>
+          </w:p>
+        </w:tc>
+        <w:tc>
+          <w:tcPr>
+            <w:tcW w:w="1384" w:type="dxa"/>
+          </w:tcPr>
+          <w:p>
+            <w:pPr>
+              <w:jc w:val="center"/>
+              <w:rPr>
+                <w:i/>
+                <w:color w:val="C00000"/>
+                <w:lang w:val="en-US"/>
+              </w:rPr>
+            </w:pPr>
+            <w:r>
+              <w:rPr>
+                <w:i/>
+                <w:color w:val="C00000"/>
+                <w:lang w:val="en-US"/>
+              </w:rPr>
+              <w:t>102</w:t>
+            </w:r>
+          </w:p>
+        </w:tc>
+        <w:tc>
+          <w:tcPr>
+            <w:tcW w:w="951" w:type="dxa"/>
+          </w:tcPr>
+          <w:p>
+            <w:pPr>
+              <w:jc w:val="center"/>
+              <w:rPr>
+                <w:lang w:val="en-US"/>
+              </w:rPr>
+            </w:pPr>
+            <w:r>
+              <w:t>0.00%</w:t>
+            </w:r>
+          </w:p>
+        </w:tc>
+      </w:tr>
+      <w:tr>
+        <w:tc>
+          <w:tcPr>
+            <w:tcW w:w="6637" w:type="dxa"/>
+            <w:vAlign w:val="center"/>
+          </w:tcPr>
+          <w:p>
+            <w:pPr>
+              <w:tabs>
+                <w:tab w:val="right" w:pos="4997"/>
+              </w:tabs>
+              <w:jc w:val="left"/>
+              <w:rPr>
+                <w:lang w:val="en-US"/>
+              </w:rPr>
+            </w:pPr>
+            <w:r>
+              <w:rPr>
+                <w:lang w:val="en-US"/>
+              </w:rPr>
+              <w:t>Bending moment</w:t>
+            </w:r>
+            <w:r>
+              <w:rPr>
+                <w:lang w:val="en-US"/>
+              </w:rPr>
+              <w:t xml:space="preserve"> : </w:t>
+            </w:r>
+            <m:oMath>
+              <m:sSub>
+                <m:sSubPr>
+                  <m:ctrlPr>
+                    <w:rPr>
+                      <w:rFonts w:ascii="Cambria Math" w:hAnsi="Cambria Math"/>
+                      <w:i/>
+                      <w:lang w:val="en-US"/>
+                    </w:rPr>
+                  </m:ctrlPr>
+                </m:sSubPr>
+                <m:e>
+                  <m:r>
+                    <w:rPr>
+                      <w:rFonts w:ascii="Cambria Math" w:hAnsi="Cambria Math"/>
+                    </w:rPr>
+                    <m:t>M</m:t>
+                  </m:r>
+                  <m:ctrlPr>
+                    <w:rPr>
+                      <w:rFonts w:ascii="Cambria Math" w:hAnsi="Cambria Math"/>
+                      <w:i/>
+                    </w:rPr>
+                  </m:ctrlPr>
+                </m:e>
+                <m:sub>
+                  <m:r>
+                    <m:rPr>
+                      <m:sty m:val="p"/>
+                    </m:rPr>
+                    <w:rPr>
+                      <w:rFonts w:ascii="Cambria Math" w:hAnsi="Cambria Math"/>
+                      <w:lang w:val="en-US"/>
+                    </w:rPr>
+                    <m:t>Ed,const</m:t>
+                  </m:r>
+                </m:sub>
+              </m:sSub>
+              <m:r>
+                <w:rPr>
+                  <w:rFonts w:ascii="Cambria Math" w:hAnsi="Cambria Math"/>
+                  <w:lang w:val="en-US"/>
+                </w:rPr>
+                <m:t>=</m:t>
+              </m:r>
+            </m:oMath>
+            <w:r>
+              <w:rPr>
+                <w:lang w:val="en-US"/>
+              </w:rPr>
+              <w:tab/>
+              <w:t>(</w:t>
+            </w:r>
+            <w:r>
+              <w:rPr>
+                <w:lang w:val="en-US"/>
+              </w:rPr>
               <w:t>kN.m</w:t>
             </w:r>
             <w:r>
@@ -42773,6 +43630,12 @@
                 <w:lang w:val="en-US"/>
               </w:rPr>
             </w:pPr>
+            <w:r>
+              <w:rPr>
+                <w:lang w:val="en-US"/>
+              </w:rPr>
+              <w:t>323</w:t>
+            </w:r>
           </w:p>
         </w:tc>
         <w:tc>
@@ -42800,16 +43663,18 @@
         </w:tc>
         <w:tc>
           <w:tcPr>
-            <w:tcW w:w="776" w:type="dxa"/>
-            <w:vAlign w:val="center"/>
-          </w:tcPr>
-          <w:p>
-            <w:pPr>
-              <w:jc w:val="center"/>
-              <w:rPr>
-                <w:lang w:val="en-US"/>
-              </w:rPr>
-            </w:pPr>
+            <w:tcW w:w="951" w:type="dxa"/>
+          </w:tcPr>
+          <w:p>
+            <w:pPr>
+              <w:jc w:val="center"/>
+              <w:rPr>
+                <w:lang w:val="en-US"/>
+              </w:rPr>
+            </w:pPr>
+            <w:r>
+              <w:t>0.00%</w:t>
+            </w:r>
           </w:p>
         </w:tc>
       </w:tr>
@@ -43038,6 +43903,12 @@
                 <w:lang w:val="en-US"/>
               </w:rPr>
             </w:pPr>
+            <w:r>
+              <w:rPr>
+                <w:lang w:val="en-US"/>
+              </w:rPr>
+              <w:t>0.42</w:t>
+            </w:r>
           </w:p>
         </w:tc>
         <w:tc>
@@ -43075,6 +43946,12 @@
                 <w:lang w:val="en-US"/>
               </w:rPr>
             </w:pPr>
+            <w:r>
+              <w:rPr>
+                <w:lang w:val="en-US"/>
+              </w:rPr>
+              <w:t>0.00%</w:t>
+            </w:r>
           </w:p>
         </w:tc>
       </w:tr>
@@ -43172,6 +44049,12 @@
                 <w:lang w:val="en-US"/>
               </w:rPr>
             </w:pPr>
+            <w:r>
+              <w:rPr>
+                <w:lang w:val="en-US"/>
+              </w:rPr>
+              <w:t>0.16</w:t>
+            </w:r>
           </w:p>
         </w:tc>
         <w:tc>
@@ -43204,6 +44087,12 @@
             <w:pPr>
               <w:jc w:val="center"/>
             </w:pPr>
+            <w:r>
+              <w:rPr>
+                <w:lang w:val="en-US"/>
+              </w:rPr>
+              <w:t>0.00%</w:t>
+            </w:r>
           </w:p>
         </w:tc>
       </w:tr>
@@ -43301,6 +44190,12 @@
                 <w:lang w:val="en-US"/>
               </w:rPr>
             </w:pPr>
+            <w:r>
+              <w:rPr>
+                <w:lang w:val="en-US"/>
+              </w:rPr>
+              <w:t>0.42</w:t>
+            </w:r>
           </w:p>
         </w:tc>
         <w:tc>
@@ -43333,6 +44228,12 @@
             <w:pPr>
               <w:jc w:val="center"/>
             </w:pPr>
+            <w:r>
+              <w:rPr>
+                <w:lang w:val="en-US"/>
+              </w:rPr>
+              <w:t>0.00%</w:t>
+            </w:r>
           </w:p>
         </w:tc>
       </w:tr>
@@ -43380,6 +44281,12 @@
                 <w:lang w:val="en-US"/>
               </w:rPr>
             </w:pPr>
+            <w:r>
+              <w:rPr>
+                <w:lang w:val="en-US"/>
+              </w:rPr>
+              <w:t>0.78</w:t>
+            </w:r>
           </w:p>
         </w:tc>
         <w:tc>
@@ -43417,6 +44324,12 @@
                 <w:lang w:val="en-US"/>
               </w:rPr>
             </w:pPr>
+            <w:r>
+              <w:rPr>
+                <w:lang w:val="en-US"/>
+              </w:rPr>
+              <w:t>0.00%</w:t>
+            </w:r>
           </w:p>
         </w:tc>
       </w:tr>
@@ -43496,6 +44409,12 @@
                 <w:lang w:val="en-US"/>
               </w:rPr>
             </w:pPr>
+            <w:r>
+              <w:rPr>
+                <w:lang w:val="en-US"/>
+              </w:rPr>
+              <w:t>0.63</w:t>
+            </w:r>
           </w:p>
         </w:tc>
         <w:tc>
@@ -43533,6 +44452,12 @@
                 <w:lang w:val="en-US"/>
               </w:rPr>
             </w:pPr>
+            <w:r>
+              <w:rPr>
+                <w:lang w:val="en-US"/>
+              </w:rPr>
+              <w:t>0.00%</w:t>
+            </w:r>
           </w:p>
         </w:tc>
       </w:tr>
@@ -43635,6 +44560,12 @@
                 <w:lang w:val="en-US"/>
               </w:rPr>
             </w:pPr>
+            <w:r>
+              <w:rPr>
+                <w:lang w:val="en-US"/>
+              </w:rPr>
+              <w:t>2.20</w:t>
+            </w:r>
           </w:p>
         </w:tc>
         <w:tc>
@@ -43661,12 +44592,27 @@
         <w:tc>
           <w:tcPr>
             <w:tcW w:w="776" w:type="dxa"/>
-            <w:vAlign w:val="center"/>
-          </w:tcPr>
-          <w:p>
-            <w:pPr>
-              <w:jc w:val="center"/>
-            </w:pPr>
+          </w:tcPr>
+          <w:p>
+            <w:pPr>
+              <w:jc w:val="center"/>
+            </w:pPr>
+            <w:r>
+              <w:rPr>
+                <w:i/>
+                <w:color w:val="C00000"/>
+                <w:lang w:val="en-US"/>
+              </w:rPr>
+              <w:t>2.80</w:t>
+            </w:r>
+            <w:r>
+              <w:rPr>
+                <w:i/>
+                <w:color w:val="C00000"/>
+                <w:lang w:val="en-US"/>
+              </w:rPr>
+              <w:t>%</w:t>
+            </w:r>
           </w:p>
         </w:tc>
       </w:tr>
@@ -43752,6 +44698,9 @@
             <w:pPr>
               <w:jc w:val="center"/>
             </w:pPr>
+            <w:r>
+              <w:t>27</w:t>
+            </w:r>
           </w:p>
         </w:tc>
         <w:tc>
@@ -43784,6 +44733,12 @@
             <w:pPr>
               <w:jc w:val="center"/>
             </w:pPr>
+            <w:r>
+              <w:rPr>
+                <w:lang w:val="en-US"/>
+              </w:rPr>
+              <w:t>0.00%</w:t>
+            </w:r>
           </w:p>
         </w:tc>
       </w:tr>
@@ -43888,6 +44843,12 @@
                 <w:lang w:val="en-US"/>
               </w:rPr>
             </w:pPr>
+            <w:r>
+              <w:rPr>
+                <w:lang w:val="en-US"/>
+              </w:rPr>
+              <w:t>0.61</w:t>
+            </w:r>
           </w:p>
         </w:tc>
         <w:tc>
@@ -43914,12 +44875,27 @@
         <w:tc>
           <w:tcPr>
             <w:tcW w:w="776" w:type="dxa"/>
-            <w:vAlign w:val="center"/>
-          </w:tcPr>
-          <w:p>
-            <w:pPr>
-              <w:jc w:val="center"/>
-            </w:pPr>
+          </w:tcPr>
+          <w:p>
+            <w:pPr>
+              <w:jc w:val="center"/>
+            </w:pPr>
+            <w:r>
+              <w:rPr>
+                <w:i/>
+                <w:color w:val="C00000"/>
+                <w:lang w:val="en-US"/>
+              </w:rPr>
+              <w:t>3.39</w:t>
+            </w:r>
+            <w:r>
+              <w:rPr>
+                <w:i/>
+                <w:color w:val="C00000"/>
+                <w:lang w:val="en-US"/>
+              </w:rPr>
+              <w:t>%</w:t>
+            </w:r>
           </w:p>
         </w:tc>
       </w:tr>
@@ -44083,6 +45059,12 @@
                 <w:lang w:val="en-US"/>
               </w:rPr>
             </w:pPr>
+            <w:r>
+              <w:rPr>
+                <w:lang w:val="en-US"/>
+              </w:rPr>
+              <w:t>2.12</w:t>
+            </w:r>
           </w:p>
         </w:tc>
         <w:tc>
@@ -44109,12 +45091,27 @@
         <w:tc>
           <w:tcPr>
             <w:tcW w:w="776" w:type="dxa"/>
-            <w:vAlign w:val="center"/>
-          </w:tcPr>
-          <w:p>
-            <w:pPr>
-              <w:jc w:val="center"/>
-            </w:pPr>
+          </w:tcPr>
+          <w:p>
+            <w:pPr>
+              <w:jc w:val="center"/>
+            </w:pPr>
+            <w:r>
+              <w:rPr>
+                <w:i/>
+                <w:color w:val="C00000"/>
+                <w:lang w:val="en-US"/>
+              </w:rPr>
+              <w:t>3.41</w:t>
+            </w:r>
+            <w:r>
+              <w:rPr>
+                <w:i/>
+                <w:color w:val="C00000"/>
+                <w:lang w:val="en-US"/>
+              </w:rPr>
+              <w:t>%</w:t>
+            </w:r>
           </w:p>
         </w:tc>
       </w:tr>
@@ -44319,6 +45316,12 @@
                 <w:lang w:val="en-US"/>
               </w:rPr>
             </w:pPr>
+            <w:r>
+              <w:rPr>
+                <w:lang w:val="en-US"/>
+              </w:rPr>
+              <w:t>0.42</w:t>
+            </w:r>
           </w:p>
         </w:tc>
         <w:tc>
@@ -44337,8 +45340,9 @@
               <w:rPr>
                 <w:i/>
                 <w:color w:val="C00000"/>
-              </w:rPr>
-              <w:t>0.41</w:t>
+                <w:lang w:val="en-US"/>
+              </w:rPr>
+              <w:t>0.42</w:t>
             </w:r>
           </w:p>
         </w:tc>
@@ -44351,6 +45355,12 @@
             <w:pPr>
               <w:jc w:val="center"/>
             </w:pPr>
+            <w:r>
+              <w:rPr>
+                <w:lang w:val="en-US"/>
+              </w:rPr>
+              <w:t>0.00%</w:t>
+            </w:r>
           </w:p>
         </w:tc>
       </w:tr>
@@ -44448,6 +45458,12 @@
                 <w:lang w:val="en-US"/>
               </w:rPr>
             </w:pPr>
+            <w:r>
+              <w:rPr>
+                <w:lang w:val="en-US"/>
+              </w:rPr>
+              <w:t>0.10</w:t>
+            </w:r>
           </w:p>
         </w:tc>
         <w:tc>
@@ -44466,6 +45482,7 @@
               <w:rPr>
                 <w:i/>
                 <w:color w:val="C00000"/>
+                <w:lang w:val="en-US"/>
               </w:rPr>
               <w:t>0.10</w:t>
             </w:r>
@@ -44480,6 +45497,12 @@
             <w:pPr>
               <w:jc w:val="center"/>
             </w:pPr>
+            <w:r>
+              <w:rPr>
+                <w:lang w:val="en-US"/>
+              </w:rPr>
+              <w:t>0.00%</w:t>
+            </w:r>
           </w:p>
         </w:tc>
       </w:tr>
@@ -44604,15 +45627,7 @@
                 <w:color w:val="C00000"/>
                 <w:lang w:val="en-US"/>
               </w:rPr>
-              <w:t>0.4</w:t>
-            </w:r>
-            <w:r>
-              <w:rPr>
-                <w:i/>
-                <w:color w:val="C00000"/>
-                <w:lang w:val="en-US"/>
-              </w:rPr>
-              <w:t>1</w:t>
+              <w:t>0.42</w:t>
             </w:r>
           </w:p>
         </w:tc>
@@ -44628,8 +45643,12 @@
                 <w:lang w:val="en-US"/>
               </w:rPr>
             </w:pPr>
-            <w:bookmarkStart w:id="30" w:name="_GoBack"/>
-            <w:bookmarkEnd w:id="30"/>
+            <w:r>
+              <w:rPr>
+                <w:lang w:val="en-US"/>
+              </w:rPr>
+              <w:t>0.00%</w:t>
+            </w:r>
           </w:p>
         </w:tc>
       </w:tr>
@@ -44752,6 +45771,22 @@
                 <w:lang w:val="en-US"/>
               </w:rPr>
             </w:pPr>
+            <w:r>
+              <w:rPr>
+                <w:i/>
+                <w:color w:val="C00000"/>
+                <w:lang w:val="en-US"/>
+              </w:rPr>
+              <w:t>-1.20</w:t>
+            </w:r>
+            <w:r>
+              <w:rPr>
+                <w:i/>
+                <w:color w:val="C00000"/>
+                <w:lang w:val="en-US"/>
+              </w:rPr>
+              <w:t>%</w:t>
+            </w:r>
           </w:p>
         </w:tc>
       </w:tr>
@@ -44894,6 +45929,14 @@
                 <w:lang w:val="en-US"/>
               </w:rPr>
             </w:pPr>
+            <w:r>
+              <w:rPr>
+                <w:i/>
+                <w:color w:val="C00000"/>
+                <w:lang w:val="en-US"/>
+              </w:rPr>
+              <w:t>4.76%</w:t>
+            </w:r>
           </w:p>
         </w:tc>
       </w:tr>
@@ -44937,14 +45980,14 @@
     <w:tbl>
       <w:tblPr>
         <w:tblStyle w:val="Grilledutableau"/>
-        <w:tblW w:w="0" w:type="auto"/>
+        <w:tblW w:w="10369" w:type="dxa"/>
         <w:tblLook w:val="04A0" w:firstRow="1" w:lastRow="0" w:firstColumn="1" w:lastColumn="0" w:noHBand="0" w:noVBand="1"/>
       </w:tblPr>
       <w:tblGrid>
         <w:gridCol w:w="6637"/>
         <w:gridCol w:w="1397"/>
         <w:gridCol w:w="1384"/>
-        <w:gridCol w:w="776"/>
+        <w:gridCol w:w="951"/>
       </w:tblGrid>
       <w:tr>
         <w:tc>
@@ -44991,7 +46034,7 @@
         </w:tc>
         <w:tc>
           <w:tcPr>
-            <w:tcW w:w="776" w:type="dxa"/>
+            <w:tcW w:w="951" w:type="dxa"/>
             <w:shd w:val="clear" w:color="auto" w:fill="D9D9D9" w:themeFill="background1" w:themeFillShade="D9"/>
           </w:tcPr>
           <w:p>
@@ -45117,6 +46160,12 @@
                 <w:lang w:val="en-US"/>
               </w:rPr>
             </w:pPr>
+            <w:r>
+              <w:rPr>
+                <w:lang w:val="en-US"/>
+              </w:rPr>
+              <w:t>31.1</w:t>
+            </w:r>
           </w:p>
         </w:tc>
         <w:tc>
@@ -45142,13 +46191,16 @@
         </w:tc>
         <w:tc>
           <w:tcPr>
-            <w:tcW w:w="776" w:type="dxa"/>
+            <w:tcW w:w="951" w:type="dxa"/>
             <w:vAlign w:val="center"/>
           </w:tcPr>
           <w:p>
             <w:pPr>
               <w:jc w:val="center"/>
             </w:pPr>
+            <w:r>
+              <w:t>0.00%</w:t>
+            </w:r>
           </w:p>
         </w:tc>
       </w:tr>
@@ -45264,6 +46316,12 @@
                 <w:lang w:val="en-US"/>
               </w:rPr>
             </w:pPr>
+            <w:r>
+              <w:rPr>
+                <w:lang w:val="en-US"/>
+              </w:rPr>
+              <w:t>3.79</w:t>
+            </w:r>
           </w:p>
         </w:tc>
         <w:tc>
@@ -45289,13 +46347,16 @@
         </w:tc>
         <w:tc>
           <w:tcPr>
-            <w:tcW w:w="776" w:type="dxa"/>
+            <w:tcW w:w="951" w:type="dxa"/>
             <w:vAlign w:val="center"/>
           </w:tcPr>
           <w:p>
             <w:pPr>
               <w:jc w:val="center"/>
             </w:pPr>
+            <w:r>
+              <w:t>0.00%</w:t>
+            </w:r>
           </w:p>
         </w:tc>
       </w:tr>
@@ -45412,6 +46473,12 @@
                 <w:lang w:val="en-US"/>
               </w:rPr>
             </w:pPr>
+            <w:r>
+              <w:rPr>
+                <w:lang w:val="en-US"/>
+              </w:rPr>
+              <w:t>6.62</w:t>
+            </w:r>
           </w:p>
         </w:tc>
         <w:tc>
@@ -45437,13 +46504,29 @@
         </w:tc>
         <w:tc>
           <w:tcPr>
-            <w:tcW w:w="776" w:type="dxa"/>
+            <w:tcW w:w="951" w:type="dxa"/>
             <w:vAlign w:val="center"/>
           </w:tcPr>
           <w:p>
             <w:pPr>
               <w:jc w:val="center"/>
             </w:pPr>
+            <w:r>
+              <w:rPr>
+                <w:i/>
+                <w:color w:val="C00000"/>
+                <w:lang w:val="en-US"/>
+              </w:rPr>
+              <w:t>0</w:t>
+            </w:r>
+            <w:r>
+              <w:rPr>
+                <w:i/>
+                <w:color w:val="C00000"/>
+                <w:lang w:val="en-US"/>
+              </w:rPr>
+              <w:t>.76%</w:t>
+            </w:r>
           </w:p>
         </w:tc>
       </w:tr>
@@ -45560,6 +46643,12 @@
                 <w:lang w:val="en-US"/>
               </w:rPr>
             </w:pPr>
+            <w:r>
+              <w:rPr>
+                <w:lang w:val="en-US"/>
+              </w:rPr>
+              <w:t>6.5</w:t>
+            </w:r>
           </w:p>
         </w:tc>
         <w:tc>
@@ -45585,13 +46674,29 @@
         </w:tc>
         <w:tc>
           <w:tcPr>
-            <w:tcW w:w="776" w:type="dxa"/>
+            <w:tcW w:w="951" w:type="dxa"/>
             <w:vAlign w:val="center"/>
           </w:tcPr>
           <w:p>
             <w:pPr>
               <w:jc w:val="center"/>
             </w:pPr>
+            <w:r>
+              <w:rPr>
+                <w:i/>
+                <w:color w:val="C00000"/>
+                <w:lang w:val="en-US"/>
+              </w:rPr>
+              <w:t>0.15</w:t>
+            </w:r>
+            <w:r>
+              <w:rPr>
+                <w:i/>
+                <w:color w:val="C00000"/>
+                <w:lang w:val="en-US"/>
+              </w:rPr>
+              <w:t>%</w:t>
+            </w:r>
           </w:p>
         </w:tc>
       </w:tr>
@@ -45683,6 +46788,12 @@
                 <w:lang w:val="en-US"/>
               </w:rPr>
             </w:pPr>
+            <w:r>
+              <w:rPr>
+                <w:lang w:val="en-US"/>
+              </w:rPr>
+              <w:t>10.3</w:t>
+            </w:r>
           </w:p>
         </w:tc>
         <w:tc>
@@ -45708,7 +46819,7 @@
         </w:tc>
         <w:tc>
           <w:tcPr>
-            <w:tcW w:w="776" w:type="dxa"/>
+            <w:tcW w:w="951" w:type="dxa"/>
             <w:vAlign w:val="center"/>
           </w:tcPr>
           <w:p>
@@ -45719,6 +46830,22 @@
                 <w:color w:val="C00000"/>
               </w:rPr>
             </w:pPr>
+            <w:r>
+              <w:rPr>
+                <w:i/>
+                <w:color w:val="C00000"/>
+                <w:lang w:val="en-US"/>
+              </w:rPr>
+              <w:t>1.98</w:t>
+            </w:r>
+            <w:r>
+              <w:rPr>
+                <w:i/>
+                <w:color w:val="C00000"/>
+                <w:lang w:val="en-US"/>
+              </w:rPr>
+              <w:t>%</w:t>
+            </w:r>
           </w:p>
         </w:tc>
       </w:tr>
@@ -45810,6 +46937,12 @@
                 <w:lang w:val="en-US"/>
               </w:rPr>
             </w:pPr>
+            <w:r>
+              <w:rPr>
+                <w:lang w:val="en-US"/>
+              </w:rPr>
+              <w:t>51.8</w:t>
+            </w:r>
           </w:p>
         </w:tc>
         <w:tc>
@@ -45835,13 +46968,29 @@
         </w:tc>
         <w:tc>
           <w:tcPr>
-            <w:tcW w:w="776" w:type="dxa"/>
+            <w:tcW w:w="951" w:type="dxa"/>
             <w:vAlign w:val="center"/>
           </w:tcPr>
           <w:p>
             <w:pPr>
               <w:jc w:val="center"/>
             </w:pPr>
+            <w:r>
+              <w:rPr>
+                <w:i/>
+                <w:color w:val="C00000"/>
+                <w:lang w:val="en-US"/>
+              </w:rPr>
+              <w:t>0.58</w:t>
+            </w:r>
+            <w:r>
+              <w:rPr>
+                <w:i/>
+                <w:color w:val="C00000"/>
+                <w:lang w:val="en-US"/>
+              </w:rPr>
+              <w:t>%</w:t>
+            </w:r>
           </w:p>
         </w:tc>
       </w:tr>
@@ -45965,6 +47114,12 @@
                 <w:lang w:val="en-US"/>
               </w:rPr>
             </w:pPr>
+            <w:r>
+              <w:rPr>
+                <w:lang w:val="en-US"/>
+              </w:rPr>
+              <w:t>4.6</w:t>
+            </w:r>
           </w:p>
         </w:tc>
         <w:tc>
@@ -45990,13 +47145,29 @@
         </w:tc>
         <w:tc>
           <w:tcPr>
-            <w:tcW w:w="776" w:type="dxa"/>
+            <w:tcW w:w="951" w:type="dxa"/>
             <w:vAlign w:val="center"/>
           </w:tcPr>
           <w:p>
             <w:pPr>
               <w:jc w:val="center"/>
             </w:pPr>
+            <w:r>
+              <w:rPr>
+                <w:i/>
+                <w:color w:val="C00000"/>
+                <w:lang w:val="en-US"/>
+              </w:rPr>
+              <w:t>-2.54</w:t>
+            </w:r>
+            <w:r>
+              <w:rPr>
+                <w:i/>
+                <w:color w:val="C00000"/>
+                <w:lang w:val="en-US"/>
+              </w:rPr>
+              <w:t>%</w:t>
+            </w:r>
           </w:p>
         </w:tc>
       </w:tr>
@@ -46036,6 +47207,8 @@
           <w:lang w:val="en-GB"/>
         </w:rPr>
       </w:pPr>
+      <w:bookmarkStart w:id="30" w:name="_GoBack"/>
+      <w:bookmarkEnd w:id="30"/>
     </w:p>
     <w:sectPr>
       <w:headerReference w:type="even" r:id="rId69"/>
@@ -46188,7 +47361,7 @@
               <w:rFonts w:ascii="Calibri" w:hAnsi="Calibri"/>
               <w:noProof/>
             </w:rPr>
-            <w:t>22/05/2024</w:t>
+            <w:t>23/05/2024</w:t>
           </w:r>
           <w:r>
             <w:rPr>
@@ -48534,7 +49707,7 @@
               <w:szCs w:val="20"/>
               <w:lang w:val="en-GB"/>
             </w:rPr>
-            <w:t>34</w:t>
+            <w:t>33</w:t>
           </w:r>
           <w:r>
             <w:rPr>
@@ -59730,6 +60903,12 @@
 </file>
 
 <file path=customXml/item1.xml><?xml version="1.0" encoding="utf-8"?>
+<p:properties xmlns:p="http://schemas.microsoft.com/office/2006/metadata/properties" xmlns:xsi="http://www.w3.org/2001/XMLSchema-instance" xmlns:pc="http://schemas.microsoft.com/office/infopath/2007/PartnerControls">
+  <documentManagement/>
+</p:properties>
+</file>
+
+<file path=customXml/item2.xml><?xml version="1.0" encoding="utf-8"?>
 <ct:contentTypeSchema xmlns:ct="http://schemas.microsoft.com/office/2006/metadata/contentType" xmlns:ma="http://schemas.microsoft.com/office/2006/metadata/properties/metaAttributes" ct:_="" ma:_="" ma:contentTypeName="Document" ma:contentTypeID="0x010100C247FB7A51CDFF45B526B55FCBF0CC3A" ma:contentTypeVersion="11" ma:contentTypeDescription="Crée un document." ma:contentTypeScope="" ma:versionID="163d0b2c9ded4b8a7dfdd976cd200a17">
   <xsd:schema xmlns:xsd="http://www.w3.org/2001/XMLSchema" xmlns:xs="http://www.w3.org/2001/XMLSchema" xmlns:p="http://schemas.microsoft.com/office/2006/metadata/properties" xmlns:ns3="1339968c-844c-4ba9-aec6-fbaa9d140e36" targetNamespace="http://schemas.microsoft.com/office/2006/metadata/properties" ma:root="true" ma:fieldsID="d2393c41cac5a2e9ffb95dd220a5df63" ns3:_="">
     <xsd:import namespace="1339968c-844c-4ba9-aec6-fbaa9d140e36"/>
@@ -59919,7 +61098,7 @@
 </ct:contentTypeSchema>
 </file>
 
-<file path=customXml/item2.xml><?xml version="1.0" encoding="utf-8"?>
+<file path=customXml/item3.xml><?xml version="1.0" encoding="utf-8"?>
 <?mso-contentType ?>
 <FormTemplates xmlns="http://schemas.microsoft.com/sharepoint/v3/contenttype/forms">
   <Display>DocumentLibraryForm</Display>
@@ -59928,17 +61107,20 @@
 </FormTemplates>
 </file>
 
-<file path=customXml/item3.xml><?xml version="1.0" encoding="utf-8"?>
-<p:properties xmlns:p="http://schemas.microsoft.com/office/2006/metadata/properties" xmlns:xsi="http://www.w3.org/2001/XMLSchema-instance" xmlns:pc="http://schemas.microsoft.com/office/infopath/2007/PartnerControls">
-  <documentManagement/>
-</p:properties>
-</file>
-
 <file path=customXml/item4.xml><?xml version="1.0" encoding="utf-8"?>
 <b:Sources xmlns:b="http://schemas.openxmlformats.org/officeDocument/2006/bibliography" xmlns="http://schemas.openxmlformats.org/officeDocument/2006/bibliography" SelectedStyle="\APASixthEditionOfficeOnline.xsl" StyleName="APA" Version="6"/>
 </file>
 
 <file path=customXml/itemProps1.xml><?xml version="1.0" encoding="utf-8"?>
+<ds:datastoreItem xmlns:ds="http://schemas.openxmlformats.org/officeDocument/2006/customXml" ds:itemID="{8244F4F7-4138-49F1-B92F-F5AC6DA6C88D}">
+  <ds:schemaRefs>
+    <ds:schemaRef ds:uri="http://schemas.microsoft.com/office/2006/metadata/properties"/>
+    <ds:schemaRef ds:uri="http://schemas.microsoft.com/office/infopath/2007/PartnerControls"/>
+  </ds:schemaRefs>
+</ds:datastoreItem>
+</file>
+
+<file path=customXml/itemProps2.xml><?xml version="1.0" encoding="utf-8"?>
 <ds:datastoreItem xmlns:ds="http://schemas.openxmlformats.org/officeDocument/2006/customXml" ds:itemID="{763DED0B-077B-498B-B22E-F05F3E3AE21C}">
   <ds:schemaRefs>
     <ds:schemaRef ds:uri="http://schemas.microsoft.com/office/2006/metadata/contentType"/>
@@ -59956,7 +61138,7 @@
 </ds:datastoreItem>
 </file>
 
-<file path=customXml/itemProps2.xml><?xml version="1.0" encoding="utf-8"?>
+<file path=customXml/itemProps3.xml><?xml version="1.0" encoding="utf-8"?>
 <ds:datastoreItem xmlns:ds="http://schemas.openxmlformats.org/officeDocument/2006/customXml" ds:itemID="{4FB0FFFE-1214-4FB0-A9C1-883B8A00FAD1}">
   <ds:schemaRefs>
     <ds:schemaRef ds:uri="http://schemas.microsoft.com/sharepoint/v3/contenttype/forms"/>
@@ -59964,17 +61146,8 @@
 </ds:datastoreItem>
 </file>
 
-<file path=customXml/itemProps3.xml><?xml version="1.0" encoding="utf-8"?>
-<ds:datastoreItem xmlns:ds="http://schemas.openxmlformats.org/officeDocument/2006/customXml" ds:itemID="{8244F4F7-4138-49F1-B92F-F5AC6DA6C88D}">
-  <ds:schemaRefs>
-    <ds:schemaRef ds:uri="http://schemas.microsoft.com/office/2006/metadata/properties"/>
-    <ds:schemaRef ds:uri="http://schemas.microsoft.com/office/infopath/2007/PartnerControls"/>
-  </ds:schemaRefs>
-</ds:datastoreItem>
-</file>
-
 <file path=customXml/itemProps4.xml><?xml version="1.0" encoding="utf-8"?>
-<ds:datastoreItem xmlns:ds="http://schemas.openxmlformats.org/officeDocument/2006/customXml" ds:itemID="{8D0C52C5-5D6B-435B-A23A-A613894B5E21}">
+<ds:datastoreItem xmlns:ds="http://schemas.openxmlformats.org/officeDocument/2006/customXml" ds:itemID="{44620096-CC50-4343-AB5B-C45F5E2BE99F}">
   <ds:schemaRefs>
     <ds:schemaRef ds:uri="http://schemas.openxmlformats.org/officeDocument/2006/bibliography"/>
   </ds:schemaRefs>

</xml_diff>